<commit_message>
daily updated with phase 03
</commit_message>
<xml_diff>
--- a/daily.docx
+++ b/daily.docx
@@ -1,6 +1,6 @@
 
 <file path=word/document.xml><?xml version="1.0" encoding="utf-8"?>
-<w:document xmlns:wpc="http://schemas.microsoft.com/office/word/2010/wordprocessingCanvas" xmlns:cx="http://schemas.microsoft.com/office/drawing/2014/chartex" xmlns:cx1="http://schemas.microsoft.com/office/drawing/2015/9/8/chartex" xmlns:cx2="http://schemas.microsoft.com/office/drawing/2015/10/21/chartex" xmlns:cx3="http://schemas.microsoft.com/office/drawing/2016/5/9/chartex" xmlns:cx4="http://schemas.microsoft.com/office/drawing/2016/5/10/chartex" xmlns:cx5="http://schemas.microsoft.com/office/drawing/2016/5/11/chartex" xmlns:cx6="http://schemas.microsoft.com/office/drawing/2016/5/12/chartex" xmlns:cx7="http://schemas.microsoft.com/office/drawing/2016/5/13/chartex" xmlns:cx8="http://schemas.microsoft.com/office/drawing/2016/5/14/chartex" xmlns:mc="http://schemas.openxmlformats.org/markup-compatibility/2006" xmlns:aink="http://schemas.microsoft.com/office/drawing/2016/ink" xmlns:am3d="http://schemas.microsoft.com/office/drawing/2017/model3d" xmlns:o="urn:schemas-microsoft-com:office:office" xmlns:oel="http://schemas.microsoft.com/office/2019/extlst" xmlns:r="http://schemas.openxmlformats.org/officeDocument/2006/relationships" xmlns:m="http://schemas.openxmlformats.org/officeDocument/2006/math" xmlns:v="urn:schemas-microsoft-com:vml" xmlns:wp14="http://schemas.microsoft.com/office/word/2010/wordprocessingDrawing" xmlns:wp="http://schemas.openxmlformats.org/drawingml/2006/wordprocessingDrawing" xmlns:w10="urn:schemas-microsoft-com:office:word" xmlns:w="http://schemas.openxmlformats.org/wordprocessingml/2006/main" xmlns:w14="http://schemas.microsoft.com/office/word/2010/wordml" xmlns:w15="http://schemas.microsoft.com/office/word/2012/wordml" xmlns:w16cex="http://schemas.microsoft.com/office/word/2018/wordml/cex" xmlns:w16cid="http://schemas.microsoft.com/office/word/2016/wordml/cid" xmlns:w16="http://schemas.microsoft.com/office/word/2018/wordml" xmlns:w16sdtdh="http://schemas.microsoft.com/office/word/2020/wordml/sdtdatahash" xmlns:w16se="http://schemas.microsoft.com/office/word/2015/wordml/symex" xmlns:wpg="http://schemas.microsoft.com/office/word/2010/wordprocessingGroup" xmlns:wpi="http://schemas.microsoft.com/office/word/2010/wordprocessingInk" xmlns:wne="http://schemas.microsoft.com/office/word/2006/wordml" xmlns:wps="http://schemas.microsoft.com/office/word/2010/wordprocessingShape" mc:Ignorable="w14 w15 w16se w16cid w16 w16cex w16sdtdh wp14">
+<w:document xmlns:ve="http://schemas.openxmlformats.org/markup-compatibility/2006" xmlns:o="urn:schemas-microsoft-com:office:office" xmlns:r="http://schemas.openxmlformats.org/officeDocument/2006/relationships" xmlns:m="http://schemas.openxmlformats.org/officeDocument/2006/math" xmlns:v="urn:schemas-microsoft-com:vml" xmlns:wp="http://schemas.openxmlformats.org/drawingml/2006/wordprocessingDrawing" xmlns:w10="urn:schemas-microsoft-com:office:word" xmlns:w="http://schemas.openxmlformats.org/wordprocessingml/2006/main" xmlns:wne="http://schemas.microsoft.com/office/word/2006/wordml">
   <w:body>
     <w:p>
       <w:pPr>
@@ -39,7 +39,7 @@
           <w:szCs w:val="24"/>
           <w:lang w:bidi="hi-IN"/>
         </w:rPr>
-        <w:pict w14:anchorId="52856BEA">
+        <w:pict>
           <v:rect id="_x0000_i1025" style="width:0;height:1.5pt" o:hralign="center" o:hrstd="t" o:hr="t" fillcolor="#a0a0a0" stroked="f"/>
         </w:pict>
       </w:r>
@@ -113,7 +113,31 @@
           <w:szCs w:val="24"/>
           <w:lang w:bidi="hi-IN"/>
         </w:rPr>
-        <w:t xml:space="preserve">Install PostgreSQL + </w:t>
+        <w:t xml:space="preserve">Install </w:t>
+      </w:r>
+      <w:proofErr w:type="spellStart"/>
+      <w:r>
+        <w:rPr>
+          <w:rFonts w:ascii="Times New Roman" w:eastAsia="Times New Roman" w:hAnsi="Times New Roman" w:cs="Times New Roman"/>
+          <w:b/>
+          <w:bCs/>
+          <w:sz w:val="24"/>
+          <w:szCs w:val="24"/>
+          <w:lang w:bidi="hi-IN"/>
+        </w:rPr>
+        <w:t>PostgreSQL</w:t>
+      </w:r>
+      <w:proofErr w:type="spellEnd"/>
+      <w:r>
+        <w:rPr>
+          <w:rFonts w:ascii="Times New Roman" w:eastAsia="Times New Roman" w:hAnsi="Times New Roman" w:cs="Times New Roman"/>
+          <w:b/>
+          <w:bCs/>
+          <w:sz w:val="24"/>
+          <w:szCs w:val="24"/>
+          <w:lang w:bidi="hi-IN"/>
+        </w:rPr>
+        <w:t xml:space="preserve"> + </w:t>
       </w:r>
       <w:proofErr w:type="spellStart"/>
       <w:r>
@@ -194,7 +218,27 @@
           <w:szCs w:val="24"/>
           <w:lang w:bidi="hi-IN"/>
         </w:rPr>
-        <w:t xml:space="preserve">" superuser — set one and </w:t>
+        <w:t xml:space="preserve">" </w:t>
+      </w:r>
+      <w:proofErr w:type="spellStart"/>
+      <w:r>
+        <w:rPr>
+          <w:rFonts w:ascii="Times New Roman" w:eastAsia="Times New Roman" w:hAnsi="Times New Roman" w:cs="Times New Roman"/>
+          <w:sz w:val="24"/>
+          <w:szCs w:val="24"/>
+          <w:lang w:bidi="hi-IN"/>
+        </w:rPr>
+        <w:t>superuser</w:t>
+      </w:r>
+      <w:proofErr w:type="spellEnd"/>
+      <w:r>
+        <w:rPr>
+          <w:rFonts w:ascii="Times New Roman" w:eastAsia="Times New Roman" w:hAnsi="Times New Roman" w:cs="Times New Roman"/>
+          <w:sz w:val="24"/>
+          <w:szCs w:val="24"/>
+          <w:lang w:bidi="hi-IN"/>
+        </w:rPr>
+        <w:t xml:space="preserve"> — set one and </w:t>
       </w:r>
       <w:r>
         <w:rPr>
@@ -350,6 +394,7 @@
         </w:rPr>
         <w:t>No video needed for installation — just follow the steps above carefully. If you get stuck, search "</w:t>
       </w:r>
+      <w:proofErr w:type="spellStart"/>
       <w:proofErr w:type="gramStart"/>
       <w:r>
         <w:rPr>
@@ -358,29 +403,10 @@
           <w:szCs w:val="24"/>
           <w:lang w:bidi="hi-IN"/>
         </w:rPr>
-        <w:t>install</w:t>
-      </w:r>
+        <w:t>installpostgresql</w:t>
+      </w:r>
+      <w:proofErr w:type="spellEnd"/>
       <w:proofErr w:type="gramEnd"/>
-      <w:r>
-        <w:rPr>
-          <w:rFonts w:ascii="Times New Roman" w:eastAsia="Times New Roman" w:hAnsi="Times New Roman" w:cs="Times New Roman"/>
-          <w:sz w:val="24"/>
-          <w:szCs w:val="24"/>
-          <w:lang w:bidi="hi-IN"/>
-        </w:rPr>
-        <w:t xml:space="preserve"> </w:t>
-      </w:r>
-      <w:proofErr w:type="spellStart"/>
-      <w:r>
-        <w:rPr>
-          <w:rFonts w:ascii="Times New Roman" w:eastAsia="Times New Roman" w:hAnsi="Times New Roman" w:cs="Times New Roman"/>
-          <w:sz w:val="24"/>
-          <w:szCs w:val="24"/>
-          <w:lang w:bidi="hi-IN"/>
-        </w:rPr>
-        <w:t>postgresql</w:t>
-      </w:r>
-      <w:proofErr w:type="spellEnd"/>
       <w:r>
         <w:rPr>
           <w:rFonts w:ascii="Times New Roman" w:eastAsia="Times New Roman" w:hAnsi="Times New Roman" w:cs="Times New Roman"/>
@@ -439,7 +465,7 @@
           <w:szCs w:val="24"/>
           <w:lang w:bidi="hi-IN"/>
         </w:rPr>
-        <w:pict w14:anchorId="6389D6F5">
+        <w:pict>
           <v:rect id="_x0000_i1026" style="width:0;height:1.5pt" o:hralign="center" o:hrstd="t" o:hr="t" fillcolor="#a0a0a0" stroked="f"/>
         </w:pict>
       </w:r>
@@ -488,8 +514,30 @@
           <w:szCs w:val="24"/>
           <w:lang w:bidi="hi-IN"/>
         </w:rPr>
-        <w:t>Main video resource:</w:t>
-      </w:r>
+        <w:t xml:space="preserve">Main video </w:t>
+      </w:r>
+      <w:proofErr w:type="spellStart"/>
+      <w:r>
+        <w:rPr>
+          <w:rFonts w:ascii="Times New Roman" w:eastAsia="Times New Roman" w:hAnsi="Times New Roman" w:cs="Times New Roman"/>
+          <w:b/>
+          <w:bCs/>
+          <w:sz w:val="24"/>
+          <w:szCs w:val="24"/>
+          <w:lang w:bidi="hi-IN"/>
+        </w:rPr>
+        <w:t>resource:</w:t>
+      </w:r>
+      <w:r>
+        <w:rPr>
+          <w:rFonts w:ascii="Times New Roman" w:eastAsia="Times New Roman" w:hAnsi="Times New Roman" w:cs="Times New Roman"/>
+          <w:sz w:val="24"/>
+          <w:szCs w:val="24"/>
+          <w:lang w:bidi="hi-IN"/>
+        </w:rPr>
+        <w:t>freeCodeCamp</w:t>
+      </w:r>
+      <w:proofErr w:type="spellEnd"/>
       <w:r>
         <w:rPr>
           <w:rFonts w:ascii="Times New Roman" w:eastAsia="Times New Roman" w:hAnsi="Times New Roman" w:cs="Times New Roman"/>
@@ -507,7 +555,7 @@
           <w:szCs w:val="24"/>
           <w:lang w:bidi="hi-IN"/>
         </w:rPr>
-        <w:t>freeCodeCamp</w:t>
+        <w:t>PostgreSQL</w:t>
       </w:r>
       <w:proofErr w:type="spellEnd"/>
       <w:r>
@@ -517,7 +565,7 @@
           <w:szCs w:val="24"/>
           <w:lang w:bidi="hi-IN"/>
         </w:rPr>
-        <w:t xml:space="preserve"> PostgreSQL Full Course — youtu.be/qJEO6JyRp8I</w:t>
+        <w:t xml:space="preserve"> Full Course — youtu.be/qJEO6JyRp8I</w:t>
       </w:r>
       <w:r>
         <w:rPr>
@@ -547,7 +595,7 @@
           <w:szCs w:val="24"/>
           <w:lang w:bidi="hi-IN"/>
         </w:rPr>
-        <w:pict w14:anchorId="3A0864DF">
+        <w:pict>
           <v:rect id="_x0000_i1027" style="width:0;height:1.5pt" o:hralign="center" o:hrstd="t" o:hr="t" fillcolor="#a0a0a0" stroked="f"/>
         </w:pict>
       </w:r>
@@ -581,7 +629,27 @@
           <w:lang w:bidi="hi-IN"/>
         </w:rPr>
         <w:br/>
-        <w:t xml:space="preserve">Complete the PostgreSQL + </w:t>
+        <w:t xml:space="preserve">Complete the </w:t>
+      </w:r>
+      <w:proofErr w:type="spellStart"/>
+      <w:r>
+        <w:rPr>
+          <w:rFonts w:ascii="Times New Roman" w:eastAsia="Times New Roman" w:hAnsi="Times New Roman" w:cs="Times New Roman"/>
+          <w:sz w:val="24"/>
+          <w:szCs w:val="24"/>
+          <w:lang w:bidi="hi-IN"/>
+        </w:rPr>
+        <w:t>PostgreSQL</w:t>
+      </w:r>
+      <w:proofErr w:type="spellEnd"/>
+      <w:r>
+        <w:rPr>
+          <w:rFonts w:ascii="Times New Roman" w:eastAsia="Times New Roman" w:hAnsi="Times New Roman" w:cs="Times New Roman"/>
+          <w:sz w:val="24"/>
+          <w:szCs w:val="24"/>
+          <w:lang w:bidi="hi-IN"/>
+        </w:rPr>
+        <w:t xml:space="preserve"> + </w:t>
       </w:r>
       <w:proofErr w:type="spellStart"/>
       <w:r>
@@ -705,7 +773,26 @@
           <w:lang w:bidi="hi-IN"/>
         </w:rPr>
         <w:br/>
-        <w:t xml:space="preserve">In </w:t>
+      </w:r>
+      <w:proofErr w:type="gramStart"/>
+      <w:r>
+        <w:rPr>
+          <w:rFonts w:ascii="Times New Roman" w:eastAsia="Times New Roman" w:hAnsi="Times New Roman" w:cs="Times New Roman"/>
+          <w:sz w:val="24"/>
+          <w:szCs w:val="24"/>
+          <w:lang w:bidi="hi-IN"/>
+        </w:rPr>
+        <w:t>In</w:t>
+      </w:r>
+      <w:proofErr w:type="gramEnd"/>
+      <w:r>
+        <w:rPr>
+          <w:rFonts w:ascii="Times New Roman" w:eastAsia="Times New Roman" w:hAnsi="Times New Roman" w:cs="Times New Roman"/>
+          <w:sz w:val="24"/>
+          <w:szCs w:val="24"/>
+          <w:lang w:bidi="hi-IN"/>
+        </w:rPr>
+        <w:t xml:space="preserve"> </w:t>
       </w:r>
       <w:proofErr w:type="spellStart"/>
       <w:r>
@@ -728,7 +815,6 @@
         <w:t xml:space="preserve">: right-click "Databases" → Create → name it </w:t>
       </w:r>
       <w:proofErr w:type="spellStart"/>
-      <w:proofErr w:type="gramStart"/>
       <w:r>
         <w:rPr>
           <w:rFonts w:ascii="Courier New" w:eastAsia="Times New Roman" w:hAnsi="Courier New" w:cs="Courier New"/>
@@ -736,17 +822,7 @@
           <w:szCs w:val="20"/>
           <w:lang w:bidi="hi-IN"/>
         </w:rPr>
-        <w:t>practice</w:t>
-      </w:r>
-      <w:proofErr w:type="gramEnd"/>
-      <w:r>
-        <w:rPr>
-          <w:rFonts w:ascii="Courier New" w:eastAsia="Times New Roman" w:hAnsi="Courier New" w:cs="Courier New"/>
-          <w:sz w:val="20"/>
-          <w:szCs w:val="20"/>
-          <w:lang w:bidi="hi-IN"/>
-        </w:rPr>
-        <w:t>_db</w:t>
+        <w:t>practice_db</w:t>
       </w:r>
       <w:proofErr w:type="spellEnd"/>
       <w:r>
@@ -941,27 +1017,7 @@
           <w:szCs w:val="20"/>
           <w:lang w:bidi="hi-IN"/>
         </w:rPr>
-        <w:t>CREATE</w:t>
-      </w:r>
-      <w:r>
-        <w:rPr>
-          <w:rFonts w:ascii="var(--font-mono)" w:eastAsia="Times New Roman" w:hAnsi="var(--font-mono)" w:cs="Courier New"/>
-          <w:color w:val="14181F"/>
-          <w:sz w:val="20"/>
-          <w:szCs w:val="20"/>
-          <w:lang w:bidi="hi-IN"/>
-        </w:rPr>
-        <w:t xml:space="preserve"> </w:t>
-      </w:r>
-      <w:r>
-        <w:rPr>
-          <w:rFonts w:ascii="var(--font-mono)" w:eastAsia="Times New Roman" w:hAnsi="var(--font-mono)" w:cs="Courier New"/>
-          <w:color w:val="8100C2"/>
-          <w:sz w:val="20"/>
-          <w:szCs w:val="20"/>
-          <w:lang w:bidi="hi-IN"/>
-        </w:rPr>
-        <w:t>TABLE</w:t>
+        <w:t>CREATETABLE</w:t>
       </w:r>
       <w:r>
         <w:rPr>
@@ -1031,47 +1087,7 @@
           <w:szCs w:val="20"/>
           <w:lang w:bidi="hi-IN"/>
         </w:rPr>
-        <w:t>SERIAL</w:t>
-      </w:r>
-      <w:r>
-        <w:rPr>
-          <w:rFonts w:ascii="var(--font-mono)" w:eastAsia="Times New Roman" w:hAnsi="var(--font-mono)" w:cs="Courier New"/>
-          <w:color w:val="14181F"/>
-          <w:sz w:val="20"/>
-          <w:szCs w:val="20"/>
-          <w:lang w:bidi="hi-IN"/>
-        </w:rPr>
-        <w:t xml:space="preserve"> </w:t>
-      </w:r>
-      <w:r>
-        <w:rPr>
-          <w:rFonts w:ascii="var(--font-mono)" w:eastAsia="Times New Roman" w:hAnsi="var(--font-mono)" w:cs="Courier New"/>
-          <w:color w:val="8100C2"/>
-          <w:sz w:val="20"/>
-          <w:szCs w:val="20"/>
-          <w:lang w:bidi="hi-IN"/>
-        </w:rPr>
-        <w:t>PRIMARY</w:t>
-      </w:r>
-      <w:r>
-        <w:rPr>
-          <w:rFonts w:ascii="var(--font-mono)" w:eastAsia="Times New Roman" w:hAnsi="var(--font-mono)" w:cs="Courier New"/>
-          <w:color w:val="14181F"/>
-          <w:sz w:val="20"/>
-          <w:szCs w:val="20"/>
-          <w:lang w:bidi="hi-IN"/>
-        </w:rPr>
-        <w:t xml:space="preserve"> </w:t>
-      </w:r>
-      <w:r>
-        <w:rPr>
-          <w:rFonts w:ascii="var(--font-mono)" w:eastAsia="Times New Roman" w:hAnsi="var(--font-mono)" w:cs="Courier New"/>
-          <w:color w:val="8100C2"/>
-          <w:sz w:val="20"/>
-          <w:szCs w:val="20"/>
-          <w:lang w:bidi="hi-IN"/>
-        </w:rPr>
-        <w:t>KEY</w:t>
+        <w:t>SERIALPRIMARYKEY</w:t>
       </w:r>
       <w:r>
         <w:rPr>
@@ -1121,12 +1137,33 @@
           <w:szCs w:val="20"/>
           <w:lang w:bidi="hi-IN"/>
         </w:rPr>
-        <w:t xml:space="preserve">  title </w:t>
+        <w:t xml:space="preserve">  </w:t>
       </w:r>
       <w:proofErr w:type="gramStart"/>
       <w:r>
         <w:rPr>
           <w:rFonts w:ascii="var(--font-mono)" w:eastAsia="Times New Roman" w:hAnsi="var(--font-mono)" w:cs="Courier New"/>
+          <w:color w:val="14181F"/>
+          <w:sz w:val="20"/>
+          <w:szCs w:val="20"/>
+          <w:lang w:bidi="hi-IN"/>
+        </w:rPr>
+        <w:t>title</w:t>
+      </w:r>
+      <w:proofErr w:type="gramEnd"/>
+      <w:r>
+        <w:rPr>
+          <w:rFonts w:ascii="var(--font-mono)" w:eastAsia="Times New Roman" w:hAnsi="var(--font-mono)" w:cs="Courier New"/>
+          <w:color w:val="14181F"/>
+          <w:sz w:val="20"/>
+          <w:szCs w:val="20"/>
+          <w:lang w:bidi="hi-IN"/>
+        </w:rPr>
+        <w:t xml:space="preserve"> </w:t>
+      </w:r>
+      <w:r>
+        <w:rPr>
+          <w:rFonts w:ascii="var(--font-mono)" w:eastAsia="Times New Roman" w:hAnsi="var(--font-mono)" w:cs="Courier New"/>
           <w:color w:val="8100C2"/>
           <w:sz w:val="20"/>
           <w:szCs w:val="20"/>
@@ -1144,7 +1181,6 @@
         </w:rPr>
         <w:t>(</w:t>
       </w:r>
-      <w:proofErr w:type="gramEnd"/>
       <w:r>
         <w:rPr>
           <w:rFonts w:ascii="var(--font-mono)" w:eastAsia="Times New Roman" w:hAnsi="var(--font-mono)" w:cs="Courier New"/>
@@ -1203,12 +1239,33 @@
           <w:szCs w:val="20"/>
           <w:lang w:bidi="hi-IN"/>
         </w:rPr>
-        <w:t xml:space="preserve">  author </w:t>
+        <w:t xml:space="preserve">  </w:t>
       </w:r>
       <w:proofErr w:type="gramStart"/>
       <w:r>
         <w:rPr>
           <w:rFonts w:ascii="var(--font-mono)" w:eastAsia="Times New Roman" w:hAnsi="var(--font-mono)" w:cs="Courier New"/>
+          <w:color w:val="14181F"/>
+          <w:sz w:val="20"/>
+          <w:szCs w:val="20"/>
+          <w:lang w:bidi="hi-IN"/>
+        </w:rPr>
+        <w:t>author</w:t>
+      </w:r>
+      <w:proofErr w:type="gramEnd"/>
+      <w:r>
+        <w:rPr>
+          <w:rFonts w:ascii="var(--font-mono)" w:eastAsia="Times New Roman" w:hAnsi="var(--font-mono)" w:cs="Courier New"/>
+          <w:color w:val="14181F"/>
+          <w:sz w:val="20"/>
+          <w:szCs w:val="20"/>
+          <w:lang w:bidi="hi-IN"/>
+        </w:rPr>
+        <w:t xml:space="preserve"> </w:t>
+      </w:r>
+      <w:r>
+        <w:rPr>
+          <w:rFonts w:ascii="var(--font-mono)" w:eastAsia="Times New Roman" w:hAnsi="var(--font-mono)" w:cs="Courier New"/>
           <w:color w:val="8100C2"/>
           <w:sz w:val="20"/>
           <w:szCs w:val="20"/>
@@ -1226,7 +1283,6 @@
         </w:rPr>
         <w:t>(</w:t>
       </w:r>
-      <w:proofErr w:type="gramEnd"/>
       <w:r>
         <w:rPr>
           <w:rFonts w:ascii="var(--font-mono)" w:eastAsia="Times New Roman" w:hAnsi="var(--font-mono)" w:cs="Courier New"/>
@@ -1617,7 +1673,27 @@
           <w:szCs w:val="24"/>
           <w:lang w:bidi="hi-IN"/>
         </w:rPr>
-        <w:t xml:space="preserve"> in a new GitHub repo called </w:t>
+        <w:t xml:space="preserve"> in a new </w:t>
+      </w:r>
+      <w:proofErr w:type="spellStart"/>
+      <w:r>
+        <w:rPr>
+          <w:rFonts w:ascii="Times New Roman" w:eastAsia="Times New Roman" w:hAnsi="Times New Roman" w:cs="Times New Roman"/>
+          <w:sz w:val="24"/>
+          <w:szCs w:val="24"/>
+          <w:lang w:bidi="hi-IN"/>
+        </w:rPr>
+        <w:t>GitHub</w:t>
+      </w:r>
+      <w:proofErr w:type="spellEnd"/>
+      <w:r>
+        <w:rPr>
+          <w:rFonts w:ascii="Times New Roman" w:eastAsia="Times New Roman" w:hAnsi="Times New Roman" w:cs="Times New Roman"/>
+          <w:sz w:val="24"/>
+          <w:szCs w:val="24"/>
+          <w:lang w:bidi="hi-IN"/>
+        </w:rPr>
+        <w:t xml:space="preserve"> repo called </w:t>
       </w:r>
       <w:proofErr w:type="spellStart"/>
       <w:r>
@@ -1792,17 +1868,37 @@
           <w:szCs w:val="20"/>
           <w:lang w:bidi="hi-IN"/>
         </w:rPr>
-        <w:t>CREATE</w:t>
-      </w:r>
-      <w:r>
-        <w:rPr>
-          <w:rFonts w:ascii="var(--font-mono)" w:eastAsia="Times New Roman" w:hAnsi="var(--font-mono)" w:cs="Courier New"/>
-          <w:color w:val="14181F"/>
-          <w:sz w:val="20"/>
-          <w:szCs w:val="20"/>
-          <w:lang w:bidi="hi-IN"/>
-        </w:rPr>
-        <w:t xml:space="preserve"> </w:t>
+        <w:t>CREATETABLE</w:t>
+      </w:r>
+      <w:r>
+        <w:rPr>
+          <w:rFonts w:ascii="var(--font-mono)" w:eastAsia="Times New Roman" w:hAnsi="var(--font-mono)" w:cs="Courier New"/>
+          <w:color w:val="14181F"/>
+          <w:sz w:val="20"/>
+          <w:szCs w:val="20"/>
+          <w:lang w:bidi="hi-IN"/>
+        </w:rPr>
+        <w:t xml:space="preserve"> authors </w:t>
+      </w:r>
+      <w:r>
+        <w:rPr>
+          <w:rFonts w:ascii="var(--font-mono)" w:eastAsia="Times New Roman" w:hAnsi="var(--font-mono)" w:cs="Courier New"/>
+          <w:color w:val="2B303B"/>
+          <w:sz w:val="20"/>
+          <w:szCs w:val="20"/>
+          <w:lang w:bidi="hi-IN"/>
+        </w:rPr>
+        <w:t>(</w:t>
+      </w:r>
+      <w:r>
+        <w:rPr>
+          <w:rFonts w:ascii="var(--font-mono)" w:eastAsia="Times New Roman" w:hAnsi="var(--font-mono)" w:cs="Courier New"/>
+          <w:color w:val="14181F"/>
+          <w:sz w:val="20"/>
+          <w:szCs w:val="20"/>
+          <w:lang w:bidi="hi-IN"/>
+        </w:rPr>
+        <w:t xml:space="preserve">id </w:t>
       </w:r>
       <w:r>
         <w:rPr>
@@ -1812,87 +1908,7 @@
           <w:szCs w:val="20"/>
           <w:lang w:bidi="hi-IN"/>
         </w:rPr>
-        <w:t>TABLE</w:t>
-      </w:r>
-      <w:r>
-        <w:rPr>
-          <w:rFonts w:ascii="var(--font-mono)" w:eastAsia="Times New Roman" w:hAnsi="var(--font-mono)" w:cs="Courier New"/>
-          <w:color w:val="14181F"/>
-          <w:sz w:val="20"/>
-          <w:szCs w:val="20"/>
-          <w:lang w:bidi="hi-IN"/>
-        </w:rPr>
-        <w:t xml:space="preserve"> authors </w:t>
-      </w:r>
-      <w:r>
-        <w:rPr>
-          <w:rFonts w:ascii="var(--font-mono)" w:eastAsia="Times New Roman" w:hAnsi="var(--font-mono)" w:cs="Courier New"/>
-          <w:color w:val="2B303B"/>
-          <w:sz w:val="20"/>
-          <w:szCs w:val="20"/>
-          <w:lang w:bidi="hi-IN"/>
-        </w:rPr>
-        <w:t>(</w:t>
-      </w:r>
-      <w:r>
-        <w:rPr>
-          <w:rFonts w:ascii="var(--font-mono)" w:eastAsia="Times New Roman" w:hAnsi="var(--font-mono)" w:cs="Courier New"/>
-          <w:color w:val="14181F"/>
-          <w:sz w:val="20"/>
-          <w:szCs w:val="20"/>
-          <w:lang w:bidi="hi-IN"/>
-        </w:rPr>
-        <w:t xml:space="preserve">id </w:t>
-      </w:r>
-      <w:r>
-        <w:rPr>
-          <w:rFonts w:ascii="var(--font-mono)" w:eastAsia="Times New Roman" w:hAnsi="var(--font-mono)" w:cs="Courier New"/>
-          <w:color w:val="8100C2"/>
-          <w:sz w:val="20"/>
-          <w:szCs w:val="20"/>
-          <w:lang w:bidi="hi-IN"/>
-        </w:rPr>
-        <w:t>SERIAL</w:t>
-      </w:r>
-      <w:r>
-        <w:rPr>
-          <w:rFonts w:ascii="var(--font-mono)" w:eastAsia="Times New Roman" w:hAnsi="var(--font-mono)" w:cs="Courier New"/>
-          <w:color w:val="14181F"/>
-          <w:sz w:val="20"/>
-          <w:szCs w:val="20"/>
-          <w:lang w:bidi="hi-IN"/>
-        </w:rPr>
-        <w:t xml:space="preserve"> </w:t>
-      </w:r>
-      <w:r>
-        <w:rPr>
-          <w:rFonts w:ascii="var(--font-mono)" w:eastAsia="Times New Roman" w:hAnsi="var(--font-mono)" w:cs="Courier New"/>
-          <w:color w:val="8100C2"/>
-          <w:sz w:val="20"/>
-          <w:szCs w:val="20"/>
-          <w:lang w:bidi="hi-IN"/>
-        </w:rPr>
-        <w:t>PRIMARY</w:t>
-      </w:r>
-      <w:r>
-        <w:rPr>
-          <w:rFonts w:ascii="var(--font-mono)" w:eastAsia="Times New Roman" w:hAnsi="var(--font-mono)" w:cs="Courier New"/>
-          <w:color w:val="14181F"/>
-          <w:sz w:val="20"/>
-          <w:szCs w:val="20"/>
-          <w:lang w:bidi="hi-IN"/>
-        </w:rPr>
-        <w:t xml:space="preserve"> </w:t>
-      </w:r>
-      <w:r>
-        <w:rPr>
-          <w:rFonts w:ascii="var(--font-mono)" w:eastAsia="Times New Roman" w:hAnsi="var(--font-mono)" w:cs="Courier New"/>
-          <w:color w:val="8100C2"/>
-          <w:sz w:val="20"/>
-          <w:szCs w:val="20"/>
-          <w:lang w:bidi="hi-IN"/>
-        </w:rPr>
-        <w:t>KEY</w:t>
+        <w:t>SERIALPRIMARYKEY</w:t>
       </w:r>
       <w:r>
         <w:rPr>
@@ -1994,27 +2010,7 @@
           <w:szCs w:val="20"/>
           <w:lang w:bidi="hi-IN"/>
         </w:rPr>
-        <w:t>CREATE</w:t>
-      </w:r>
-      <w:r>
-        <w:rPr>
-          <w:rFonts w:ascii="var(--font-mono)" w:eastAsia="Times New Roman" w:hAnsi="var(--font-mono)" w:cs="Courier New"/>
-          <w:color w:val="14181F"/>
-          <w:sz w:val="20"/>
-          <w:szCs w:val="20"/>
-          <w:lang w:bidi="hi-IN"/>
-        </w:rPr>
-        <w:t xml:space="preserve"> </w:t>
-      </w:r>
-      <w:r>
-        <w:rPr>
-          <w:rFonts w:ascii="var(--font-mono)" w:eastAsia="Times New Roman" w:hAnsi="var(--font-mono)" w:cs="Courier New"/>
-          <w:color w:val="8100C2"/>
-          <w:sz w:val="20"/>
-          <w:szCs w:val="20"/>
-          <w:lang w:bidi="hi-IN"/>
-        </w:rPr>
-        <w:t>TABLE</w:t>
+        <w:t>CREATETABLE</w:t>
       </w:r>
       <w:r>
         <w:rPr>
@@ -2084,47 +2080,7 @@
           <w:szCs w:val="20"/>
           <w:lang w:bidi="hi-IN"/>
         </w:rPr>
-        <w:t>SERIAL</w:t>
-      </w:r>
-      <w:r>
-        <w:rPr>
-          <w:rFonts w:ascii="var(--font-mono)" w:eastAsia="Times New Roman" w:hAnsi="var(--font-mono)" w:cs="Courier New"/>
-          <w:color w:val="14181F"/>
-          <w:sz w:val="20"/>
-          <w:szCs w:val="20"/>
-          <w:lang w:bidi="hi-IN"/>
-        </w:rPr>
-        <w:t xml:space="preserve"> </w:t>
-      </w:r>
-      <w:r>
-        <w:rPr>
-          <w:rFonts w:ascii="var(--font-mono)" w:eastAsia="Times New Roman" w:hAnsi="var(--font-mono)" w:cs="Courier New"/>
-          <w:color w:val="8100C2"/>
-          <w:sz w:val="20"/>
-          <w:szCs w:val="20"/>
-          <w:lang w:bidi="hi-IN"/>
-        </w:rPr>
-        <w:t>PRIMARY</w:t>
-      </w:r>
-      <w:r>
-        <w:rPr>
-          <w:rFonts w:ascii="var(--font-mono)" w:eastAsia="Times New Roman" w:hAnsi="var(--font-mono)" w:cs="Courier New"/>
-          <w:color w:val="14181F"/>
-          <w:sz w:val="20"/>
-          <w:szCs w:val="20"/>
-          <w:lang w:bidi="hi-IN"/>
-        </w:rPr>
-        <w:t xml:space="preserve"> </w:t>
-      </w:r>
-      <w:r>
-        <w:rPr>
-          <w:rFonts w:ascii="var(--font-mono)" w:eastAsia="Times New Roman" w:hAnsi="var(--font-mono)" w:cs="Courier New"/>
-          <w:color w:val="8100C2"/>
-          <w:sz w:val="20"/>
-          <w:szCs w:val="20"/>
-          <w:lang w:bidi="hi-IN"/>
-        </w:rPr>
-        <w:t>KEY</w:t>
+        <w:t>SERIALPRIMARYKEY</w:t>
       </w:r>
       <w:r>
         <w:rPr>
@@ -2174,12 +2130,33 @@
           <w:szCs w:val="20"/>
           <w:lang w:bidi="hi-IN"/>
         </w:rPr>
-        <w:t xml:space="preserve">  title </w:t>
+        <w:t xml:space="preserve">  </w:t>
       </w:r>
       <w:proofErr w:type="gramStart"/>
       <w:r>
         <w:rPr>
           <w:rFonts w:ascii="var(--font-mono)" w:eastAsia="Times New Roman" w:hAnsi="var(--font-mono)" w:cs="Courier New"/>
+          <w:color w:val="14181F"/>
+          <w:sz w:val="20"/>
+          <w:szCs w:val="20"/>
+          <w:lang w:bidi="hi-IN"/>
+        </w:rPr>
+        <w:t>title</w:t>
+      </w:r>
+      <w:proofErr w:type="gramEnd"/>
+      <w:r>
+        <w:rPr>
+          <w:rFonts w:ascii="var(--font-mono)" w:eastAsia="Times New Roman" w:hAnsi="var(--font-mono)" w:cs="Courier New"/>
+          <w:color w:val="14181F"/>
+          <w:sz w:val="20"/>
+          <w:szCs w:val="20"/>
+          <w:lang w:bidi="hi-IN"/>
+        </w:rPr>
+        <w:t xml:space="preserve"> </w:t>
+      </w:r>
+      <w:r>
+        <w:rPr>
+          <w:rFonts w:ascii="var(--font-mono)" w:eastAsia="Times New Roman" w:hAnsi="var(--font-mono)" w:cs="Courier New"/>
           <w:color w:val="8100C2"/>
           <w:sz w:val="20"/>
           <w:szCs w:val="20"/>
@@ -2197,7 +2174,6 @@
         </w:rPr>
         <w:t>(</w:t>
       </w:r>
-      <w:proofErr w:type="gramEnd"/>
       <w:r>
         <w:rPr>
           <w:rFonts w:ascii="var(--font-mono)" w:eastAsia="Times New Roman" w:hAnsi="var(--font-mono)" w:cs="Courier New"/>
@@ -2248,16 +2224,6 @@
           <w:lang w:bidi="hi-IN"/>
         </w:rPr>
       </w:pPr>
-      <w:r>
-        <w:rPr>
-          <w:rFonts w:ascii="var(--font-mono)" w:eastAsia="Times New Roman" w:hAnsi="var(--font-mono)" w:cs="Courier New"/>
-          <w:color w:val="14181F"/>
-          <w:sz w:val="20"/>
-          <w:szCs w:val="20"/>
-          <w:lang w:bidi="hi-IN"/>
-        </w:rPr>
-        <w:t xml:space="preserve">  </w:t>
-      </w:r>
       <w:proofErr w:type="spellStart"/>
       <w:r>
         <w:rPr>
@@ -2269,47 +2235,17 @@
         </w:rPr>
         <w:t>author_id</w:t>
       </w:r>
+      <w:r>
+        <w:rPr>
+          <w:rFonts w:ascii="var(--font-mono)" w:eastAsia="Times New Roman" w:hAnsi="var(--font-mono)" w:cs="Courier New"/>
+          <w:color w:val="8100C2"/>
+          <w:sz w:val="20"/>
+          <w:szCs w:val="20"/>
+          <w:lang w:bidi="hi-IN"/>
+        </w:rPr>
+        <w:t>INTEGERREFERENCES</w:t>
+      </w:r>
       <w:proofErr w:type="spellEnd"/>
-      <w:r>
-        <w:rPr>
-          <w:rFonts w:ascii="var(--font-mono)" w:eastAsia="Times New Roman" w:hAnsi="var(--font-mono)" w:cs="Courier New"/>
-          <w:color w:val="14181F"/>
-          <w:sz w:val="20"/>
-          <w:szCs w:val="20"/>
-          <w:lang w:bidi="hi-IN"/>
-        </w:rPr>
-        <w:t xml:space="preserve"> </w:t>
-      </w:r>
-      <w:r>
-        <w:rPr>
-          <w:rFonts w:ascii="var(--font-mono)" w:eastAsia="Times New Roman" w:hAnsi="var(--font-mono)" w:cs="Courier New"/>
-          <w:color w:val="8100C2"/>
-          <w:sz w:val="20"/>
-          <w:szCs w:val="20"/>
-          <w:lang w:bidi="hi-IN"/>
-        </w:rPr>
-        <w:t>INTEGER</w:t>
-      </w:r>
-      <w:r>
-        <w:rPr>
-          <w:rFonts w:ascii="var(--font-mono)" w:eastAsia="Times New Roman" w:hAnsi="var(--font-mono)" w:cs="Courier New"/>
-          <w:color w:val="14181F"/>
-          <w:sz w:val="20"/>
-          <w:szCs w:val="20"/>
-          <w:lang w:bidi="hi-IN"/>
-        </w:rPr>
-        <w:t xml:space="preserve"> </w:t>
-      </w:r>
-      <w:r>
-        <w:rPr>
-          <w:rFonts w:ascii="var(--font-mono)" w:eastAsia="Times New Roman" w:hAnsi="var(--font-mono)" w:cs="Courier New"/>
-          <w:color w:val="8100C2"/>
-          <w:sz w:val="20"/>
-          <w:szCs w:val="20"/>
-          <w:lang w:bidi="hi-IN"/>
-        </w:rPr>
-        <w:t>REFERENCES</w:t>
-      </w:r>
       <w:r>
         <w:rPr>
           <w:rFonts w:ascii="var(--font-mono)" w:eastAsia="Times New Roman" w:hAnsi="var(--font-mono)" w:cs="Courier New"/>
@@ -2671,7 +2607,7 @@
           <w:szCs w:val="24"/>
           <w:lang w:bidi="hi-IN"/>
         </w:rPr>
-        <w:pict w14:anchorId="6F12A01E">
+        <w:pict>
           <v:rect id="_x0000_i1028" style="width:0;height:1.5pt" o:hralign="center" o:hrstd="t" o:hr="t" fillcolor="#a0a0a0" stroked="f"/>
         </w:pict>
       </w:r>
@@ -2854,7 +2790,7 @@
           <w:szCs w:val="24"/>
           <w:lang w:bidi="hi-IN"/>
         </w:rPr>
-        <w:pict w14:anchorId="38958853">
+        <w:pict>
           <v:rect id="_x0000_i1029" style="width:0;height:1.5pt" o:hralign="center" o:hrstd="t" o:hr="t" fillcolor="#a0a0a0" stroked="f"/>
         </w:pict>
       </w:r>
@@ -3114,27 +3050,7 @@
           <w:szCs w:val="20"/>
           <w:lang w:bidi="hi-IN"/>
         </w:rPr>
-        <w:t>CREATE</w:t>
-      </w:r>
-      <w:r>
-        <w:rPr>
-          <w:rFonts w:ascii="var(--font-mono)" w:eastAsia="Times New Roman" w:hAnsi="var(--font-mono)" w:cs="Courier New"/>
-          <w:color w:val="14181F"/>
-          <w:sz w:val="20"/>
-          <w:szCs w:val="20"/>
-          <w:lang w:bidi="hi-IN"/>
-        </w:rPr>
-        <w:t xml:space="preserve"> </w:t>
-      </w:r>
-      <w:r>
-        <w:rPr>
-          <w:rFonts w:ascii="var(--font-mono)" w:eastAsia="Times New Roman" w:hAnsi="var(--font-mono)" w:cs="Courier New"/>
-          <w:color w:val="8100C2"/>
-          <w:sz w:val="20"/>
-          <w:szCs w:val="20"/>
-          <w:lang w:bidi="hi-IN"/>
-        </w:rPr>
-        <w:t>TABLE</w:t>
+        <w:t>CREATETABLE</w:t>
       </w:r>
       <w:r>
         <w:rPr>
@@ -3204,47 +3120,7 @@
           <w:szCs w:val="20"/>
           <w:lang w:bidi="hi-IN"/>
         </w:rPr>
-        <w:t>SERIAL</w:t>
-      </w:r>
-      <w:r>
-        <w:rPr>
-          <w:rFonts w:ascii="var(--font-mono)" w:eastAsia="Times New Roman" w:hAnsi="var(--font-mono)" w:cs="Courier New"/>
-          <w:color w:val="14181F"/>
-          <w:sz w:val="20"/>
-          <w:szCs w:val="20"/>
-          <w:lang w:bidi="hi-IN"/>
-        </w:rPr>
-        <w:t xml:space="preserve"> </w:t>
-      </w:r>
-      <w:r>
-        <w:rPr>
-          <w:rFonts w:ascii="var(--font-mono)" w:eastAsia="Times New Roman" w:hAnsi="var(--font-mono)" w:cs="Courier New"/>
-          <w:color w:val="8100C2"/>
-          <w:sz w:val="20"/>
-          <w:szCs w:val="20"/>
-          <w:lang w:bidi="hi-IN"/>
-        </w:rPr>
-        <w:t>PRIMARY</w:t>
-      </w:r>
-      <w:r>
-        <w:rPr>
-          <w:rFonts w:ascii="var(--font-mono)" w:eastAsia="Times New Roman" w:hAnsi="var(--font-mono)" w:cs="Courier New"/>
-          <w:color w:val="14181F"/>
-          <w:sz w:val="20"/>
-          <w:szCs w:val="20"/>
-          <w:lang w:bidi="hi-IN"/>
-        </w:rPr>
-        <w:t xml:space="preserve"> </w:t>
-      </w:r>
-      <w:r>
-        <w:rPr>
-          <w:rFonts w:ascii="var(--font-mono)" w:eastAsia="Times New Roman" w:hAnsi="var(--font-mono)" w:cs="Courier New"/>
-          <w:color w:val="8100C2"/>
-          <w:sz w:val="20"/>
-          <w:szCs w:val="20"/>
-          <w:lang w:bidi="hi-IN"/>
-        </w:rPr>
-        <w:t>KEY</w:t>
+        <w:t>SERIALPRIMARYKEY</w:t>
       </w:r>
       <w:r>
         <w:rPr>
@@ -3294,12 +3170,33 @@
           <w:szCs w:val="20"/>
           <w:lang w:bidi="hi-IN"/>
         </w:rPr>
-        <w:t xml:space="preserve">  name </w:t>
+        <w:t xml:space="preserve">  </w:t>
       </w:r>
       <w:proofErr w:type="gramStart"/>
       <w:r>
         <w:rPr>
           <w:rFonts w:ascii="var(--font-mono)" w:eastAsia="Times New Roman" w:hAnsi="var(--font-mono)" w:cs="Courier New"/>
+          <w:color w:val="14181F"/>
+          <w:sz w:val="20"/>
+          <w:szCs w:val="20"/>
+          <w:lang w:bidi="hi-IN"/>
+        </w:rPr>
+        <w:t>name</w:t>
+      </w:r>
+      <w:proofErr w:type="gramEnd"/>
+      <w:r>
+        <w:rPr>
+          <w:rFonts w:ascii="var(--font-mono)" w:eastAsia="Times New Roman" w:hAnsi="var(--font-mono)" w:cs="Courier New"/>
+          <w:color w:val="14181F"/>
+          <w:sz w:val="20"/>
+          <w:szCs w:val="20"/>
+          <w:lang w:bidi="hi-IN"/>
+        </w:rPr>
+        <w:t xml:space="preserve"> </w:t>
+      </w:r>
+      <w:r>
+        <w:rPr>
+          <w:rFonts w:ascii="var(--font-mono)" w:eastAsia="Times New Roman" w:hAnsi="var(--font-mono)" w:cs="Courier New"/>
           <w:color w:val="8100C2"/>
           <w:sz w:val="20"/>
           <w:szCs w:val="20"/>
@@ -3317,7 +3214,6 @@
         </w:rPr>
         <w:t>(</w:t>
       </w:r>
-      <w:proofErr w:type="gramEnd"/>
       <w:r>
         <w:rPr>
           <w:rFonts w:ascii="var(--font-mono)" w:eastAsia="Times New Roman" w:hAnsi="var(--font-mono)" w:cs="Courier New"/>
@@ -3376,12 +3272,33 @@
           <w:szCs w:val="20"/>
           <w:lang w:bidi="hi-IN"/>
         </w:rPr>
-        <w:t xml:space="preserve">  role </w:t>
+        <w:t xml:space="preserve">  </w:t>
       </w:r>
       <w:proofErr w:type="gramStart"/>
       <w:r>
         <w:rPr>
           <w:rFonts w:ascii="var(--font-mono)" w:eastAsia="Times New Roman" w:hAnsi="var(--font-mono)" w:cs="Courier New"/>
+          <w:color w:val="14181F"/>
+          <w:sz w:val="20"/>
+          <w:szCs w:val="20"/>
+          <w:lang w:bidi="hi-IN"/>
+        </w:rPr>
+        <w:t>role</w:t>
+      </w:r>
+      <w:proofErr w:type="gramEnd"/>
+      <w:r>
+        <w:rPr>
+          <w:rFonts w:ascii="var(--font-mono)" w:eastAsia="Times New Roman" w:hAnsi="var(--font-mono)" w:cs="Courier New"/>
+          <w:color w:val="14181F"/>
+          <w:sz w:val="20"/>
+          <w:szCs w:val="20"/>
+          <w:lang w:bidi="hi-IN"/>
+        </w:rPr>
+        <w:t xml:space="preserve"> </w:t>
+      </w:r>
+      <w:r>
+        <w:rPr>
+          <w:rFonts w:ascii="var(--font-mono)" w:eastAsia="Times New Roman" w:hAnsi="var(--font-mono)" w:cs="Courier New"/>
           <w:color w:val="8100C2"/>
           <w:sz w:val="20"/>
           <w:szCs w:val="20"/>
@@ -3399,7 +3316,6 @@
         </w:rPr>
         <w:t>(</w:t>
       </w:r>
-      <w:proofErr w:type="gramEnd"/>
       <w:r>
         <w:rPr>
           <w:rFonts w:ascii="var(--font-mono)" w:eastAsia="Times New Roman" w:hAnsi="var(--font-mono)" w:cs="Courier New"/>
@@ -3450,16 +3366,6 @@
           <w:lang w:bidi="hi-IN"/>
         </w:rPr>
       </w:pPr>
-      <w:r>
-        <w:rPr>
-          <w:rFonts w:ascii="var(--font-mono)" w:eastAsia="Times New Roman" w:hAnsi="var(--font-mono)" w:cs="Courier New"/>
-          <w:color w:val="14181F"/>
-          <w:sz w:val="20"/>
-          <w:szCs w:val="20"/>
-          <w:lang w:bidi="hi-IN"/>
-        </w:rPr>
-        <w:t xml:space="preserve">  </w:t>
-      </w:r>
       <w:proofErr w:type="spellStart"/>
       <w:r>
         <w:rPr>
@@ -3469,30 +3375,30 @@
           <w:szCs w:val="20"/>
           <w:lang w:bidi="hi-IN"/>
         </w:rPr>
-        <w:t>contact_info</w:t>
+        <w:t>contact_</w:t>
+      </w:r>
+      <w:proofErr w:type="gramStart"/>
+      <w:r>
+        <w:rPr>
+          <w:rFonts w:ascii="var(--font-mono)" w:eastAsia="Times New Roman" w:hAnsi="var(--font-mono)" w:cs="Courier New"/>
+          <w:color w:val="14181F"/>
+          <w:sz w:val="20"/>
+          <w:szCs w:val="20"/>
+          <w:lang w:bidi="hi-IN"/>
+        </w:rPr>
+        <w:t>info</w:t>
+      </w:r>
+      <w:r>
+        <w:rPr>
+          <w:rFonts w:ascii="var(--font-mono)" w:eastAsia="Times New Roman" w:hAnsi="var(--font-mono)" w:cs="Courier New"/>
+          <w:color w:val="8100C2"/>
+          <w:sz w:val="20"/>
+          <w:szCs w:val="20"/>
+          <w:lang w:bidi="hi-IN"/>
+        </w:rPr>
+        <w:t>VARCHAR</w:t>
       </w:r>
       <w:proofErr w:type="spellEnd"/>
-      <w:r>
-        <w:rPr>
-          <w:rFonts w:ascii="var(--font-mono)" w:eastAsia="Times New Roman" w:hAnsi="var(--font-mono)" w:cs="Courier New"/>
-          <w:color w:val="14181F"/>
-          <w:sz w:val="20"/>
-          <w:szCs w:val="20"/>
-          <w:lang w:bidi="hi-IN"/>
-        </w:rPr>
-        <w:t xml:space="preserve"> </w:t>
-      </w:r>
-      <w:proofErr w:type="gramStart"/>
-      <w:r>
-        <w:rPr>
-          <w:rFonts w:ascii="var(--font-mono)" w:eastAsia="Times New Roman" w:hAnsi="var(--font-mono)" w:cs="Courier New"/>
-          <w:color w:val="8100C2"/>
-          <w:sz w:val="20"/>
-          <w:szCs w:val="20"/>
-          <w:lang w:bidi="hi-IN"/>
-        </w:rPr>
-        <w:t>VARCHAR</w:t>
-      </w:r>
       <w:r>
         <w:rPr>
           <w:rFonts w:ascii="var(--font-mono)" w:eastAsia="Times New Roman" w:hAnsi="var(--font-mono)" w:cs="Courier New"/>
@@ -3675,27 +3581,7 @@
           <w:szCs w:val="20"/>
           <w:lang w:bidi="hi-IN"/>
         </w:rPr>
-        <w:t>CREATE</w:t>
-      </w:r>
-      <w:r>
-        <w:rPr>
-          <w:rFonts w:ascii="var(--font-mono)" w:eastAsia="Times New Roman" w:hAnsi="var(--font-mono)" w:cs="Courier New"/>
-          <w:color w:val="14181F"/>
-          <w:sz w:val="20"/>
-          <w:szCs w:val="20"/>
-          <w:lang w:bidi="hi-IN"/>
-        </w:rPr>
-        <w:t xml:space="preserve"> </w:t>
-      </w:r>
-      <w:r>
-        <w:rPr>
-          <w:rFonts w:ascii="var(--font-mono)" w:eastAsia="Times New Roman" w:hAnsi="var(--font-mono)" w:cs="Courier New"/>
-          <w:color w:val="8100C2"/>
-          <w:sz w:val="20"/>
-          <w:szCs w:val="20"/>
-          <w:lang w:bidi="hi-IN"/>
-        </w:rPr>
-        <w:t>TABLE</w:t>
+        <w:t>CREATETABLE</w:t>
       </w:r>
       <w:r>
         <w:rPr>
@@ -3765,47 +3651,7 @@
           <w:szCs w:val="20"/>
           <w:lang w:bidi="hi-IN"/>
         </w:rPr>
-        <w:t>SERIAL</w:t>
-      </w:r>
-      <w:r>
-        <w:rPr>
-          <w:rFonts w:ascii="var(--font-mono)" w:eastAsia="Times New Roman" w:hAnsi="var(--font-mono)" w:cs="Courier New"/>
-          <w:color w:val="14181F"/>
-          <w:sz w:val="20"/>
-          <w:szCs w:val="20"/>
-          <w:lang w:bidi="hi-IN"/>
-        </w:rPr>
-        <w:t xml:space="preserve"> </w:t>
-      </w:r>
-      <w:r>
-        <w:rPr>
-          <w:rFonts w:ascii="var(--font-mono)" w:eastAsia="Times New Roman" w:hAnsi="var(--font-mono)" w:cs="Courier New"/>
-          <w:color w:val="8100C2"/>
-          <w:sz w:val="20"/>
-          <w:szCs w:val="20"/>
-          <w:lang w:bidi="hi-IN"/>
-        </w:rPr>
-        <w:t>PRIMARY</w:t>
-      </w:r>
-      <w:r>
-        <w:rPr>
-          <w:rFonts w:ascii="var(--font-mono)" w:eastAsia="Times New Roman" w:hAnsi="var(--font-mono)" w:cs="Courier New"/>
-          <w:color w:val="14181F"/>
-          <w:sz w:val="20"/>
-          <w:szCs w:val="20"/>
-          <w:lang w:bidi="hi-IN"/>
-        </w:rPr>
-        <w:t xml:space="preserve"> </w:t>
-      </w:r>
-      <w:r>
-        <w:rPr>
-          <w:rFonts w:ascii="var(--font-mono)" w:eastAsia="Times New Roman" w:hAnsi="var(--font-mono)" w:cs="Courier New"/>
-          <w:color w:val="8100C2"/>
-          <w:sz w:val="20"/>
-          <w:szCs w:val="20"/>
-          <w:lang w:bidi="hi-IN"/>
-        </w:rPr>
-        <w:t>KEY</w:t>
+        <w:t>SERIALPRIMARYKEY</w:t>
       </w:r>
       <w:r>
         <w:rPr>
@@ -3847,16 +3693,6 @@
           <w:lang w:bidi="hi-IN"/>
         </w:rPr>
       </w:pPr>
-      <w:r>
-        <w:rPr>
-          <w:rFonts w:ascii="var(--font-mono)" w:eastAsia="Times New Roman" w:hAnsi="var(--font-mono)" w:cs="Courier New"/>
-          <w:color w:val="14181F"/>
-          <w:sz w:val="20"/>
-          <w:szCs w:val="20"/>
-          <w:lang w:bidi="hi-IN"/>
-        </w:rPr>
-        <w:t xml:space="preserve">  </w:t>
-      </w:r>
       <w:proofErr w:type="spellStart"/>
       <w:r>
         <w:rPr>
@@ -3868,47 +3704,17 @@
         </w:rPr>
         <w:t>party_id</w:t>
       </w:r>
+      <w:r>
+        <w:rPr>
+          <w:rFonts w:ascii="var(--font-mono)" w:eastAsia="Times New Roman" w:hAnsi="var(--font-mono)" w:cs="Courier New"/>
+          <w:color w:val="8100C2"/>
+          <w:sz w:val="20"/>
+          <w:szCs w:val="20"/>
+          <w:lang w:bidi="hi-IN"/>
+        </w:rPr>
+        <w:t>INTEGERREFERENCES</w:t>
+      </w:r>
       <w:proofErr w:type="spellEnd"/>
-      <w:r>
-        <w:rPr>
-          <w:rFonts w:ascii="var(--font-mono)" w:eastAsia="Times New Roman" w:hAnsi="var(--font-mono)" w:cs="Courier New"/>
-          <w:color w:val="14181F"/>
-          <w:sz w:val="20"/>
-          <w:szCs w:val="20"/>
-          <w:lang w:bidi="hi-IN"/>
-        </w:rPr>
-        <w:t xml:space="preserve"> </w:t>
-      </w:r>
-      <w:r>
-        <w:rPr>
-          <w:rFonts w:ascii="var(--font-mono)" w:eastAsia="Times New Roman" w:hAnsi="var(--font-mono)" w:cs="Courier New"/>
-          <w:color w:val="8100C2"/>
-          <w:sz w:val="20"/>
-          <w:szCs w:val="20"/>
-          <w:lang w:bidi="hi-IN"/>
-        </w:rPr>
-        <w:t>INTEGER</w:t>
-      </w:r>
-      <w:r>
-        <w:rPr>
-          <w:rFonts w:ascii="var(--font-mono)" w:eastAsia="Times New Roman" w:hAnsi="var(--font-mono)" w:cs="Courier New"/>
-          <w:color w:val="14181F"/>
-          <w:sz w:val="20"/>
-          <w:szCs w:val="20"/>
-          <w:lang w:bidi="hi-IN"/>
-        </w:rPr>
-        <w:t xml:space="preserve"> </w:t>
-      </w:r>
-      <w:r>
-        <w:rPr>
-          <w:rFonts w:ascii="var(--font-mono)" w:eastAsia="Times New Roman" w:hAnsi="var(--font-mono)" w:cs="Courier New"/>
-          <w:color w:val="8100C2"/>
-          <w:sz w:val="20"/>
-          <w:szCs w:val="20"/>
-          <w:lang w:bidi="hi-IN"/>
-        </w:rPr>
-        <w:t>REFERENCES</w:t>
-      </w:r>
       <w:r>
         <w:rPr>
           <w:rFonts w:ascii="var(--font-mono)" w:eastAsia="Times New Roman" w:hAnsi="var(--font-mono)" w:cs="Courier New"/>
@@ -3979,16 +3785,6 @@
           <w:lang w:bidi="hi-IN"/>
         </w:rPr>
       </w:pPr>
-      <w:r>
-        <w:rPr>
-          <w:rFonts w:ascii="var(--font-mono)" w:eastAsia="Times New Roman" w:hAnsi="var(--font-mono)" w:cs="Courier New"/>
-          <w:color w:val="14181F"/>
-          <w:sz w:val="20"/>
-          <w:szCs w:val="20"/>
-          <w:lang w:bidi="hi-IN"/>
-        </w:rPr>
-        <w:t xml:space="preserve">  </w:t>
-      </w:r>
       <w:proofErr w:type="spellStart"/>
       <w:r>
         <w:rPr>
@@ -3998,30 +3794,30 @@
           <w:szCs w:val="20"/>
           <w:lang w:bidi="hi-IN"/>
         </w:rPr>
-        <w:t>notice_type</w:t>
+        <w:t>notice_</w:t>
+      </w:r>
+      <w:proofErr w:type="gramStart"/>
+      <w:r>
+        <w:rPr>
+          <w:rFonts w:ascii="var(--font-mono)" w:eastAsia="Times New Roman" w:hAnsi="var(--font-mono)" w:cs="Courier New"/>
+          <w:color w:val="14181F"/>
+          <w:sz w:val="20"/>
+          <w:szCs w:val="20"/>
+          <w:lang w:bidi="hi-IN"/>
+        </w:rPr>
+        <w:t>type</w:t>
+      </w:r>
+      <w:r>
+        <w:rPr>
+          <w:rFonts w:ascii="var(--font-mono)" w:eastAsia="Times New Roman" w:hAnsi="var(--font-mono)" w:cs="Courier New"/>
+          <w:color w:val="8100C2"/>
+          <w:sz w:val="20"/>
+          <w:szCs w:val="20"/>
+          <w:lang w:bidi="hi-IN"/>
+        </w:rPr>
+        <w:t>VARCHAR</w:t>
       </w:r>
       <w:proofErr w:type="spellEnd"/>
-      <w:r>
-        <w:rPr>
-          <w:rFonts w:ascii="var(--font-mono)" w:eastAsia="Times New Roman" w:hAnsi="var(--font-mono)" w:cs="Courier New"/>
-          <w:color w:val="14181F"/>
-          <w:sz w:val="20"/>
-          <w:szCs w:val="20"/>
-          <w:lang w:bidi="hi-IN"/>
-        </w:rPr>
-        <w:t xml:space="preserve"> </w:t>
-      </w:r>
-      <w:proofErr w:type="gramStart"/>
-      <w:r>
-        <w:rPr>
-          <w:rFonts w:ascii="var(--font-mono)" w:eastAsia="Times New Roman" w:hAnsi="var(--font-mono)" w:cs="Courier New"/>
-          <w:color w:val="8100C2"/>
-          <w:sz w:val="20"/>
-          <w:szCs w:val="20"/>
-          <w:lang w:bidi="hi-IN"/>
-        </w:rPr>
-        <w:t>VARCHAR</w:t>
-      </w:r>
       <w:r>
         <w:rPr>
           <w:rFonts w:ascii="var(--font-mono)" w:eastAsia="Times New Roman" w:hAnsi="var(--font-mono)" w:cs="Courier New"/>
@@ -4083,16 +3879,6 @@
           <w:lang w:bidi="hi-IN"/>
         </w:rPr>
       </w:pPr>
-      <w:r>
-        <w:rPr>
-          <w:rFonts w:ascii="var(--font-mono)" w:eastAsia="Times New Roman" w:hAnsi="var(--font-mono)" w:cs="Courier New"/>
-          <w:color w:val="14181F"/>
-          <w:sz w:val="20"/>
-          <w:szCs w:val="20"/>
-          <w:lang w:bidi="hi-IN"/>
-        </w:rPr>
-        <w:t xml:space="preserve">  </w:t>
-      </w:r>
       <w:proofErr w:type="spellStart"/>
       <w:r>
         <w:rPr>
@@ -4104,27 +3890,17 @@
         </w:rPr>
         <w:t>date_issued</w:t>
       </w:r>
+      <w:r>
+        <w:rPr>
+          <w:rFonts w:ascii="var(--font-mono)" w:eastAsia="Times New Roman" w:hAnsi="var(--font-mono)" w:cs="Courier New"/>
+          <w:color w:val="8100C2"/>
+          <w:sz w:val="20"/>
+          <w:szCs w:val="20"/>
+          <w:lang w:bidi="hi-IN"/>
+        </w:rPr>
+        <w:t>DATE</w:t>
+      </w:r>
       <w:proofErr w:type="spellEnd"/>
-      <w:r>
-        <w:rPr>
-          <w:rFonts w:ascii="var(--font-mono)" w:eastAsia="Times New Roman" w:hAnsi="var(--font-mono)" w:cs="Courier New"/>
-          <w:color w:val="14181F"/>
-          <w:sz w:val="20"/>
-          <w:szCs w:val="20"/>
-          <w:lang w:bidi="hi-IN"/>
-        </w:rPr>
-        <w:t xml:space="preserve"> </w:t>
-      </w:r>
-      <w:r>
-        <w:rPr>
-          <w:rFonts w:ascii="var(--font-mono)" w:eastAsia="Times New Roman" w:hAnsi="var(--font-mono)" w:cs="Courier New"/>
-          <w:color w:val="8100C2"/>
-          <w:sz w:val="20"/>
-          <w:szCs w:val="20"/>
-          <w:lang w:bidi="hi-IN"/>
-        </w:rPr>
-        <w:t>DATE</w:t>
-      </w:r>
       <w:r>
         <w:rPr>
           <w:rFonts w:ascii="var(--font-mono)" w:eastAsia="Times New Roman" w:hAnsi="var(--font-mono)" w:cs="Courier New"/>
@@ -4165,16 +3941,7 @@
           <w:lang w:bidi="hi-IN"/>
         </w:rPr>
       </w:pPr>
-      <w:r>
-        <w:rPr>
-          <w:rFonts w:ascii="var(--font-mono)" w:eastAsia="Times New Roman" w:hAnsi="var(--font-mono)" w:cs="Courier New"/>
-          <w:color w:val="14181F"/>
-          <w:sz w:val="20"/>
-          <w:szCs w:val="20"/>
-          <w:lang w:bidi="hi-IN"/>
-        </w:rPr>
-        <w:t xml:space="preserve">  </w:t>
-      </w:r>
+      <w:proofErr w:type="gramStart"/>
       <w:r>
         <w:rPr>
           <w:rFonts w:ascii="var(--font-mono)" w:eastAsia="Times New Roman" w:hAnsi="var(--font-mono)" w:cs="Courier New"/>
@@ -4183,28 +3950,7 @@
           <w:szCs w:val="20"/>
           <w:lang w:bidi="hi-IN"/>
         </w:rPr>
-        <w:t>status</w:t>
-      </w:r>
-      <w:r>
-        <w:rPr>
-          <w:rFonts w:ascii="var(--font-mono)" w:eastAsia="Times New Roman" w:hAnsi="var(--font-mono)" w:cs="Courier New"/>
-          <w:color w:val="14181F"/>
-          <w:sz w:val="20"/>
-          <w:szCs w:val="20"/>
-          <w:lang w:bidi="hi-IN"/>
-        </w:rPr>
-        <w:t xml:space="preserve"> </w:t>
-      </w:r>
-      <w:proofErr w:type="gramStart"/>
-      <w:r>
-        <w:rPr>
-          <w:rFonts w:ascii="var(--font-mono)" w:eastAsia="Times New Roman" w:hAnsi="var(--font-mono)" w:cs="Courier New"/>
-          <w:color w:val="8100C2"/>
-          <w:sz w:val="20"/>
-          <w:szCs w:val="20"/>
-          <w:lang w:bidi="hi-IN"/>
-        </w:rPr>
-        <w:t>VARCHAR</w:t>
+        <w:t>statusVARCHAR</w:t>
       </w:r>
       <w:r>
         <w:rPr>
@@ -4387,27 +4133,7 @@
           <w:szCs w:val="20"/>
           <w:lang w:bidi="hi-IN"/>
         </w:rPr>
-        <w:t>CREATE</w:t>
-      </w:r>
-      <w:r>
-        <w:rPr>
-          <w:rFonts w:ascii="var(--font-mono)" w:eastAsia="Times New Roman" w:hAnsi="var(--font-mono)" w:cs="Courier New"/>
-          <w:color w:val="14181F"/>
-          <w:sz w:val="20"/>
-          <w:szCs w:val="20"/>
-          <w:lang w:bidi="hi-IN"/>
-        </w:rPr>
-        <w:t xml:space="preserve"> </w:t>
-      </w:r>
-      <w:r>
-        <w:rPr>
-          <w:rFonts w:ascii="var(--font-mono)" w:eastAsia="Times New Roman" w:hAnsi="var(--font-mono)" w:cs="Courier New"/>
-          <w:color w:val="8100C2"/>
-          <w:sz w:val="20"/>
-          <w:szCs w:val="20"/>
-          <w:lang w:bidi="hi-IN"/>
-        </w:rPr>
-        <w:t>TABLE</w:t>
+        <w:t>CREATETABLE</w:t>
       </w:r>
       <w:r>
         <w:rPr>
@@ -4477,47 +4203,7 @@
           <w:szCs w:val="20"/>
           <w:lang w:bidi="hi-IN"/>
         </w:rPr>
-        <w:t>SERIAL</w:t>
-      </w:r>
-      <w:r>
-        <w:rPr>
-          <w:rFonts w:ascii="var(--font-mono)" w:eastAsia="Times New Roman" w:hAnsi="var(--font-mono)" w:cs="Courier New"/>
-          <w:color w:val="14181F"/>
-          <w:sz w:val="20"/>
-          <w:szCs w:val="20"/>
-          <w:lang w:bidi="hi-IN"/>
-        </w:rPr>
-        <w:t xml:space="preserve"> </w:t>
-      </w:r>
-      <w:r>
-        <w:rPr>
-          <w:rFonts w:ascii="var(--font-mono)" w:eastAsia="Times New Roman" w:hAnsi="var(--font-mono)" w:cs="Courier New"/>
-          <w:color w:val="8100C2"/>
-          <w:sz w:val="20"/>
-          <w:szCs w:val="20"/>
-          <w:lang w:bidi="hi-IN"/>
-        </w:rPr>
-        <w:t>PRIMARY</w:t>
-      </w:r>
-      <w:r>
-        <w:rPr>
-          <w:rFonts w:ascii="var(--font-mono)" w:eastAsia="Times New Roman" w:hAnsi="var(--font-mono)" w:cs="Courier New"/>
-          <w:color w:val="14181F"/>
-          <w:sz w:val="20"/>
-          <w:szCs w:val="20"/>
-          <w:lang w:bidi="hi-IN"/>
-        </w:rPr>
-        <w:t xml:space="preserve"> </w:t>
-      </w:r>
-      <w:r>
-        <w:rPr>
-          <w:rFonts w:ascii="var(--font-mono)" w:eastAsia="Times New Roman" w:hAnsi="var(--font-mono)" w:cs="Courier New"/>
-          <w:color w:val="8100C2"/>
-          <w:sz w:val="20"/>
-          <w:szCs w:val="20"/>
-          <w:lang w:bidi="hi-IN"/>
-        </w:rPr>
-        <w:t>KEY</w:t>
+        <w:t>SERIALPRIMARYKEY</w:t>
       </w:r>
       <w:r>
         <w:rPr>
@@ -4559,16 +4245,6 @@
           <w:lang w:bidi="hi-IN"/>
         </w:rPr>
       </w:pPr>
-      <w:r>
-        <w:rPr>
-          <w:rFonts w:ascii="var(--font-mono)" w:eastAsia="Times New Roman" w:hAnsi="var(--font-mono)" w:cs="Courier New"/>
-          <w:color w:val="14181F"/>
-          <w:sz w:val="20"/>
-          <w:szCs w:val="20"/>
-          <w:lang w:bidi="hi-IN"/>
-        </w:rPr>
-        <w:t xml:space="preserve">  </w:t>
-      </w:r>
       <w:proofErr w:type="spellStart"/>
       <w:r>
         <w:rPr>
@@ -4580,47 +4256,17 @@
         </w:rPr>
         <w:t>notice_id</w:t>
       </w:r>
+      <w:r>
+        <w:rPr>
+          <w:rFonts w:ascii="var(--font-mono)" w:eastAsia="Times New Roman" w:hAnsi="var(--font-mono)" w:cs="Courier New"/>
+          <w:color w:val="8100C2"/>
+          <w:sz w:val="20"/>
+          <w:szCs w:val="20"/>
+          <w:lang w:bidi="hi-IN"/>
+        </w:rPr>
+        <w:t>INTEGERREFERENCES</w:t>
+      </w:r>
       <w:proofErr w:type="spellEnd"/>
-      <w:r>
-        <w:rPr>
-          <w:rFonts w:ascii="var(--font-mono)" w:eastAsia="Times New Roman" w:hAnsi="var(--font-mono)" w:cs="Courier New"/>
-          <w:color w:val="14181F"/>
-          <w:sz w:val="20"/>
-          <w:szCs w:val="20"/>
-          <w:lang w:bidi="hi-IN"/>
-        </w:rPr>
-        <w:t xml:space="preserve"> </w:t>
-      </w:r>
-      <w:r>
-        <w:rPr>
-          <w:rFonts w:ascii="var(--font-mono)" w:eastAsia="Times New Roman" w:hAnsi="var(--font-mono)" w:cs="Courier New"/>
-          <w:color w:val="8100C2"/>
-          <w:sz w:val="20"/>
-          <w:szCs w:val="20"/>
-          <w:lang w:bidi="hi-IN"/>
-        </w:rPr>
-        <w:t>INTEGER</w:t>
-      </w:r>
-      <w:r>
-        <w:rPr>
-          <w:rFonts w:ascii="var(--font-mono)" w:eastAsia="Times New Roman" w:hAnsi="var(--font-mono)" w:cs="Courier New"/>
-          <w:color w:val="14181F"/>
-          <w:sz w:val="20"/>
-          <w:szCs w:val="20"/>
-          <w:lang w:bidi="hi-IN"/>
-        </w:rPr>
-        <w:t xml:space="preserve"> </w:t>
-      </w:r>
-      <w:r>
-        <w:rPr>
-          <w:rFonts w:ascii="var(--font-mono)" w:eastAsia="Times New Roman" w:hAnsi="var(--font-mono)" w:cs="Courier New"/>
-          <w:color w:val="8100C2"/>
-          <w:sz w:val="20"/>
-          <w:szCs w:val="20"/>
-          <w:lang w:bidi="hi-IN"/>
-        </w:rPr>
-        <w:t>REFERENCES</w:t>
-      </w:r>
       <w:r>
         <w:rPr>
           <w:rFonts w:ascii="var(--font-mono)" w:eastAsia="Times New Roman" w:hAnsi="var(--font-mono)" w:cs="Courier New"/>
@@ -4691,16 +4337,6 @@
           <w:lang w:bidi="hi-IN"/>
         </w:rPr>
       </w:pPr>
-      <w:r>
-        <w:rPr>
-          <w:rFonts w:ascii="var(--font-mono)" w:eastAsia="Times New Roman" w:hAnsi="var(--font-mono)" w:cs="Courier New"/>
-          <w:color w:val="14181F"/>
-          <w:sz w:val="20"/>
-          <w:szCs w:val="20"/>
-          <w:lang w:bidi="hi-IN"/>
-        </w:rPr>
-        <w:t xml:space="preserve">  </w:t>
-      </w:r>
       <w:proofErr w:type="spellStart"/>
       <w:r>
         <w:rPr>
@@ -4712,27 +4348,17 @@
         </w:rPr>
         <w:t>hearing_date</w:t>
       </w:r>
+      <w:r>
+        <w:rPr>
+          <w:rFonts w:ascii="var(--font-mono)" w:eastAsia="Times New Roman" w:hAnsi="var(--font-mono)" w:cs="Courier New"/>
+          <w:color w:val="8100C2"/>
+          <w:sz w:val="20"/>
+          <w:szCs w:val="20"/>
+          <w:lang w:bidi="hi-IN"/>
+        </w:rPr>
+        <w:t>DATE</w:t>
+      </w:r>
       <w:proofErr w:type="spellEnd"/>
-      <w:r>
-        <w:rPr>
-          <w:rFonts w:ascii="var(--font-mono)" w:eastAsia="Times New Roman" w:hAnsi="var(--font-mono)" w:cs="Courier New"/>
-          <w:color w:val="14181F"/>
-          <w:sz w:val="20"/>
-          <w:szCs w:val="20"/>
-          <w:lang w:bidi="hi-IN"/>
-        </w:rPr>
-        <w:t xml:space="preserve"> </w:t>
-      </w:r>
-      <w:r>
-        <w:rPr>
-          <w:rFonts w:ascii="var(--font-mono)" w:eastAsia="Times New Roman" w:hAnsi="var(--font-mono)" w:cs="Courier New"/>
-          <w:color w:val="8100C2"/>
-          <w:sz w:val="20"/>
-          <w:szCs w:val="20"/>
-          <w:lang w:bidi="hi-IN"/>
-        </w:rPr>
-        <w:t>DATE</w:t>
-      </w:r>
       <w:r>
         <w:rPr>
           <w:rFonts w:ascii="var(--font-mono)" w:eastAsia="Times New Roman" w:hAnsi="var(--font-mono)" w:cs="Courier New"/>
@@ -4773,16 +4399,6 @@
           <w:lang w:bidi="hi-IN"/>
         </w:rPr>
       </w:pPr>
-      <w:r>
-        <w:rPr>
-          <w:rFonts w:ascii="var(--font-mono)" w:eastAsia="Times New Roman" w:hAnsi="var(--font-mono)" w:cs="Courier New"/>
-          <w:color w:val="14181F"/>
-          <w:sz w:val="20"/>
-          <w:szCs w:val="20"/>
-          <w:lang w:bidi="hi-IN"/>
-        </w:rPr>
-        <w:t xml:space="preserve">  </w:t>
-      </w:r>
       <w:proofErr w:type="spellStart"/>
       <w:r>
         <w:rPr>
@@ -4792,30 +4408,30 @@
           <w:szCs w:val="20"/>
           <w:lang w:bidi="hi-IN"/>
         </w:rPr>
-        <w:t>court_name</w:t>
+        <w:t>court_</w:t>
+      </w:r>
+      <w:proofErr w:type="gramStart"/>
+      <w:r>
+        <w:rPr>
+          <w:rFonts w:ascii="var(--font-mono)" w:eastAsia="Times New Roman" w:hAnsi="var(--font-mono)" w:cs="Courier New"/>
+          <w:color w:val="14181F"/>
+          <w:sz w:val="20"/>
+          <w:szCs w:val="20"/>
+          <w:lang w:bidi="hi-IN"/>
+        </w:rPr>
+        <w:t>name</w:t>
+      </w:r>
+      <w:r>
+        <w:rPr>
+          <w:rFonts w:ascii="var(--font-mono)" w:eastAsia="Times New Roman" w:hAnsi="var(--font-mono)" w:cs="Courier New"/>
+          <w:color w:val="8100C2"/>
+          <w:sz w:val="20"/>
+          <w:szCs w:val="20"/>
+          <w:lang w:bidi="hi-IN"/>
+        </w:rPr>
+        <w:t>VARCHAR</w:t>
       </w:r>
       <w:proofErr w:type="spellEnd"/>
-      <w:r>
-        <w:rPr>
-          <w:rFonts w:ascii="var(--font-mono)" w:eastAsia="Times New Roman" w:hAnsi="var(--font-mono)" w:cs="Courier New"/>
-          <w:color w:val="14181F"/>
-          <w:sz w:val="20"/>
-          <w:szCs w:val="20"/>
-          <w:lang w:bidi="hi-IN"/>
-        </w:rPr>
-        <w:t xml:space="preserve"> </w:t>
-      </w:r>
-      <w:proofErr w:type="gramStart"/>
-      <w:r>
-        <w:rPr>
-          <w:rFonts w:ascii="var(--font-mono)" w:eastAsia="Times New Roman" w:hAnsi="var(--font-mono)" w:cs="Courier New"/>
-          <w:color w:val="8100C2"/>
-          <w:sz w:val="20"/>
-          <w:szCs w:val="20"/>
-          <w:lang w:bidi="hi-IN"/>
-        </w:rPr>
-        <w:t>VARCHAR</w:t>
-      </w:r>
       <w:r>
         <w:rPr>
           <w:rFonts w:ascii="var(--font-mono)" w:eastAsia="Times New Roman" w:hAnsi="var(--font-mono)" w:cs="Courier New"/>
@@ -4885,12 +4501,33 @@
           <w:szCs w:val="20"/>
           <w:lang w:bidi="hi-IN"/>
         </w:rPr>
-        <w:t xml:space="preserve">  outcome </w:t>
+        <w:t xml:space="preserve">  </w:t>
       </w:r>
       <w:proofErr w:type="gramStart"/>
       <w:r>
         <w:rPr>
           <w:rFonts w:ascii="var(--font-mono)" w:eastAsia="Times New Roman" w:hAnsi="var(--font-mono)" w:cs="Courier New"/>
+          <w:color w:val="14181F"/>
+          <w:sz w:val="20"/>
+          <w:szCs w:val="20"/>
+          <w:lang w:bidi="hi-IN"/>
+        </w:rPr>
+        <w:t>outcome</w:t>
+      </w:r>
+      <w:proofErr w:type="gramEnd"/>
+      <w:r>
+        <w:rPr>
+          <w:rFonts w:ascii="var(--font-mono)" w:eastAsia="Times New Roman" w:hAnsi="var(--font-mono)" w:cs="Courier New"/>
+          <w:color w:val="14181F"/>
+          <w:sz w:val="20"/>
+          <w:szCs w:val="20"/>
+          <w:lang w:bidi="hi-IN"/>
+        </w:rPr>
+        <w:t xml:space="preserve"> </w:t>
+      </w:r>
+      <w:r>
+        <w:rPr>
+          <w:rFonts w:ascii="var(--font-mono)" w:eastAsia="Times New Roman" w:hAnsi="var(--font-mono)" w:cs="Courier New"/>
           <w:color w:val="8100C2"/>
           <w:sz w:val="20"/>
           <w:szCs w:val="20"/>
@@ -4908,7 +4545,6 @@
         </w:rPr>
         <w:t>(</w:t>
       </w:r>
-      <w:proofErr w:type="gramEnd"/>
       <w:r>
         <w:rPr>
           <w:rFonts w:ascii="var(--font-mono)" w:eastAsia="Times New Roman" w:hAnsi="var(--font-mono)" w:cs="Courier New"/>
@@ -5108,7 +4744,7 @@
           <w:szCs w:val="20"/>
           <w:lang w:bidi="hi-IN"/>
         </w:rPr>
-        <w:t xml:space="preserve"> &gt; CURRENT_DATE</w:t>
+        <w:t>&gt; CURRENT_DATE</w:t>
       </w:r>
       <w:r>
         <w:rPr>
@@ -5310,27 +4946,7 @@
           <w:szCs w:val="20"/>
           <w:lang w:bidi="hi-IN"/>
         </w:rPr>
-        <w:t>CREATE</w:t>
-      </w:r>
-      <w:r>
-        <w:rPr>
-          <w:rFonts w:ascii="var(--font-mono)" w:eastAsia="Times New Roman" w:hAnsi="var(--font-mono)" w:cs="Courier New"/>
-          <w:color w:val="14181F"/>
-          <w:sz w:val="20"/>
-          <w:szCs w:val="20"/>
-          <w:lang w:bidi="hi-IN"/>
-        </w:rPr>
-        <w:t xml:space="preserve"> </w:t>
-      </w:r>
-      <w:r>
-        <w:rPr>
-          <w:rFonts w:ascii="var(--font-mono)" w:eastAsia="Times New Roman" w:hAnsi="var(--font-mono)" w:cs="Courier New"/>
-          <w:color w:val="8100C2"/>
-          <w:sz w:val="20"/>
-          <w:szCs w:val="20"/>
-          <w:lang w:bidi="hi-IN"/>
-        </w:rPr>
-        <w:t>TABLE</w:t>
+        <w:t>CREATETABLE</w:t>
       </w:r>
       <w:r>
         <w:rPr>
@@ -5400,47 +5016,7 @@
           <w:szCs w:val="20"/>
           <w:lang w:bidi="hi-IN"/>
         </w:rPr>
-        <w:t>SERIAL</w:t>
-      </w:r>
-      <w:r>
-        <w:rPr>
-          <w:rFonts w:ascii="var(--font-mono)" w:eastAsia="Times New Roman" w:hAnsi="var(--font-mono)" w:cs="Courier New"/>
-          <w:color w:val="14181F"/>
-          <w:sz w:val="20"/>
-          <w:szCs w:val="20"/>
-          <w:lang w:bidi="hi-IN"/>
-        </w:rPr>
-        <w:t xml:space="preserve"> </w:t>
-      </w:r>
-      <w:r>
-        <w:rPr>
-          <w:rFonts w:ascii="var(--font-mono)" w:eastAsia="Times New Roman" w:hAnsi="var(--font-mono)" w:cs="Courier New"/>
-          <w:color w:val="8100C2"/>
-          <w:sz w:val="20"/>
-          <w:szCs w:val="20"/>
-          <w:lang w:bidi="hi-IN"/>
-        </w:rPr>
-        <w:t>PRIMARY</w:t>
-      </w:r>
-      <w:r>
-        <w:rPr>
-          <w:rFonts w:ascii="var(--font-mono)" w:eastAsia="Times New Roman" w:hAnsi="var(--font-mono)" w:cs="Courier New"/>
-          <w:color w:val="14181F"/>
-          <w:sz w:val="20"/>
-          <w:szCs w:val="20"/>
-          <w:lang w:bidi="hi-IN"/>
-        </w:rPr>
-        <w:t xml:space="preserve"> </w:t>
-      </w:r>
-      <w:r>
-        <w:rPr>
-          <w:rFonts w:ascii="var(--font-mono)" w:eastAsia="Times New Roman" w:hAnsi="var(--font-mono)" w:cs="Courier New"/>
-          <w:color w:val="8100C2"/>
-          <w:sz w:val="20"/>
-          <w:szCs w:val="20"/>
-          <w:lang w:bidi="hi-IN"/>
-        </w:rPr>
-        <w:t>KEY</w:t>
+        <w:t>SERIALPRIMARYKEY</w:t>
       </w:r>
       <w:r>
         <w:rPr>
@@ -5482,16 +5058,6 @@
           <w:lang w:bidi="hi-IN"/>
         </w:rPr>
       </w:pPr>
-      <w:r>
-        <w:rPr>
-          <w:rFonts w:ascii="var(--font-mono)" w:eastAsia="Times New Roman" w:hAnsi="var(--font-mono)" w:cs="Courier New"/>
-          <w:color w:val="14181F"/>
-          <w:sz w:val="20"/>
-          <w:szCs w:val="20"/>
-          <w:lang w:bidi="hi-IN"/>
-        </w:rPr>
-        <w:t xml:space="preserve">  </w:t>
-      </w:r>
       <w:proofErr w:type="spellStart"/>
       <w:r>
         <w:rPr>
@@ -5503,47 +5069,17 @@
         </w:rPr>
         <w:t>notice_id</w:t>
       </w:r>
+      <w:r>
+        <w:rPr>
+          <w:rFonts w:ascii="var(--font-mono)" w:eastAsia="Times New Roman" w:hAnsi="var(--font-mono)" w:cs="Courier New"/>
+          <w:color w:val="8100C2"/>
+          <w:sz w:val="20"/>
+          <w:szCs w:val="20"/>
+          <w:lang w:bidi="hi-IN"/>
+        </w:rPr>
+        <w:t>INTEGERREFERENCES</w:t>
+      </w:r>
       <w:proofErr w:type="spellEnd"/>
-      <w:r>
-        <w:rPr>
-          <w:rFonts w:ascii="var(--font-mono)" w:eastAsia="Times New Roman" w:hAnsi="var(--font-mono)" w:cs="Courier New"/>
-          <w:color w:val="14181F"/>
-          <w:sz w:val="20"/>
-          <w:szCs w:val="20"/>
-          <w:lang w:bidi="hi-IN"/>
-        </w:rPr>
-        <w:t xml:space="preserve"> </w:t>
-      </w:r>
-      <w:r>
-        <w:rPr>
-          <w:rFonts w:ascii="var(--font-mono)" w:eastAsia="Times New Roman" w:hAnsi="var(--font-mono)" w:cs="Courier New"/>
-          <w:color w:val="8100C2"/>
-          <w:sz w:val="20"/>
-          <w:szCs w:val="20"/>
-          <w:lang w:bidi="hi-IN"/>
-        </w:rPr>
-        <w:t>INTEGER</w:t>
-      </w:r>
-      <w:r>
-        <w:rPr>
-          <w:rFonts w:ascii="var(--font-mono)" w:eastAsia="Times New Roman" w:hAnsi="var(--font-mono)" w:cs="Courier New"/>
-          <w:color w:val="14181F"/>
-          <w:sz w:val="20"/>
-          <w:szCs w:val="20"/>
-          <w:lang w:bidi="hi-IN"/>
-        </w:rPr>
-        <w:t xml:space="preserve"> </w:t>
-      </w:r>
-      <w:r>
-        <w:rPr>
-          <w:rFonts w:ascii="var(--font-mono)" w:eastAsia="Times New Roman" w:hAnsi="var(--font-mono)" w:cs="Courier New"/>
-          <w:color w:val="8100C2"/>
-          <w:sz w:val="20"/>
-          <w:szCs w:val="20"/>
-          <w:lang w:bidi="hi-IN"/>
-        </w:rPr>
-        <w:t>REFERENCES</w:t>
-      </w:r>
       <w:r>
         <w:rPr>
           <w:rFonts w:ascii="var(--font-mono)" w:eastAsia="Times New Roman" w:hAnsi="var(--font-mono)" w:cs="Courier New"/>
@@ -5614,16 +5150,6 @@
           <w:lang w:bidi="hi-IN"/>
         </w:rPr>
       </w:pPr>
-      <w:r>
-        <w:rPr>
-          <w:rFonts w:ascii="var(--font-mono)" w:eastAsia="Times New Roman" w:hAnsi="var(--font-mono)" w:cs="Courier New"/>
-          <w:color w:val="14181F"/>
-          <w:sz w:val="20"/>
-          <w:szCs w:val="20"/>
-          <w:lang w:bidi="hi-IN"/>
-        </w:rPr>
-        <w:t xml:space="preserve">  </w:t>
-      </w:r>
       <w:proofErr w:type="spellStart"/>
       <w:r>
         <w:rPr>
@@ -5633,30 +5159,30 @@
           <w:szCs w:val="20"/>
           <w:lang w:bidi="hi-IN"/>
         </w:rPr>
-        <w:t>file_path</w:t>
+        <w:t>file_</w:t>
+      </w:r>
+      <w:proofErr w:type="gramStart"/>
+      <w:r>
+        <w:rPr>
+          <w:rFonts w:ascii="var(--font-mono)" w:eastAsia="Times New Roman" w:hAnsi="var(--font-mono)" w:cs="Courier New"/>
+          <w:color w:val="14181F"/>
+          <w:sz w:val="20"/>
+          <w:szCs w:val="20"/>
+          <w:lang w:bidi="hi-IN"/>
+        </w:rPr>
+        <w:t>path</w:t>
+      </w:r>
+      <w:r>
+        <w:rPr>
+          <w:rFonts w:ascii="var(--font-mono)" w:eastAsia="Times New Roman" w:hAnsi="var(--font-mono)" w:cs="Courier New"/>
+          <w:color w:val="8100C2"/>
+          <w:sz w:val="20"/>
+          <w:szCs w:val="20"/>
+          <w:lang w:bidi="hi-IN"/>
+        </w:rPr>
+        <w:t>VARCHAR</w:t>
       </w:r>
       <w:proofErr w:type="spellEnd"/>
-      <w:r>
-        <w:rPr>
-          <w:rFonts w:ascii="var(--font-mono)" w:eastAsia="Times New Roman" w:hAnsi="var(--font-mono)" w:cs="Courier New"/>
-          <w:color w:val="14181F"/>
-          <w:sz w:val="20"/>
-          <w:szCs w:val="20"/>
-          <w:lang w:bidi="hi-IN"/>
-        </w:rPr>
-        <w:t xml:space="preserve"> </w:t>
-      </w:r>
-      <w:proofErr w:type="gramStart"/>
-      <w:r>
-        <w:rPr>
-          <w:rFonts w:ascii="var(--font-mono)" w:eastAsia="Times New Roman" w:hAnsi="var(--font-mono)" w:cs="Courier New"/>
-          <w:color w:val="8100C2"/>
-          <w:sz w:val="20"/>
-          <w:szCs w:val="20"/>
-          <w:lang w:bidi="hi-IN"/>
-        </w:rPr>
-        <w:t>VARCHAR</w:t>
-      </w:r>
       <w:r>
         <w:rPr>
           <w:rFonts w:ascii="var(--font-mono)" w:eastAsia="Times New Roman" w:hAnsi="var(--font-mono)" w:cs="Courier New"/>
@@ -5718,16 +5244,6 @@
           <w:lang w:bidi="hi-IN"/>
         </w:rPr>
       </w:pPr>
-      <w:r>
-        <w:rPr>
-          <w:rFonts w:ascii="var(--font-mono)" w:eastAsia="Times New Roman" w:hAnsi="var(--font-mono)" w:cs="Courier New"/>
-          <w:color w:val="14181F"/>
-          <w:sz w:val="20"/>
-          <w:szCs w:val="20"/>
-          <w:lang w:bidi="hi-IN"/>
-        </w:rPr>
-        <w:t xml:space="preserve">  </w:t>
-      </w:r>
       <w:proofErr w:type="spellStart"/>
       <w:r>
         <w:rPr>
@@ -5739,27 +5255,17 @@
         </w:rPr>
         <w:t>uploaded_date</w:t>
       </w:r>
+      <w:r>
+        <w:rPr>
+          <w:rFonts w:ascii="var(--font-mono)" w:eastAsia="Times New Roman" w:hAnsi="var(--font-mono)" w:cs="Courier New"/>
+          <w:color w:val="8100C2"/>
+          <w:sz w:val="20"/>
+          <w:szCs w:val="20"/>
+          <w:lang w:bidi="hi-IN"/>
+        </w:rPr>
+        <w:t>DATE</w:t>
+      </w:r>
       <w:proofErr w:type="spellEnd"/>
-      <w:r>
-        <w:rPr>
-          <w:rFonts w:ascii="var(--font-mono)" w:eastAsia="Times New Roman" w:hAnsi="var(--font-mono)" w:cs="Courier New"/>
-          <w:color w:val="14181F"/>
-          <w:sz w:val="20"/>
-          <w:szCs w:val="20"/>
-          <w:lang w:bidi="hi-IN"/>
-        </w:rPr>
-        <w:t xml:space="preserve"> </w:t>
-      </w:r>
-      <w:r>
-        <w:rPr>
-          <w:rFonts w:ascii="var(--font-mono)" w:eastAsia="Times New Roman" w:hAnsi="var(--font-mono)" w:cs="Courier New"/>
-          <w:color w:val="8100C2"/>
-          <w:sz w:val="20"/>
-          <w:szCs w:val="20"/>
-          <w:lang w:bidi="hi-IN"/>
-        </w:rPr>
-        <w:t>DATE</w:t>
-      </w:r>
     </w:p>
     <w:p>
       <w:pPr>
@@ -5959,7 +5465,7 @@
           <w:szCs w:val="24"/>
           <w:lang w:bidi="hi-IN"/>
         </w:rPr>
-        <w:pict w14:anchorId="5B9BA181">
+        <w:pict>
           <v:rect id="_x0000_i1030" style="width:0;height:1.5pt" o:hralign="center" o:hrstd="t" o:hr="t" fillcolor="#a0a0a0" stroked="f"/>
         </w:pict>
       </w:r>
@@ -6058,27 +5564,7 @@
           <w:szCs w:val="24"/>
           <w:lang w:bidi="hi-IN"/>
         </w:rPr>
-        <w:t xml:space="preserve">At least 4 different queries (JOIN, </w:t>
-      </w:r>
-      <w:proofErr w:type="gramStart"/>
-      <w:r>
-        <w:rPr>
-          <w:rFonts w:ascii="Times New Roman" w:eastAsia="Times New Roman" w:hAnsi="Times New Roman" w:cs="Times New Roman"/>
-          <w:sz w:val="24"/>
-          <w:szCs w:val="24"/>
-          <w:lang w:bidi="hi-IN"/>
-        </w:rPr>
-        <w:t>WHERE</w:t>
-      </w:r>
-      <w:proofErr w:type="gramEnd"/>
-      <w:r>
-        <w:rPr>
-          <w:rFonts w:ascii="Times New Roman" w:eastAsia="Times New Roman" w:hAnsi="Times New Roman" w:cs="Times New Roman"/>
-          <w:sz w:val="24"/>
-          <w:szCs w:val="24"/>
-          <w:lang w:bidi="hi-IN"/>
-        </w:rPr>
-        <w:t>, ORDER BY, GROUP BY) work correctly</w:t>
+        <w:t>At least 4 different queries (JOIN, WHERE, ORDER BY, GROUP BY) work correctly</w:t>
       </w:r>
     </w:p>
     <w:p>
@@ -6122,7 +5608,7 @@
           <w:szCs w:val="24"/>
           <w:lang w:bidi="hi-IN"/>
         </w:rPr>
-        <w:pict w14:anchorId="7C8FCB65">
+        <w:pict>
           <v:rect id="_x0000_i1031" style="width:0;height:1.5pt" o:hralign="center" o:hrstd="t" o:hr="t" fillcolor="#a0a0a0" stroked="f"/>
         </w:pict>
       </w:r>
@@ -6200,7 +5686,27 @@
           <w:szCs w:val="24"/>
           <w:lang w:bidi="hi-IN"/>
         </w:rPr>
-        <w:t xml:space="preserve"> and Django docs.</w:t>
+        <w:t xml:space="preserve"> and </w:t>
+      </w:r>
+      <w:proofErr w:type="spellStart"/>
+      <w:r>
+        <w:rPr>
+          <w:rFonts w:ascii="Times New Roman" w:eastAsia="Times New Roman" w:hAnsi="Times New Roman" w:cs="Times New Roman"/>
+          <w:sz w:val="24"/>
+          <w:szCs w:val="24"/>
+          <w:lang w:bidi="hi-IN"/>
+        </w:rPr>
+        <w:t>Django</w:t>
+      </w:r>
+      <w:proofErr w:type="spellEnd"/>
+      <w:r>
+        <w:rPr>
+          <w:rFonts w:ascii="Times New Roman" w:eastAsia="Times New Roman" w:hAnsi="Times New Roman" w:cs="Times New Roman"/>
+          <w:sz w:val="24"/>
+          <w:szCs w:val="24"/>
+          <w:lang w:bidi="hi-IN"/>
+        </w:rPr>
+        <w:t xml:space="preserve"> docs.</w:t>
       </w:r>
     </w:p>
     <w:p>
@@ -6220,7 +5726,7 @@
           <w:szCs w:val="24"/>
           <w:lang w:bidi="hi-IN"/>
         </w:rPr>
-        <w:pict w14:anchorId="337AD35C">
+        <w:pict>
           <v:rect id="_x0000_i1032" style="width:0;height:1.5pt" o:hralign="center" o:hrstd="t" o:hr="t" fillcolor="#a0a0a0" stroked="f"/>
         </w:pict>
       </w:r>
@@ -6429,7 +5935,26 @@
           <w:lang w:bidi="hi-IN"/>
         </w:rPr>
         <w:br/>
-        <w:t xml:space="preserve">On the same </w:t>
+      </w:r>
+      <w:proofErr w:type="gramStart"/>
+      <w:r>
+        <w:rPr>
+          <w:rFonts w:ascii="Times New Roman" w:eastAsia="Times New Roman" w:hAnsi="Times New Roman" w:cs="Times New Roman"/>
+          <w:sz w:val="24"/>
+          <w:szCs w:val="24"/>
+          <w:lang w:bidi="hi-IN"/>
+        </w:rPr>
+        <w:t>On</w:t>
+      </w:r>
+      <w:proofErr w:type="gramEnd"/>
+      <w:r>
+        <w:rPr>
+          <w:rFonts w:ascii="Times New Roman" w:eastAsia="Times New Roman" w:hAnsi="Times New Roman" w:cs="Times New Roman"/>
+          <w:sz w:val="24"/>
+          <w:szCs w:val="24"/>
+          <w:lang w:bidi="hi-IN"/>
+        </w:rPr>
+        <w:t xml:space="preserve"> the same </w:t>
       </w:r>
       <w:proofErr w:type="spellStart"/>
       <w:r>
@@ -6452,7 +5977,6 @@
         <w:t xml:space="preserve"> diagram, draw arrows showing foreign key relationships — e.g., an arrow from </w:t>
       </w:r>
       <w:proofErr w:type="spellStart"/>
-      <w:proofErr w:type="gramStart"/>
       <w:r>
         <w:rPr>
           <w:rFonts w:ascii="Courier New" w:eastAsia="Times New Roman" w:hAnsi="Courier New" w:cs="Courier New"/>
@@ -6460,17 +5984,7 @@
           <w:szCs w:val="20"/>
           <w:lang w:bidi="hi-IN"/>
         </w:rPr>
-        <w:t>attendance.student</w:t>
-      </w:r>
-      <w:proofErr w:type="gramEnd"/>
-      <w:r>
-        <w:rPr>
-          <w:rFonts w:ascii="Courier New" w:eastAsia="Times New Roman" w:hAnsi="Courier New" w:cs="Courier New"/>
-          <w:sz w:val="20"/>
-          <w:szCs w:val="20"/>
-          <w:lang w:bidi="hi-IN"/>
-        </w:rPr>
-        <w:t>_id</w:t>
+        <w:t>attendance.student_id</w:t>
       </w:r>
       <w:proofErr w:type="spellEnd"/>
       <w:r>
@@ -6671,27 +6185,7 @@
           <w:szCs w:val="20"/>
           <w:lang w:bidi="hi-IN"/>
         </w:rPr>
-        <w:t>CREATE</w:t>
-      </w:r>
-      <w:r>
-        <w:rPr>
-          <w:rFonts w:ascii="var(--font-mono)" w:eastAsia="Times New Roman" w:hAnsi="var(--font-mono)" w:cs="Courier New"/>
-          <w:color w:val="14181F"/>
-          <w:sz w:val="20"/>
-          <w:szCs w:val="20"/>
-          <w:lang w:bidi="hi-IN"/>
-        </w:rPr>
-        <w:t xml:space="preserve"> </w:t>
-      </w:r>
-      <w:r>
-        <w:rPr>
-          <w:rFonts w:ascii="var(--font-mono)" w:eastAsia="Times New Roman" w:hAnsi="var(--font-mono)" w:cs="Courier New"/>
-          <w:color w:val="8100C2"/>
-          <w:sz w:val="20"/>
-          <w:szCs w:val="20"/>
-          <w:lang w:bidi="hi-IN"/>
-        </w:rPr>
-        <w:t>TABLE</w:t>
+        <w:t>CREATETABLE</w:t>
       </w:r>
       <w:r>
         <w:rPr>
@@ -6761,47 +6255,7 @@
           <w:szCs w:val="20"/>
           <w:lang w:bidi="hi-IN"/>
         </w:rPr>
-        <w:t>SERIAL</w:t>
-      </w:r>
-      <w:r>
-        <w:rPr>
-          <w:rFonts w:ascii="var(--font-mono)" w:eastAsia="Times New Roman" w:hAnsi="var(--font-mono)" w:cs="Courier New"/>
-          <w:color w:val="14181F"/>
-          <w:sz w:val="20"/>
-          <w:szCs w:val="20"/>
-          <w:lang w:bidi="hi-IN"/>
-        </w:rPr>
-        <w:t xml:space="preserve"> </w:t>
-      </w:r>
-      <w:r>
-        <w:rPr>
-          <w:rFonts w:ascii="var(--font-mono)" w:eastAsia="Times New Roman" w:hAnsi="var(--font-mono)" w:cs="Courier New"/>
-          <w:color w:val="8100C2"/>
-          <w:sz w:val="20"/>
-          <w:szCs w:val="20"/>
-          <w:lang w:bidi="hi-IN"/>
-        </w:rPr>
-        <w:t>PRIMARY</w:t>
-      </w:r>
-      <w:r>
-        <w:rPr>
-          <w:rFonts w:ascii="var(--font-mono)" w:eastAsia="Times New Roman" w:hAnsi="var(--font-mono)" w:cs="Courier New"/>
-          <w:color w:val="14181F"/>
-          <w:sz w:val="20"/>
-          <w:szCs w:val="20"/>
-          <w:lang w:bidi="hi-IN"/>
-        </w:rPr>
-        <w:t xml:space="preserve"> </w:t>
-      </w:r>
-      <w:r>
-        <w:rPr>
-          <w:rFonts w:ascii="var(--font-mono)" w:eastAsia="Times New Roman" w:hAnsi="var(--font-mono)" w:cs="Courier New"/>
-          <w:color w:val="8100C2"/>
-          <w:sz w:val="20"/>
-          <w:szCs w:val="20"/>
-          <w:lang w:bidi="hi-IN"/>
-        </w:rPr>
-        <w:t>KEY</w:t>
+        <w:t>SERIALPRIMARYKEY</w:t>
       </w:r>
       <w:r>
         <w:rPr>
@@ -6851,12 +6305,33 @@
           <w:szCs w:val="20"/>
           <w:lang w:bidi="hi-IN"/>
         </w:rPr>
-        <w:t xml:space="preserve">  name </w:t>
+        <w:t xml:space="preserve">  </w:t>
       </w:r>
       <w:proofErr w:type="gramStart"/>
       <w:r>
         <w:rPr>
           <w:rFonts w:ascii="var(--font-mono)" w:eastAsia="Times New Roman" w:hAnsi="var(--font-mono)" w:cs="Courier New"/>
+          <w:color w:val="14181F"/>
+          <w:sz w:val="20"/>
+          <w:szCs w:val="20"/>
+          <w:lang w:bidi="hi-IN"/>
+        </w:rPr>
+        <w:t>name</w:t>
+      </w:r>
+      <w:proofErr w:type="gramEnd"/>
+      <w:r>
+        <w:rPr>
+          <w:rFonts w:ascii="var(--font-mono)" w:eastAsia="Times New Roman" w:hAnsi="var(--font-mono)" w:cs="Courier New"/>
+          <w:color w:val="14181F"/>
+          <w:sz w:val="20"/>
+          <w:szCs w:val="20"/>
+          <w:lang w:bidi="hi-IN"/>
+        </w:rPr>
+        <w:t xml:space="preserve"> </w:t>
+      </w:r>
+      <w:r>
+        <w:rPr>
+          <w:rFonts w:ascii="var(--font-mono)" w:eastAsia="Times New Roman" w:hAnsi="var(--font-mono)" w:cs="Courier New"/>
           <w:color w:val="8100C2"/>
           <w:sz w:val="20"/>
           <w:szCs w:val="20"/>
@@ -6874,7 +6349,6 @@
         </w:rPr>
         <w:t>(</w:t>
       </w:r>
-      <w:proofErr w:type="gramEnd"/>
       <w:r>
         <w:rPr>
           <w:rFonts w:ascii="var(--font-mono)" w:eastAsia="Times New Roman" w:hAnsi="var(--font-mono)" w:cs="Courier New"/>
@@ -6993,12 +6467,33 @@
           <w:szCs w:val="20"/>
           <w:lang w:bidi="hi-IN"/>
         </w:rPr>
-        <w:t xml:space="preserve">  class </w:t>
+        <w:t xml:space="preserve">  </w:t>
       </w:r>
       <w:proofErr w:type="gramStart"/>
       <w:r>
         <w:rPr>
           <w:rFonts w:ascii="var(--font-mono)" w:eastAsia="Times New Roman" w:hAnsi="var(--font-mono)" w:cs="Courier New"/>
+          <w:color w:val="14181F"/>
+          <w:sz w:val="20"/>
+          <w:szCs w:val="20"/>
+          <w:lang w:bidi="hi-IN"/>
+        </w:rPr>
+        <w:t>class</w:t>
+      </w:r>
+      <w:proofErr w:type="gramEnd"/>
+      <w:r>
+        <w:rPr>
+          <w:rFonts w:ascii="var(--font-mono)" w:eastAsia="Times New Roman" w:hAnsi="var(--font-mono)" w:cs="Courier New"/>
+          <w:color w:val="14181F"/>
+          <w:sz w:val="20"/>
+          <w:szCs w:val="20"/>
+          <w:lang w:bidi="hi-IN"/>
+        </w:rPr>
+        <w:t xml:space="preserve"> </w:t>
+      </w:r>
+      <w:r>
+        <w:rPr>
+          <w:rFonts w:ascii="var(--font-mono)" w:eastAsia="Times New Roman" w:hAnsi="var(--font-mono)" w:cs="Courier New"/>
           <w:color w:val="8100C2"/>
           <w:sz w:val="20"/>
           <w:szCs w:val="20"/>
@@ -7016,7 +6511,6 @@
         </w:rPr>
         <w:t>(</w:t>
       </w:r>
-      <w:proofErr w:type="gramEnd"/>
       <w:r>
         <w:rPr>
           <w:rFonts w:ascii="var(--font-mono)" w:eastAsia="Times New Roman" w:hAnsi="var(--font-mono)" w:cs="Courier New"/>
@@ -7075,12 +6569,33 @@
           <w:szCs w:val="20"/>
           <w:lang w:bidi="hi-IN"/>
         </w:rPr>
-        <w:t xml:space="preserve">  section </w:t>
+        <w:t xml:space="preserve">  </w:t>
       </w:r>
       <w:proofErr w:type="gramStart"/>
       <w:r>
         <w:rPr>
           <w:rFonts w:ascii="var(--font-mono)" w:eastAsia="Times New Roman" w:hAnsi="var(--font-mono)" w:cs="Courier New"/>
+          <w:color w:val="14181F"/>
+          <w:sz w:val="20"/>
+          <w:szCs w:val="20"/>
+          <w:lang w:bidi="hi-IN"/>
+        </w:rPr>
+        <w:t>section</w:t>
+      </w:r>
+      <w:proofErr w:type="gramEnd"/>
+      <w:r>
+        <w:rPr>
+          <w:rFonts w:ascii="var(--font-mono)" w:eastAsia="Times New Roman" w:hAnsi="var(--font-mono)" w:cs="Courier New"/>
+          <w:color w:val="14181F"/>
+          <w:sz w:val="20"/>
+          <w:szCs w:val="20"/>
+          <w:lang w:bidi="hi-IN"/>
+        </w:rPr>
+        <w:t xml:space="preserve"> </w:t>
+      </w:r>
+      <w:r>
+        <w:rPr>
+          <w:rFonts w:ascii="var(--font-mono)" w:eastAsia="Times New Roman" w:hAnsi="var(--font-mono)" w:cs="Courier New"/>
           <w:color w:val="8100C2"/>
           <w:sz w:val="20"/>
           <w:szCs w:val="20"/>
@@ -7098,7 +6613,6 @@
         </w:rPr>
         <w:t>(</w:t>
       </w:r>
-      <w:proofErr w:type="gramEnd"/>
       <w:r>
         <w:rPr>
           <w:rFonts w:ascii="var(--font-mono)" w:eastAsia="Times New Roman" w:hAnsi="var(--font-mono)" w:cs="Courier New"/>
@@ -7149,16 +6663,6 @@
           <w:lang w:bidi="hi-IN"/>
         </w:rPr>
       </w:pPr>
-      <w:r>
-        <w:rPr>
-          <w:rFonts w:ascii="var(--font-mono)" w:eastAsia="Times New Roman" w:hAnsi="var(--font-mono)" w:cs="Courier New"/>
-          <w:color w:val="14181F"/>
-          <w:sz w:val="20"/>
-          <w:szCs w:val="20"/>
-          <w:lang w:bidi="hi-IN"/>
-        </w:rPr>
-        <w:t xml:space="preserve">  </w:t>
-      </w:r>
       <w:proofErr w:type="spellStart"/>
       <w:r>
         <w:rPr>
@@ -7168,30 +6672,30 @@
           <w:szCs w:val="20"/>
           <w:lang w:bidi="hi-IN"/>
         </w:rPr>
-        <w:t>parent_contact</w:t>
+        <w:t>parent_</w:t>
+      </w:r>
+      <w:proofErr w:type="gramStart"/>
+      <w:r>
+        <w:rPr>
+          <w:rFonts w:ascii="var(--font-mono)" w:eastAsia="Times New Roman" w:hAnsi="var(--font-mono)" w:cs="Courier New"/>
+          <w:color w:val="14181F"/>
+          <w:sz w:val="20"/>
+          <w:szCs w:val="20"/>
+          <w:lang w:bidi="hi-IN"/>
+        </w:rPr>
+        <w:t>contact</w:t>
+      </w:r>
+      <w:r>
+        <w:rPr>
+          <w:rFonts w:ascii="var(--font-mono)" w:eastAsia="Times New Roman" w:hAnsi="var(--font-mono)" w:cs="Courier New"/>
+          <w:color w:val="8100C2"/>
+          <w:sz w:val="20"/>
+          <w:szCs w:val="20"/>
+          <w:lang w:bidi="hi-IN"/>
+        </w:rPr>
+        <w:t>VARCHAR</w:t>
       </w:r>
       <w:proofErr w:type="spellEnd"/>
-      <w:r>
-        <w:rPr>
-          <w:rFonts w:ascii="var(--font-mono)" w:eastAsia="Times New Roman" w:hAnsi="var(--font-mono)" w:cs="Courier New"/>
-          <w:color w:val="14181F"/>
-          <w:sz w:val="20"/>
-          <w:szCs w:val="20"/>
-          <w:lang w:bidi="hi-IN"/>
-        </w:rPr>
-        <w:t xml:space="preserve"> </w:t>
-      </w:r>
-      <w:proofErr w:type="gramStart"/>
-      <w:r>
-        <w:rPr>
-          <w:rFonts w:ascii="var(--font-mono)" w:eastAsia="Times New Roman" w:hAnsi="var(--font-mono)" w:cs="Courier New"/>
-          <w:color w:val="8100C2"/>
-          <w:sz w:val="20"/>
-          <w:szCs w:val="20"/>
-          <w:lang w:bidi="hi-IN"/>
-        </w:rPr>
-        <w:t>VARCHAR</w:t>
-      </w:r>
       <w:r>
         <w:rPr>
           <w:rFonts w:ascii="var(--font-mono)" w:eastAsia="Times New Roman" w:hAnsi="var(--font-mono)" w:cs="Courier New"/>
@@ -7293,11 +6797,29 @@
           <w:lang w:bidi="hi-IN"/>
         </w:rPr>
         <w:br/>
-        <w:t xml:space="preserve">Create the </w:t>
       </w:r>
       <w:proofErr w:type="gramStart"/>
       <w:r>
         <w:rPr>
+          <w:rFonts w:ascii="Times New Roman" w:eastAsia="Times New Roman" w:hAnsi="Times New Roman" w:cs="Times New Roman"/>
+          <w:sz w:val="24"/>
+          <w:szCs w:val="24"/>
+          <w:lang w:bidi="hi-IN"/>
+        </w:rPr>
+        <w:t>Create</w:t>
+      </w:r>
+      <w:proofErr w:type="gramEnd"/>
+      <w:r>
+        <w:rPr>
+          <w:rFonts w:ascii="Times New Roman" w:eastAsia="Times New Roman" w:hAnsi="Times New Roman" w:cs="Times New Roman"/>
+          <w:sz w:val="24"/>
+          <w:szCs w:val="24"/>
+          <w:lang w:bidi="hi-IN"/>
+        </w:rPr>
+        <w:t xml:space="preserve"> the </w:t>
+      </w:r>
+      <w:r>
+        <w:rPr>
           <w:rFonts w:ascii="Courier New" w:eastAsia="Times New Roman" w:hAnsi="Courier New" w:cs="Courier New"/>
           <w:sz w:val="20"/>
           <w:szCs w:val="20"/>
@@ -7305,7 +6827,6 @@
         </w:rPr>
         <w:t>teachers</w:t>
       </w:r>
-      <w:proofErr w:type="gramEnd"/>
       <w:r>
         <w:rPr>
           <w:rFonts w:ascii="Times New Roman" w:eastAsia="Times New Roman" w:hAnsi="Times New Roman" w:cs="Times New Roman"/>
@@ -7375,27 +6896,7 @@
           <w:szCs w:val="20"/>
           <w:lang w:bidi="hi-IN"/>
         </w:rPr>
-        <w:t>CREATE</w:t>
-      </w:r>
-      <w:r>
-        <w:rPr>
-          <w:rFonts w:ascii="var(--font-mono)" w:eastAsia="Times New Roman" w:hAnsi="var(--font-mono)" w:cs="Courier New"/>
-          <w:color w:val="14181F"/>
-          <w:sz w:val="20"/>
-          <w:szCs w:val="20"/>
-          <w:lang w:bidi="hi-IN"/>
-        </w:rPr>
-        <w:t xml:space="preserve"> </w:t>
-      </w:r>
-      <w:r>
-        <w:rPr>
-          <w:rFonts w:ascii="var(--font-mono)" w:eastAsia="Times New Roman" w:hAnsi="var(--font-mono)" w:cs="Courier New"/>
-          <w:color w:val="8100C2"/>
-          <w:sz w:val="20"/>
-          <w:szCs w:val="20"/>
-          <w:lang w:bidi="hi-IN"/>
-        </w:rPr>
-        <w:t>TABLE</w:t>
+        <w:t>CREATETABLE</w:t>
       </w:r>
       <w:r>
         <w:rPr>
@@ -7465,47 +6966,7 @@
           <w:szCs w:val="20"/>
           <w:lang w:bidi="hi-IN"/>
         </w:rPr>
-        <w:t>SERIAL</w:t>
-      </w:r>
-      <w:r>
-        <w:rPr>
-          <w:rFonts w:ascii="var(--font-mono)" w:eastAsia="Times New Roman" w:hAnsi="var(--font-mono)" w:cs="Courier New"/>
-          <w:color w:val="14181F"/>
-          <w:sz w:val="20"/>
-          <w:szCs w:val="20"/>
-          <w:lang w:bidi="hi-IN"/>
-        </w:rPr>
-        <w:t xml:space="preserve"> </w:t>
-      </w:r>
-      <w:r>
-        <w:rPr>
-          <w:rFonts w:ascii="var(--font-mono)" w:eastAsia="Times New Roman" w:hAnsi="var(--font-mono)" w:cs="Courier New"/>
-          <w:color w:val="8100C2"/>
-          <w:sz w:val="20"/>
-          <w:szCs w:val="20"/>
-          <w:lang w:bidi="hi-IN"/>
-        </w:rPr>
-        <w:t>PRIMARY</w:t>
-      </w:r>
-      <w:r>
-        <w:rPr>
-          <w:rFonts w:ascii="var(--font-mono)" w:eastAsia="Times New Roman" w:hAnsi="var(--font-mono)" w:cs="Courier New"/>
-          <w:color w:val="14181F"/>
-          <w:sz w:val="20"/>
-          <w:szCs w:val="20"/>
-          <w:lang w:bidi="hi-IN"/>
-        </w:rPr>
-        <w:t xml:space="preserve"> </w:t>
-      </w:r>
-      <w:r>
-        <w:rPr>
-          <w:rFonts w:ascii="var(--font-mono)" w:eastAsia="Times New Roman" w:hAnsi="var(--font-mono)" w:cs="Courier New"/>
-          <w:color w:val="8100C2"/>
-          <w:sz w:val="20"/>
-          <w:szCs w:val="20"/>
-          <w:lang w:bidi="hi-IN"/>
-        </w:rPr>
-        <w:t>KEY</w:t>
+        <w:t>SERIALPRIMARYKEY</w:t>
       </w:r>
       <w:r>
         <w:rPr>
@@ -7555,12 +7016,33 @@
           <w:szCs w:val="20"/>
           <w:lang w:bidi="hi-IN"/>
         </w:rPr>
-        <w:t xml:space="preserve">  name </w:t>
+        <w:t xml:space="preserve">  </w:t>
       </w:r>
       <w:proofErr w:type="gramStart"/>
       <w:r>
         <w:rPr>
           <w:rFonts w:ascii="var(--font-mono)" w:eastAsia="Times New Roman" w:hAnsi="var(--font-mono)" w:cs="Courier New"/>
+          <w:color w:val="14181F"/>
+          <w:sz w:val="20"/>
+          <w:szCs w:val="20"/>
+          <w:lang w:bidi="hi-IN"/>
+        </w:rPr>
+        <w:t>name</w:t>
+      </w:r>
+      <w:proofErr w:type="gramEnd"/>
+      <w:r>
+        <w:rPr>
+          <w:rFonts w:ascii="var(--font-mono)" w:eastAsia="Times New Roman" w:hAnsi="var(--font-mono)" w:cs="Courier New"/>
+          <w:color w:val="14181F"/>
+          <w:sz w:val="20"/>
+          <w:szCs w:val="20"/>
+          <w:lang w:bidi="hi-IN"/>
+        </w:rPr>
+        <w:t xml:space="preserve"> </w:t>
+      </w:r>
+      <w:r>
+        <w:rPr>
+          <w:rFonts w:ascii="var(--font-mono)" w:eastAsia="Times New Roman" w:hAnsi="var(--font-mono)" w:cs="Courier New"/>
           <w:color w:val="8100C2"/>
           <w:sz w:val="20"/>
           <w:szCs w:val="20"/>
@@ -7578,7 +7060,6 @@
         </w:rPr>
         <w:t>(</w:t>
       </w:r>
-      <w:proofErr w:type="gramEnd"/>
       <w:r>
         <w:rPr>
           <w:rFonts w:ascii="var(--font-mono)" w:eastAsia="Times New Roman" w:hAnsi="var(--font-mono)" w:cs="Courier New"/>
@@ -7637,12 +7118,33 @@
           <w:szCs w:val="20"/>
           <w:lang w:bidi="hi-IN"/>
         </w:rPr>
-        <w:t xml:space="preserve">  subject </w:t>
+        <w:t xml:space="preserve">  </w:t>
       </w:r>
       <w:proofErr w:type="gramStart"/>
       <w:r>
         <w:rPr>
           <w:rFonts w:ascii="var(--font-mono)" w:eastAsia="Times New Roman" w:hAnsi="var(--font-mono)" w:cs="Courier New"/>
+          <w:color w:val="14181F"/>
+          <w:sz w:val="20"/>
+          <w:szCs w:val="20"/>
+          <w:lang w:bidi="hi-IN"/>
+        </w:rPr>
+        <w:t>subject</w:t>
+      </w:r>
+      <w:proofErr w:type="gramEnd"/>
+      <w:r>
+        <w:rPr>
+          <w:rFonts w:ascii="var(--font-mono)" w:eastAsia="Times New Roman" w:hAnsi="var(--font-mono)" w:cs="Courier New"/>
+          <w:color w:val="14181F"/>
+          <w:sz w:val="20"/>
+          <w:szCs w:val="20"/>
+          <w:lang w:bidi="hi-IN"/>
+        </w:rPr>
+        <w:t xml:space="preserve"> </w:t>
+      </w:r>
+      <w:r>
+        <w:rPr>
+          <w:rFonts w:ascii="var(--font-mono)" w:eastAsia="Times New Roman" w:hAnsi="var(--font-mono)" w:cs="Courier New"/>
           <w:color w:val="8100C2"/>
           <w:sz w:val="20"/>
           <w:szCs w:val="20"/>
@@ -7660,7 +7162,6 @@
         </w:rPr>
         <w:t>(</w:t>
       </w:r>
-      <w:proofErr w:type="gramEnd"/>
       <w:r>
         <w:rPr>
           <w:rFonts w:ascii="var(--font-mono)" w:eastAsia="Times New Roman" w:hAnsi="var(--font-mono)" w:cs="Courier New"/>
@@ -7719,12 +7220,33 @@
           <w:szCs w:val="20"/>
           <w:lang w:bidi="hi-IN"/>
         </w:rPr>
-        <w:t xml:space="preserve">  contact </w:t>
+        <w:t xml:space="preserve">  </w:t>
       </w:r>
       <w:proofErr w:type="gramStart"/>
       <w:r>
         <w:rPr>
           <w:rFonts w:ascii="var(--font-mono)" w:eastAsia="Times New Roman" w:hAnsi="var(--font-mono)" w:cs="Courier New"/>
+          <w:color w:val="14181F"/>
+          <w:sz w:val="20"/>
+          <w:szCs w:val="20"/>
+          <w:lang w:bidi="hi-IN"/>
+        </w:rPr>
+        <w:t>contact</w:t>
+      </w:r>
+      <w:proofErr w:type="gramEnd"/>
+      <w:r>
+        <w:rPr>
+          <w:rFonts w:ascii="var(--font-mono)" w:eastAsia="Times New Roman" w:hAnsi="var(--font-mono)" w:cs="Courier New"/>
+          <w:color w:val="14181F"/>
+          <w:sz w:val="20"/>
+          <w:szCs w:val="20"/>
+          <w:lang w:bidi="hi-IN"/>
+        </w:rPr>
+        <w:t xml:space="preserve"> </w:t>
+      </w:r>
+      <w:r>
+        <w:rPr>
+          <w:rFonts w:ascii="var(--font-mono)" w:eastAsia="Times New Roman" w:hAnsi="var(--font-mono)" w:cs="Courier New"/>
           <w:color w:val="8100C2"/>
           <w:sz w:val="20"/>
           <w:szCs w:val="20"/>
@@ -7742,7 +7264,6 @@
         </w:rPr>
         <w:t>(</w:t>
       </w:r>
-      <w:proofErr w:type="gramEnd"/>
       <w:r>
         <w:rPr>
           <w:rFonts w:ascii="var(--font-mono)" w:eastAsia="Times New Roman" w:hAnsi="var(--font-mono)" w:cs="Courier New"/>
@@ -7913,27 +7434,7 @@
           <w:szCs w:val="20"/>
           <w:lang w:bidi="hi-IN"/>
         </w:rPr>
-        <w:t>CREATE</w:t>
-      </w:r>
-      <w:r>
-        <w:rPr>
-          <w:rFonts w:ascii="var(--font-mono)" w:eastAsia="Times New Roman" w:hAnsi="var(--font-mono)" w:cs="Courier New"/>
-          <w:color w:val="14181F"/>
-          <w:sz w:val="20"/>
-          <w:szCs w:val="20"/>
-          <w:lang w:bidi="hi-IN"/>
-        </w:rPr>
-        <w:t xml:space="preserve"> </w:t>
-      </w:r>
-      <w:r>
-        <w:rPr>
-          <w:rFonts w:ascii="var(--font-mono)" w:eastAsia="Times New Roman" w:hAnsi="var(--font-mono)" w:cs="Courier New"/>
-          <w:color w:val="8100C2"/>
-          <w:sz w:val="20"/>
-          <w:szCs w:val="20"/>
-          <w:lang w:bidi="hi-IN"/>
-        </w:rPr>
-        <w:t>TABLE</w:t>
+        <w:t>CREATETABLE</w:t>
       </w:r>
       <w:r>
         <w:rPr>
@@ -8003,47 +7504,7 @@
           <w:szCs w:val="20"/>
           <w:lang w:bidi="hi-IN"/>
         </w:rPr>
-        <w:t>SERIAL</w:t>
-      </w:r>
-      <w:r>
-        <w:rPr>
-          <w:rFonts w:ascii="var(--font-mono)" w:eastAsia="Times New Roman" w:hAnsi="var(--font-mono)" w:cs="Courier New"/>
-          <w:color w:val="14181F"/>
-          <w:sz w:val="20"/>
-          <w:szCs w:val="20"/>
-          <w:lang w:bidi="hi-IN"/>
-        </w:rPr>
-        <w:t xml:space="preserve"> </w:t>
-      </w:r>
-      <w:r>
-        <w:rPr>
-          <w:rFonts w:ascii="var(--font-mono)" w:eastAsia="Times New Roman" w:hAnsi="var(--font-mono)" w:cs="Courier New"/>
-          <w:color w:val="8100C2"/>
-          <w:sz w:val="20"/>
-          <w:szCs w:val="20"/>
-          <w:lang w:bidi="hi-IN"/>
-        </w:rPr>
-        <w:t>PRIMARY</w:t>
-      </w:r>
-      <w:r>
-        <w:rPr>
-          <w:rFonts w:ascii="var(--font-mono)" w:eastAsia="Times New Roman" w:hAnsi="var(--font-mono)" w:cs="Courier New"/>
-          <w:color w:val="14181F"/>
-          <w:sz w:val="20"/>
-          <w:szCs w:val="20"/>
-          <w:lang w:bidi="hi-IN"/>
-        </w:rPr>
-        <w:t xml:space="preserve"> </w:t>
-      </w:r>
-      <w:r>
-        <w:rPr>
-          <w:rFonts w:ascii="var(--font-mono)" w:eastAsia="Times New Roman" w:hAnsi="var(--font-mono)" w:cs="Courier New"/>
-          <w:color w:val="8100C2"/>
-          <w:sz w:val="20"/>
-          <w:szCs w:val="20"/>
-          <w:lang w:bidi="hi-IN"/>
-        </w:rPr>
-        <w:t>KEY</w:t>
+        <w:t>SERIALPRIMARYKEY</w:t>
       </w:r>
       <w:r>
         <w:rPr>
@@ -8085,16 +7546,6 @@
           <w:lang w:bidi="hi-IN"/>
         </w:rPr>
       </w:pPr>
-      <w:r>
-        <w:rPr>
-          <w:rFonts w:ascii="var(--font-mono)" w:eastAsia="Times New Roman" w:hAnsi="var(--font-mono)" w:cs="Courier New"/>
-          <w:color w:val="14181F"/>
-          <w:sz w:val="20"/>
-          <w:szCs w:val="20"/>
-          <w:lang w:bidi="hi-IN"/>
-        </w:rPr>
-        <w:t xml:space="preserve">  </w:t>
-      </w:r>
       <w:proofErr w:type="spellStart"/>
       <w:r>
         <w:rPr>
@@ -8106,47 +7557,17 @@
         </w:rPr>
         <w:t>student_id</w:t>
       </w:r>
+      <w:r>
+        <w:rPr>
+          <w:rFonts w:ascii="var(--font-mono)" w:eastAsia="Times New Roman" w:hAnsi="var(--font-mono)" w:cs="Courier New"/>
+          <w:color w:val="8100C2"/>
+          <w:sz w:val="20"/>
+          <w:szCs w:val="20"/>
+          <w:lang w:bidi="hi-IN"/>
+        </w:rPr>
+        <w:t>INTEGERREFERENCES</w:t>
+      </w:r>
       <w:proofErr w:type="spellEnd"/>
-      <w:r>
-        <w:rPr>
-          <w:rFonts w:ascii="var(--font-mono)" w:eastAsia="Times New Roman" w:hAnsi="var(--font-mono)" w:cs="Courier New"/>
-          <w:color w:val="14181F"/>
-          <w:sz w:val="20"/>
-          <w:szCs w:val="20"/>
-          <w:lang w:bidi="hi-IN"/>
-        </w:rPr>
-        <w:t xml:space="preserve"> </w:t>
-      </w:r>
-      <w:r>
-        <w:rPr>
-          <w:rFonts w:ascii="var(--font-mono)" w:eastAsia="Times New Roman" w:hAnsi="var(--font-mono)" w:cs="Courier New"/>
-          <w:color w:val="8100C2"/>
-          <w:sz w:val="20"/>
-          <w:szCs w:val="20"/>
-          <w:lang w:bidi="hi-IN"/>
-        </w:rPr>
-        <w:t>INTEGER</w:t>
-      </w:r>
-      <w:r>
-        <w:rPr>
-          <w:rFonts w:ascii="var(--font-mono)" w:eastAsia="Times New Roman" w:hAnsi="var(--font-mono)" w:cs="Courier New"/>
-          <w:color w:val="14181F"/>
-          <w:sz w:val="20"/>
-          <w:szCs w:val="20"/>
-          <w:lang w:bidi="hi-IN"/>
-        </w:rPr>
-        <w:t xml:space="preserve"> </w:t>
-      </w:r>
-      <w:r>
-        <w:rPr>
-          <w:rFonts w:ascii="var(--font-mono)" w:eastAsia="Times New Roman" w:hAnsi="var(--font-mono)" w:cs="Courier New"/>
-          <w:color w:val="8100C2"/>
-          <w:sz w:val="20"/>
-          <w:szCs w:val="20"/>
-          <w:lang w:bidi="hi-IN"/>
-        </w:rPr>
-        <w:t>REFERENCES</w:t>
-      </w:r>
       <w:r>
         <w:rPr>
           <w:rFonts w:ascii="var(--font-mono)" w:eastAsia="Times New Roman" w:hAnsi="var(--font-mono)" w:cs="Courier New"/>
@@ -8217,16 +7638,7 @@
           <w:lang w:bidi="hi-IN"/>
         </w:rPr>
       </w:pPr>
-      <w:r>
-        <w:rPr>
-          <w:rFonts w:ascii="var(--font-mono)" w:eastAsia="Times New Roman" w:hAnsi="var(--font-mono)" w:cs="Courier New"/>
-          <w:color w:val="14181F"/>
-          <w:sz w:val="20"/>
-          <w:szCs w:val="20"/>
-          <w:lang w:bidi="hi-IN"/>
-        </w:rPr>
-        <w:t xml:space="preserve">  </w:t>
-      </w:r>
+      <w:proofErr w:type="spellStart"/>
       <w:r>
         <w:rPr>
           <w:rFonts w:ascii="var(--font-mono)" w:eastAsia="Times New Roman" w:hAnsi="var(--font-mono)" w:cs="Courier New"/>
@@ -8235,28 +7647,7 @@
           <w:szCs w:val="20"/>
           <w:lang w:bidi="hi-IN"/>
         </w:rPr>
-        <w:t>date</w:t>
-      </w:r>
-      <w:r>
-        <w:rPr>
-          <w:rFonts w:ascii="var(--font-mono)" w:eastAsia="Times New Roman" w:hAnsi="var(--font-mono)" w:cs="Courier New"/>
-          <w:color w:val="14181F"/>
-          <w:sz w:val="20"/>
-          <w:szCs w:val="20"/>
-          <w:lang w:bidi="hi-IN"/>
-        </w:rPr>
-        <w:t xml:space="preserve"> </w:t>
-      </w:r>
-      <w:proofErr w:type="spellStart"/>
-      <w:r>
-        <w:rPr>
-          <w:rFonts w:ascii="var(--font-mono)" w:eastAsia="Times New Roman" w:hAnsi="var(--font-mono)" w:cs="Courier New"/>
-          <w:color w:val="8100C2"/>
-          <w:sz w:val="20"/>
-          <w:szCs w:val="20"/>
-          <w:lang w:bidi="hi-IN"/>
-        </w:rPr>
-        <w:t>DATE</w:t>
+        <w:t>dateDATE</w:t>
       </w:r>
       <w:proofErr w:type="spellEnd"/>
       <w:r>
@@ -8299,16 +7690,7 @@
           <w:lang w:bidi="hi-IN"/>
         </w:rPr>
       </w:pPr>
-      <w:r>
-        <w:rPr>
-          <w:rFonts w:ascii="var(--font-mono)" w:eastAsia="Times New Roman" w:hAnsi="var(--font-mono)" w:cs="Courier New"/>
-          <w:color w:val="14181F"/>
-          <w:sz w:val="20"/>
-          <w:szCs w:val="20"/>
-          <w:lang w:bidi="hi-IN"/>
-        </w:rPr>
-        <w:t xml:space="preserve">  </w:t>
-      </w:r>
+      <w:proofErr w:type="gramStart"/>
       <w:r>
         <w:rPr>
           <w:rFonts w:ascii="var(--font-mono)" w:eastAsia="Times New Roman" w:hAnsi="var(--font-mono)" w:cs="Courier New"/>
@@ -8317,28 +7699,7 @@
           <w:szCs w:val="20"/>
           <w:lang w:bidi="hi-IN"/>
         </w:rPr>
-        <w:t>status</w:t>
-      </w:r>
-      <w:r>
-        <w:rPr>
-          <w:rFonts w:ascii="var(--font-mono)" w:eastAsia="Times New Roman" w:hAnsi="var(--font-mono)" w:cs="Courier New"/>
-          <w:color w:val="14181F"/>
-          <w:sz w:val="20"/>
-          <w:szCs w:val="20"/>
-          <w:lang w:bidi="hi-IN"/>
-        </w:rPr>
-        <w:t xml:space="preserve"> </w:t>
-      </w:r>
-      <w:proofErr w:type="gramStart"/>
-      <w:r>
-        <w:rPr>
-          <w:rFonts w:ascii="var(--font-mono)" w:eastAsia="Times New Roman" w:hAnsi="var(--font-mono)" w:cs="Courier New"/>
-          <w:color w:val="8100C2"/>
-          <w:sz w:val="20"/>
-          <w:szCs w:val="20"/>
-          <w:lang w:bidi="hi-IN"/>
-        </w:rPr>
-        <w:t>VARCHAR</w:t>
+        <w:t>statusVARCHAR</w:t>
       </w:r>
       <w:r>
         <w:rPr>
@@ -8573,27 +7934,7 @@
           <w:szCs w:val="20"/>
           <w:lang w:bidi="hi-IN"/>
         </w:rPr>
-        <w:t>CREATE</w:t>
-      </w:r>
-      <w:r>
-        <w:rPr>
-          <w:rFonts w:ascii="var(--font-mono)" w:eastAsia="Times New Roman" w:hAnsi="var(--font-mono)" w:cs="Courier New"/>
-          <w:color w:val="14181F"/>
-          <w:sz w:val="20"/>
-          <w:szCs w:val="20"/>
-          <w:lang w:bidi="hi-IN"/>
-        </w:rPr>
-        <w:t xml:space="preserve"> </w:t>
-      </w:r>
-      <w:r>
-        <w:rPr>
-          <w:rFonts w:ascii="var(--font-mono)" w:eastAsia="Times New Roman" w:hAnsi="var(--font-mono)" w:cs="Courier New"/>
-          <w:color w:val="8100C2"/>
-          <w:sz w:val="20"/>
-          <w:szCs w:val="20"/>
-          <w:lang w:bidi="hi-IN"/>
-        </w:rPr>
-        <w:t>TABLE</w:t>
+        <w:t>CREATETABLE</w:t>
       </w:r>
       <w:r>
         <w:rPr>
@@ -8663,47 +8004,7 @@
           <w:szCs w:val="20"/>
           <w:lang w:bidi="hi-IN"/>
         </w:rPr>
-        <w:t>SERIAL</w:t>
-      </w:r>
-      <w:r>
-        <w:rPr>
-          <w:rFonts w:ascii="var(--font-mono)" w:eastAsia="Times New Roman" w:hAnsi="var(--font-mono)" w:cs="Courier New"/>
-          <w:color w:val="14181F"/>
-          <w:sz w:val="20"/>
-          <w:szCs w:val="20"/>
-          <w:lang w:bidi="hi-IN"/>
-        </w:rPr>
-        <w:t xml:space="preserve"> </w:t>
-      </w:r>
-      <w:r>
-        <w:rPr>
-          <w:rFonts w:ascii="var(--font-mono)" w:eastAsia="Times New Roman" w:hAnsi="var(--font-mono)" w:cs="Courier New"/>
-          <w:color w:val="8100C2"/>
-          <w:sz w:val="20"/>
-          <w:szCs w:val="20"/>
-          <w:lang w:bidi="hi-IN"/>
-        </w:rPr>
-        <w:t>PRIMARY</w:t>
-      </w:r>
-      <w:r>
-        <w:rPr>
-          <w:rFonts w:ascii="var(--font-mono)" w:eastAsia="Times New Roman" w:hAnsi="var(--font-mono)" w:cs="Courier New"/>
-          <w:color w:val="14181F"/>
-          <w:sz w:val="20"/>
-          <w:szCs w:val="20"/>
-          <w:lang w:bidi="hi-IN"/>
-        </w:rPr>
-        <w:t xml:space="preserve"> </w:t>
-      </w:r>
-      <w:r>
-        <w:rPr>
-          <w:rFonts w:ascii="var(--font-mono)" w:eastAsia="Times New Roman" w:hAnsi="var(--font-mono)" w:cs="Courier New"/>
-          <w:color w:val="8100C2"/>
-          <w:sz w:val="20"/>
-          <w:szCs w:val="20"/>
-          <w:lang w:bidi="hi-IN"/>
-        </w:rPr>
-        <w:t>KEY</w:t>
+        <w:t>SERIALPRIMARYKEY</w:t>
       </w:r>
       <w:r>
         <w:rPr>
@@ -8745,16 +8046,6 @@
           <w:lang w:bidi="hi-IN"/>
         </w:rPr>
       </w:pPr>
-      <w:r>
-        <w:rPr>
-          <w:rFonts w:ascii="var(--font-mono)" w:eastAsia="Times New Roman" w:hAnsi="var(--font-mono)" w:cs="Courier New"/>
-          <w:color w:val="14181F"/>
-          <w:sz w:val="20"/>
-          <w:szCs w:val="20"/>
-          <w:lang w:bidi="hi-IN"/>
-        </w:rPr>
-        <w:t xml:space="preserve">  </w:t>
-      </w:r>
       <w:proofErr w:type="spellStart"/>
       <w:r>
         <w:rPr>
@@ -8766,47 +8057,17 @@
         </w:rPr>
         <w:t>student_id</w:t>
       </w:r>
+      <w:r>
+        <w:rPr>
+          <w:rFonts w:ascii="var(--font-mono)" w:eastAsia="Times New Roman" w:hAnsi="var(--font-mono)" w:cs="Courier New"/>
+          <w:color w:val="8100C2"/>
+          <w:sz w:val="20"/>
+          <w:szCs w:val="20"/>
+          <w:lang w:bidi="hi-IN"/>
+        </w:rPr>
+        <w:t>INTEGERREFERENCES</w:t>
+      </w:r>
       <w:proofErr w:type="spellEnd"/>
-      <w:r>
-        <w:rPr>
-          <w:rFonts w:ascii="var(--font-mono)" w:eastAsia="Times New Roman" w:hAnsi="var(--font-mono)" w:cs="Courier New"/>
-          <w:color w:val="14181F"/>
-          <w:sz w:val="20"/>
-          <w:szCs w:val="20"/>
-          <w:lang w:bidi="hi-IN"/>
-        </w:rPr>
-        <w:t xml:space="preserve"> </w:t>
-      </w:r>
-      <w:r>
-        <w:rPr>
-          <w:rFonts w:ascii="var(--font-mono)" w:eastAsia="Times New Roman" w:hAnsi="var(--font-mono)" w:cs="Courier New"/>
-          <w:color w:val="8100C2"/>
-          <w:sz w:val="20"/>
-          <w:szCs w:val="20"/>
-          <w:lang w:bidi="hi-IN"/>
-        </w:rPr>
-        <w:t>INTEGER</w:t>
-      </w:r>
-      <w:r>
-        <w:rPr>
-          <w:rFonts w:ascii="var(--font-mono)" w:eastAsia="Times New Roman" w:hAnsi="var(--font-mono)" w:cs="Courier New"/>
-          <w:color w:val="14181F"/>
-          <w:sz w:val="20"/>
-          <w:szCs w:val="20"/>
-          <w:lang w:bidi="hi-IN"/>
-        </w:rPr>
-        <w:t xml:space="preserve"> </w:t>
-      </w:r>
-      <w:r>
-        <w:rPr>
-          <w:rFonts w:ascii="var(--font-mono)" w:eastAsia="Times New Roman" w:hAnsi="var(--font-mono)" w:cs="Courier New"/>
-          <w:color w:val="8100C2"/>
-          <w:sz w:val="20"/>
-          <w:szCs w:val="20"/>
-          <w:lang w:bidi="hi-IN"/>
-        </w:rPr>
-        <w:t>REFERENCES</w:t>
-      </w:r>
       <w:r>
         <w:rPr>
           <w:rFonts w:ascii="var(--font-mono)" w:eastAsia="Times New Roman" w:hAnsi="var(--font-mono)" w:cs="Courier New"/>
@@ -8937,16 +8198,6 @@
           <w:lang w:bidi="hi-IN"/>
         </w:rPr>
       </w:pPr>
-      <w:r>
-        <w:rPr>
-          <w:rFonts w:ascii="var(--font-mono)" w:eastAsia="Times New Roman" w:hAnsi="var(--font-mono)" w:cs="Courier New"/>
-          <w:color w:val="14181F"/>
-          <w:sz w:val="20"/>
-          <w:szCs w:val="20"/>
-          <w:lang w:bidi="hi-IN"/>
-        </w:rPr>
-        <w:t xml:space="preserve">  </w:t>
-      </w:r>
       <w:proofErr w:type="spellStart"/>
       <w:r>
         <w:rPr>
@@ -8958,27 +8209,17 @@
         </w:rPr>
         <w:t>due_date</w:t>
       </w:r>
+      <w:r>
+        <w:rPr>
+          <w:rFonts w:ascii="var(--font-mono)" w:eastAsia="Times New Roman" w:hAnsi="var(--font-mono)" w:cs="Courier New"/>
+          <w:color w:val="8100C2"/>
+          <w:sz w:val="20"/>
+          <w:szCs w:val="20"/>
+          <w:lang w:bidi="hi-IN"/>
+        </w:rPr>
+        <w:t>DATE</w:t>
+      </w:r>
       <w:proofErr w:type="spellEnd"/>
-      <w:r>
-        <w:rPr>
-          <w:rFonts w:ascii="var(--font-mono)" w:eastAsia="Times New Roman" w:hAnsi="var(--font-mono)" w:cs="Courier New"/>
-          <w:color w:val="14181F"/>
-          <w:sz w:val="20"/>
-          <w:szCs w:val="20"/>
-          <w:lang w:bidi="hi-IN"/>
-        </w:rPr>
-        <w:t xml:space="preserve"> </w:t>
-      </w:r>
-      <w:r>
-        <w:rPr>
-          <w:rFonts w:ascii="var(--font-mono)" w:eastAsia="Times New Roman" w:hAnsi="var(--font-mono)" w:cs="Courier New"/>
-          <w:color w:val="8100C2"/>
-          <w:sz w:val="20"/>
-          <w:szCs w:val="20"/>
-          <w:lang w:bidi="hi-IN"/>
-        </w:rPr>
-        <w:t>DATE</w:t>
-      </w:r>
       <w:r>
         <w:rPr>
           <w:rFonts w:ascii="var(--font-mono)" w:eastAsia="Times New Roman" w:hAnsi="var(--font-mono)" w:cs="Courier New"/>
@@ -9019,16 +8260,6 @@
           <w:lang w:bidi="hi-IN"/>
         </w:rPr>
       </w:pPr>
-      <w:r>
-        <w:rPr>
-          <w:rFonts w:ascii="var(--font-mono)" w:eastAsia="Times New Roman" w:hAnsi="var(--font-mono)" w:cs="Courier New"/>
-          <w:color w:val="14181F"/>
-          <w:sz w:val="20"/>
-          <w:szCs w:val="20"/>
-          <w:lang w:bidi="hi-IN"/>
-        </w:rPr>
-        <w:t xml:space="preserve">  </w:t>
-      </w:r>
       <w:proofErr w:type="spellStart"/>
       <w:r>
         <w:rPr>
@@ -9038,30 +8269,30 @@
           <w:szCs w:val="20"/>
           <w:lang w:bidi="hi-IN"/>
         </w:rPr>
-        <w:t>paid_status</w:t>
+        <w:t>paid_</w:t>
+      </w:r>
+      <w:proofErr w:type="gramStart"/>
+      <w:r>
+        <w:rPr>
+          <w:rFonts w:ascii="var(--font-mono)" w:eastAsia="Times New Roman" w:hAnsi="var(--font-mono)" w:cs="Courier New"/>
+          <w:color w:val="14181F"/>
+          <w:sz w:val="20"/>
+          <w:szCs w:val="20"/>
+          <w:lang w:bidi="hi-IN"/>
+        </w:rPr>
+        <w:t>status</w:t>
+      </w:r>
+      <w:r>
+        <w:rPr>
+          <w:rFonts w:ascii="var(--font-mono)" w:eastAsia="Times New Roman" w:hAnsi="var(--font-mono)" w:cs="Courier New"/>
+          <w:color w:val="8100C2"/>
+          <w:sz w:val="20"/>
+          <w:szCs w:val="20"/>
+          <w:lang w:bidi="hi-IN"/>
+        </w:rPr>
+        <w:t>VARCHAR</w:t>
       </w:r>
       <w:proofErr w:type="spellEnd"/>
-      <w:r>
-        <w:rPr>
-          <w:rFonts w:ascii="var(--font-mono)" w:eastAsia="Times New Roman" w:hAnsi="var(--font-mono)" w:cs="Courier New"/>
-          <w:color w:val="14181F"/>
-          <w:sz w:val="20"/>
-          <w:szCs w:val="20"/>
-          <w:lang w:bidi="hi-IN"/>
-        </w:rPr>
-        <w:t xml:space="preserve"> </w:t>
-      </w:r>
-      <w:proofErr w:type="gramStart"/>
-      <w:r>
-        <w:rPr>
-          <w:rFonts w:ascii="var(--font-mono)" w:eastAsia="Times New Roman" w:hAnsi="var(--font-mono)" w:cs="Courier New"/>
-          <w:color w:val="8100C2"/>
-          <w:sz w:val="20"/>
-          <w:szCs w:val="20"/>
-          <w:lang w:bidi="hi-IN"/>
-        </w:rPr>
-        <w:t>VARCHAR</w:t>
-      </w:r>
       <w:r>
         <w:rPr>
           <w:rFonts w:ascii="var(--font-mono)" w:eastAsia="Times New Roman" w:hAnsi="var(--font-mono)" w:cs="Courier New"/>
@@ -9238,6 +8469,7 @@
           <w:lang w:bidi="hi-IN"/>
         </w:rPr>
       </w:pPr>
+      <w:proofErr w:type="spellStart"/>
       <w:r>
         <w:rPr>
           <w:rFonts w:ascii="var(--font-mono)" w:eastAsia="Times New Roman" w:hAnsi="var(--font-mono)" w:cs="Courier New"/>
@@ -9246,39 +8478,8 @@
           <w:szCs w:val="20"/>
           <w:lang w:bidi="hi-IN"/>
         </w:rPr>
-        <w:t>CREATE</w:t>
-      </w:r>
-      <w:r>
-        <w:rPr>
-          <w:rFonts w:ascii="var(--font-mono)" w:eastAsia="Times New Roman" w:hAnsi="var(--font-mono)" w:cs="Courier New"/>
-          <w:color w:val="14181F"/>
-          <w:sz w:val="20"/>
-          <w:szCs w:val="20"/>
-          <w:lang w:bidi="hi-IN"/>
-        </w:rPr>
-        <w:t xml:space="preserve"> </w:t>
-      </w:r>
-      <w:r>
-        <w:rPr>
-          <w:rFonts w:ascii="var(--font-mono)" w:eastAsia="Times New Roman" w:hAnsi="var(--font-mono)" w:cs="Courier New"/>
-          <w:color w:val="8100C2"/>
-          <w:sz w:val="20"/>
-          <w:szCs w:val="20"/>
-          <w:lang w:bidi="hi-IN"/>
-        </w:rPr>
-        <w:t>TABLE</w:t>
-      </w:r>
-      <w:r>
-        <w:rPr>
-          <w:rFonts w:ascii="var(--font-mono)" w:eastAsia="Times New Roman" w:hAnsi="var(--font-mono)" w:cs="Courier New"/>
-          <w:color w:val="14181F"/>
-          <w:sz w:val="20"/>
-          <w:szCs w:val="20"/>
-          <w:lang w:bidi="hi-IN"/>
-        </w:rPr>
-        <w:t xml:space="preserve"> </w:t>
-      </w:r>
-      <w:proofErr w:type="spellStart"/>
+        <w:t>CREATETABLE</w:t>
+      </w:r>
       <w:r>
         <w:rPr>
           <w:rFonts w:ascii="var(--font-mono)" w:eastAsia="Times New Roman" w:hAnsi="var(--font-mono)" w:cs="Courier New"/>
@@ -9290,16 +8491,6 @@
         <w:t>discipline_logs</w:t>
       </w:r>
       <w:proofErr w:type="spellEnd"/>
-      <w:r>
-        <w:rPr>
-          <w:rFonts w:ascii="var(--font-mono)" w:eastAsia="Times New Roman" w:hAnsi="var(--font-mono)" w:cs="Courier New"/>
-          <w:color w:val="14181F"/>
-          <w:sz w:val="20"/>
-          <w:szCs w:val="20"/>
-          <w:lang w:bidi="hi-IN"/>
-        </w:rPr>
-        <w:t xml:space="preserve"> </w:t>
-      </w:r>
       <w:r>
         <w:rPr>
           <w:rFonts w:ascii="var(--font-mono)" w:eastAsia="Times New Roman" w:hAnsi="var(--font-mono)" w:cs="Courier New"/>
@@ -9358,47 +8549,7 @@
           <w:szCs w:val="20"/>
           <w:lang w:bidi="hi-IN"/>
         </w:rPr>
-        <w:t>SERIAL</w:t>
-      </w:r>
-      <w:r>
-        <w:rPr>
-          <w:rFonts w:ascii="var(--font-mono)" w:eastAsia="Times New Roman" w:hAnsi="var(--font-mono)" w:cs="Courier New"/>
-          <w:color w:val="14181F"/>
-          <w:sz w:val="20"/>
-          <w:szCs w:val="20"/>
-          <w:lang w:bidi="hi-IN"/>
-        </w:rPr>
-        <w:t xml:space="preserve"> </w:t>
-      </w:r>
-      <w:r>
-        <w:rPr>
-          <w:rFonts w:ascii="var(--font-mono)" w:eastAsia="Times New Roman" w:hAnsi="var(--font-mono)" w:cs="Courier New"/>
-          <w:color w:val="8100C2"/>
-          <w:sz w:val="20"/>
-          <w:szCs w:val="20"/>
-          <w:lang w:bidi="hi-IN"/>
-        </w:rPr>
-        <w:t>PRIMARY</w:t>
-      </w:r>
-      <w:r>
-        <w:rPr>
-          <w:rFonts w:ascii="var(--font-mono)" w:eastAsia="Times New Roman" w:hAnsi="var(--font-mono)" w:cs="Courier New"/>
-          <w:color w:val="14181F"/>
-          <w:sz w:val="20"/>
-          <w:szCs w:val="20"/>
-          <w:lang w:bidi="hi-IN"/>
-        </w:rPr>
-        <w:t xml:space="preserve"> </w:t>
-      </w:r>
-      <w:r>
-        <w:rPr>
-          <w:rFonts w:ascii="var(--font-mono)" w:eastAsia="Times New Roman" w:hAnsi="var(--font-mono)" w:cs="Courier New"/>
-          <w:color w:val="8100C2"/>
-          <w:sz w:val="20"/>
-          <w:szCs w:val="20"/>
-          <w:lang w:bidi="hi-IN"/>
-        </w:rPr>
-        <w:t>KEY</w:t>
+        <w:t>SERIALPRIMARYKEY</w:t>
       </w:r>
       <w:r>
         <w:rPr>
@@ -9440,16 +8591,6 @@
           <w:lang w:bidi="hi-IN"/>
         </w:rPr>
       </w:pPr>
-      <w:r>
-        <w:rPr>
-          <w:rFonts w:ascii="var(--font-mono)" w:eastAsia="Times New Roman" w:hAnsi="var(--font-mono)" w:cs="Courier New"/>
-          <w:color w:val="14181F"/>
-          <w:sz w:val="20"/>
-          <w:szCs w:val="20"/>
-          <w:lang w:bidi="hi-IN"/>
-        </w:rPr>
-        <w:t xml:space="preserve">  </w:t>
-      </w:r>
       <w:proofErr w:type="spellStart"/>
       <w:r>
         <w:rPr>
@@ -9461,47 +8602,17 @@
         </w:rPr>
         <w:t>student_id</w:t>
       </w:r>
+      <w:r>
+        <w:rPr>
+          <w:rFonts w:ascii="var(--font-mono)" w:eastAsia="Times New Roman" w:hAnsi="var(--font-mono)" w:cs="Courier New"/>
+          <w:color w:val="8100C2"/>
+          <w:sz w:val="20"/>
+          <w:szCs w:val="20"/>
+          <w:lang w:bidi="hi-IN"/>
+        </w:rPr>
+        <w:t>INTEGERREFERENCES</w:t>
+      </w:r>
       <w:proofErr w:type="spellEnd"/>
-      <w:r>
-        <w:rPr>
-          <w:rFonts w:ascii="var(--font-mono)" w:eastAsia="Times New Roman" w:hAnsi="var(--font-mono)" w:cs="Courier New"/>
-          <w:color w:val="14181F"/>
-          <w:sz w:val="20"/>
-          <w:szCs w:val="20"/>
-          <w:lang w:bidi="hi-IN"/>
-        </w:rPr>
-        <w:t xml:space="preserve"> </w:t>
-      </w:r>
-      <w:r>
-        <w:rPr>
-          <w:rFonts w:ascii="var(--font-mono)" w:eastAsia="Times New Roman" w:hAnsi="var(--font-mono)" w:cs="Courier New"/>
-          <w:color w:val="8100C2"/>
-          <w:sz w:val="20"/>
-          <w:szCs w:val="20"/>
-          <w:lang w:bidi="hi-IN"/>
-        </w:rPr>
-        <w:t>INTEGER</w:t>
-      </w:r>
-      <w:r>
-        <w:rPr>
-          <w:rFonts w:ascii="var(--font-mono)" w:eastAsia="Times New Roman" w:hAnsi="var(--font-mono)" w:cs="Courier New"/>
-          <w:color w:val="14181F"/>
-          <w:sz w:val="20"/>
-          <w:szCs w:val="20"/>
-          <w:lang w:bidi="hi-IN"/>
-        </w:rPr>
-        <w:t xml:space="preserve"> </w:t>
-      </w:r>
-      <w:r>
-        <w:rPr>
-          <w:rFonts w:ascii="var(--font-mono)" w:eastAsia="Times New Roman" w:hAnsi="var(--font-mono)" w:cs="Courier New"/>
-          <w:color w:val="8100C2"/>
-          <w:sz w:val="20"/>
-          <w:szCs w:val="20"/>
-          <w:lang w:bidi="hi-IN"/>
-        </w:rPr>
-        <w:t>REFERENCES</w:t>
-      </w:r>
       <w:r>
         <w:rPr>
           <w:rFonts w:ascii="var(--font-mono)" w:eastAsia="Times New Roman" w:hAnsi="var(--font-mono)" w:cs="Courier New"/>
@@ -9572,16 +8683,7 @@
           <w:lang w:bidi="hi-IN"/>
         </w:rPr>
       </w:pPr>
-      <w:r>
-        <w:rPr>
-          <w:rFonts w:ascii="var(--font-mono)" w:eastAsia="Times New Roman" w:hAnsi="var(--font-mono)" w:cs="Courier New"/>
-          <w:color w:val="14181F"/>
-          <w:sz w:val="20"/>
-          <w:szCs w:val="20"/>
-          <w:lang w:bidi="hi-IN"/>
-        </w:rPr>
-        <w:t xml:space="preserve">  </w:t>
-      </w:r>
+      <w:proofErr w:type="spellStart"/>
       <w:r>
         <w:rPr>
           <w:rFonts w:ascii="var(--font-mono)" w:eastAsia="Times New Roman" w:hAnsi="var(--font-mono)" w:cs="Courier New"/>
@@ -9590,28 +8692,7 @@
           <w:szCs w:val="20"/>
           <w:lang w:bidi="hi-IN"/>
         </w:rPr>
-        <w:t>date</w:t>
-      </w:r>
-      <w:r>
-        <w:rPr>
-          <w:rFonts w:ascii="var(--font-mono)" w:eastAsia="Times New Roman" w:hAnsi="var(--font-mono)" w:cs="Courier New"/>
-          <w:color w:val="14181F"/>
-          <w:sz w:val="20"/>
-          <w:szCs w:val="20"/>
-          <w:lang w:bidi="hi-IN"/>
-        </w:rPr>
-        <w:t xml:space="preserve"> </w:t>
-      </w:r>
-      <w:proofErr w:type="spellStart"/>
-      <w:r>
-        <w:rPr>
-          <w:rFonts w:ascii="var(--font-mono)" w:eastAsia="Times New Roman" w:hAnsi="var(--font-mono)" w:cs="Courier New"/>
-          <w:color w:val="8100C2"/>
-          <w:sz w:val="20"/>
-          <w:szCs w:val="20"/>
-          <w:lang w:bidi="hi-IN"/>
-        </w:rPr>
-        <w:t>DATE</w:t>
+        <w:t>dateDATE</w:t>
       </w:r>
       <w:proofErr w:type="spellEnd"/>
       <w:r>
@@ -9722,12 +8803,33 @@
           <w:szCs w:val="20"/>
           <w:lang w:bidi="hi-IN"/>
         </w:rPr>
-        <w:t xml:space="preserve">  severity </w:t>
+        <w:t xml:space="preserve">  </w:t>
       </w:r>
       <w:proofErr w:type="gramStart"/>
       <w:r>
         <w:rPr>
           <w:rFonts w:ascii="var(--font-mono)" w:eastAsia="Times New Roman" w:hAnsi="var(--font-mono)" w:cs="Courier New"/>
+          <w:color w:val="14181F"/>
+          <w:sz w:val="20"/>
+          <w:szCs w:val="20"/>
+          <w:lang w:bidi="hi-IN"/>
+        </w:rPr>
+        <w:t>severity</w:t>
+      </w:r>
+      <w:proofErr w:type="gramEnd"/>
+      <w:r>
+        <w:rPr>
+          <w:rFonts w:ascii="var(--font-mono)" w:eastAsia="Times New Roman" w:hAnsi="var(--font-mono)" w:cs="Courier New"/>
+          <w:color w:val="14181F"/>
+          <w:sz w:val="20"/>
+          <w:szCs w:val="20"/>
+          <w:lang w:bidi="hi-IN"/>
+        </w:rPr>
+        <w:t xml:space="preserve"> </w:t>
+      </w:r>
+      <w:r>
+        <w:rPr>
+          <w:rFonts w:ascii="var(--font-mono)" w:eastAsia="Times New Roman" w:hAnsi="var(--font-mono)" w:cs="Courier New"/>
           <w:color w:val="8100C2"/>
           <w:sz w:val="20"/>
           <w:szCs w:val="20"/>
@@ -9745,7 +8847,6 @@
         </w:rPr>
         <w:t>(</w:t>
       </w:r>
-      <w:proofErr w:type="gramEnd"/>
       <w:r>
         <w:rPr>
           <w:rFonts w:ascii="var(--font-mono)" w:eastAsia="Times New Roman" w:hAnsi="var(--font-mono)" w:cs="Courier New"/>
@@ -10042,6 +9143,7 @@
           <w:lang w:bidi="hi-IN"/>
         </w:rPr>
       </w:pPr>
+      <w:proofErr w:type="spellStart"/>
       <w:r>
         <w:rPr>
           <w:rFonts w:ascii="var(--font-mono)" w:eastAsia="Times New Roman" w:hAnsi="var(--font-mono)" w:cs="Courier New"/>
@@ -10052,17 +9154,6 @@
         </w:rPr>
         <w:t>SELECT</w:t>
       </w:r>
-      <w:r>
-        <w:rPr>
-          <w:rFonts w:ascii="var(--font-mono)" w:eastAsia="Times New Roman" w:hAnsi="var(--font-mono)" w:cs="Courier New"/>
-          <w:color w:val="14181F"/>
-          <w:sz w:val="20"/>
-          <w:szCs w:val="20"/>
-          <w:lang w:bidi="hi-IN"/>
-        </w:rPr>
-        <w:t xml:space="preserve"> </w:t>
-      </w:r>
-      <w:proofErr w:type="spellStart"/>
       <w:r>
         <w:rPr>
           <w:rFonts w:ascii="var(--font-mono)" w:eastAsia="Times New Roman" w:hAnsi="var(--font-mono)" w:cs="Courier New"/>
@@ -10114,16 +9205,6 @@
           <w:lang w:bidi="hi-IN"/>
         </w:rPr>
       </w:pPr>
-      <w:r>
-        <w:rPr>
-          <w:rFonts w:ascii="var(--font-mono)" w:eastAsia="Times New Roman" w:hAnsi="var(--font-mono)" w:cs="Courier New"/>
-          <w:color w:val="14181F"/>
-          <w:sz w:val="20"/>
-          <w:szCs w:val="20"/>
-          <w:lang w:bidi="hi-IN"/>
-        </w:rPr>
-        <w:t xml:space="preserve">  </w:t>
-      </w:r>
       <w:proofErr w:type="gramStart"/>
       <w:r>
         <w:rPr>
@@ -10194,18 +9275,109 @@
           <w:szCs w:val="20"/>
           <w:lang w:bidi="hi-IN"/>
         </w:rPr>
-        <w:t>WHERE</w:t>
-      </w:r>
-      <w:r>
-        <w:rPr>
-          <w:rFonts w:ascii="var(--font-mono)" w:eastAsia="Times New Roman" w:hAnsi="var(--font-mono)" w:cs="Courier New"/>
-          <w:color w:val="14181F"/>
-          <w:sz w:val="20"/>
-          <w:szCs w:val="20"/>
-          <w:lang w:bidi="hi-IN"/>
-        </w:rPr>
-        <w:t xml:space="preserve"> </w:t>
-      </w:r>
+        <w:t>WHEREstatus</w:t>
+      </w:r>
+      <w:r>
+        <w:rPr>
+          <w:rFonts w:ascii="var(--font-mono)" w:eastAsia="Times New Roman" w:hAnsi="var(--font-mono)" w:cs="Courier New"/>
+          <w:color w:val="14181F"/>
+          <w:sz w:val="20"/>
+          <w:szCs w:val="20"/>
+          <w:lang w:bidi="hi-IN"/>
+        </w:rPr>
+        <w:t>=</w:t>
+      </w:r>
+      <w:r>
+        <w:rPr>
+          <w:rFonts w:ascii="var(--font-mono)" w:eastAsia="Times New Roman" w:hAnsi="var(--font-mono)" w:cs="Courier New"/>
+          <w:color w:val="008000"/>
+          <w:sz w:val="20"/>
+          <w:szCs w:val="20"/>
+          <w:lang w:bidi="hi-IN"/>
+        </w:rPr>
+        <w:t>'present'</w:t>
+      </w:r>
+      <w:r>
+        <w:rPr>
+          <w:rFonts w:ascii="var(--font-mono)" w:eastAsia="Times New Roman" w:hAnsi="var(--font-mono)" w:cs="Courier New"/>
+          <w:color w:val="2B303B"/>
+          <w:sz w:val="20"/>
+          <w:szCs w:val="20"/>
+          <w:lang w:bidi="hi-IN"/>
+        </w:rPr>
+        <w:t>)</w:t>
+      </w:r>
+      <w:r>
+        <w:rPr>
+          <w:rFonts w:ascii="var(--font-mono)" w:eastAsia="Times New Roman" w:hAnsi="var(--font-mono)" w:cs="Courier New"/>
+          <w:color w:val="14181F"/>
+          <w:sz w:val="20"/>
+          <w:szCs w:val="20"/>
+          <w:lang w:bidi="hi-IN"/>
+        </w:rPr>
+        <w:t xml:space="preserve"> * </w:t>
+      </w:r>
+      <w:r>
+        <w:rPr>
+          <w:rFonts w:ascii="var(--font-mono)" w:eastAsia="Times New Roman" w:hAnsi="var(--font-mono)" w:cs="Courier New"/>
+          <w:color w:val="008080"/>
+          <w:sz w:val="20"/>
+          <w:szCs w:val="20"/>
+          <w:lang w:bidi="hi-IN"/>
+        </w:rPr>
+        <w:t>100.0</w:t>
+      </w:r>
+      <w:r>
+        <w:rPr>
+          <w:rFonts w:ascii="var(--font-mono)" w:eastAsia="Times New Roman" w:hAnsi="var(--font-mono)" w:cs="Courier New"/>
+          <w:color w:val="14181F"/>
+          <w:sz w:val="20"/>
+          <w:szCs w:val="20"/>
+          <w:lang w:bidi="hi-IN"/>
+        </w:rPr>
+        <w:t xml:space="preserve"> / </w:t>
+      </w:r>
+      <w:r>
+        <w:rPr>
+          <w:rFonts w:ascii="var(--font-mono)" w:eastAsia="Times New Roman" w:hAnsi="var(--font-mono)" w:cs="Courier New"/>
+          <w:color w:val="0051C2"/>
+          <w:sz w:val="20"/>
+          <w:szCs w:val="20"/>
+          <w:lang w:bidi="hi-IN"/>
+        </w:rPr>
+        <w:t>COUNT</w:t>
+      </w:r>
+      <w:r>
+        <w:rPr>
+          <w:rFonts w:ascii="var(--font-mono)" w:eastAsia="Times New Roman" w:hAnsi="var(--font-mono)" w:cs="Courier New"/>
+          <w:color w:val="2B303B"/>
+          <w:sz w:val="20"/>
+          <w:szCs w:val="20"/>
+          <w:lang w:bidi="hi-IN"/>
+        </w:rPr>
+        <w:t>(</w:t>
+      </w:r>
+      <w:r>
+        <w:rPr>
+          <w:rFonts w:ascii="var(--font-mono)" w:eastAsia="Times New Roman" w:hAnsi="var(--font-mono)" w:cs="Courier New"/>
+          <w:color w:val="14181F"/>
+          <w:sz w:val="20"/>
+          <w:szCs w:val="20"/>
+          <w:lang w:bidi="hi-IN"/>
+        </w:rPr>
+        <w:t>*</w:t>
+      </w:r>
+      <w:r>
+        <w:rPr>
+          <w:rFonts w:ascii="var(--font-mono)" w:eastAsia="Times New Roman" w:hAnsi="var(--font-mono)" w:cs="Courier New"/>
+          <w:color w:val="2B303B"/>
+          <w:sz w:val="20"/>
+          <w:szCs w:val="20"/>
+          <w:lang w:bidi="hi-IN"/>
+        </w:rPr>
+        <w:t>)</w:t>
+      </w:r>
+      <w:proofErr w:type="spellStart"/>
       <w:r>
         <w:rPr>
           <w:rFonts w:ascii="var(--font-mono)" w:eastAsia="Times New Roman" w:hAnsi="var(--font-mono)" w:cs="Courier New"/>
@@ -10214,139 +9386,8 @@
           <w:szCs w:val="20"/>
           <w:lang w:bidi="hi-IN"/>
         </w:rPr>
-        <w:t>status</w:t>
-      </w:r>
-      <w:r>
-        <w:rPr>
-          <w:rFonts w:ascii="var(--font-mono)" w:eastAsia="Times New Roman" w:hAnsi="var(--font-mono)" w:cs="Courier New"/>
-          <w:color w:val="14181F"/>
-          <w:sz w:val="20"/>
-          <w:szCs w:val="20"/>
-          <w:lang w:bidi="hi-IN"/>
-        </w:rPr>
-        <w:t>=</w:t>
-      </w:r>
-      <w:r>
-        <w:rPr>
-          <w:rFonts w:ascii="var(--font-mono)" w:eastAsia="Times New Roman" w:hAnsi="var(--font-mono)" w:cs="Courier New"/>
-          <w:color w:val="008000"/>
-          <w:sz w:val="20"/>
-          <w:szCs w:val="20"/>
-          <w:lang w:bidi="hi-IN"/>
-        </w:rPr>
-        <w:t>'present'</w:t>
-      </w:r>
-      <w:r>
-        <w:rPr>
-          <w:rFonts w:ascii="var(--font-mono)" w:eastAsia="Times New Roman" w:hAnsi="var(--font-mono)" w:cs="Courier New"/>
-          <w:color w:val="2B303B"/>
-          <w:sz w:val="20"/>
-          <w:szCs w:val="20"/>
-          <w:lang w:bidi="hi-IN"/>
-        </w:rPr>
-        <w:t>)</w:t>
-      </w:r>
-      <w:r>
-        <w:rPr>
-          <w:rFonts w:ascii="var(--font-mono)" w:eastAsia="Times New Roman" w:hAnsi="var(--font-mono)" w:cs="Courier New"/>
-          <w:color w:val="14181F"/>
-          <w:sz w:val="20"/>
-          <w:szCs w:val="20"/>
-          <w:lang w:bidi="hi-IN"/>
-        </w:rPr>
-        <w:t xml:space="preserve"> * </w:t>
-      </w:r>
-      <w:r>
-        <w:rPr>
-          <w:rFonts w:ascii="var(--font-mono)" w:eastAsia="Times New Roman" w:hAnsi="var(--font-mono)" w:cs="Courier New"/>
-          <w:color w:val="008080"/>
-          <w:sz w:val="20"/>
-          <w:szCs w:val="20"/>
-          <w:lang w:bidi="hi-IN"/>
-        </w:rPr>
-        <w:t>100.0</w:t>
-      </w:r>
-      <w:r>
-        <w:rPr>
-          <w:rFonts w:ascii="var(--font-mono)" w:eastAsia="Times New Roman" w:hAnsi="var(--font-mono)" w:cs="Courier New"/>
-          <w:color w:val="14181F"/>
-          <w:sz w:val="20"/>
-          <w:szCs w:val="20"/>
-          <w:lang w:bidi="hi-IN"/>
-        </w:rPr>
-        <w:t xml:space="preserve"> / </w:t>
-      </w:r>
-      <w:r>
-        <w:rPr>
-          <w:rFonts w:ascii="var(--font-mono)" w:eastAsia="Times New Roman" w:hAnsi="var(--font-mono)" w:cs="Courier New"/>
-          <w:color w:val="0051C2"/>
-          <w:sz w:val="20"/>
-          <w:szCs w:val="20"/>
-          <w:lang w:bidi="hi-IN"/>
-        </w:rPr>
-        <w:t>COUNT</w:t>
-      </w:r>
-      <w:r>
-        <w:rPr>
-          <w:rFonts w:ascii="var(--font-mono)" w:eastAsia="Times New Roman" w:hAnsi="var(--font-mono)" w:cs="Courier New"/>
-          <w:color w:val="2B303B"/>
-          <w:sz w:val="20"/>
-          <w:szCs w:val="20"/>
-          <w:lang w:bidi="hi-IN"/>
-        </w:rPr>
-        <w:t>(</w:t>
-      </w:r>
-      <w:r>
-        <w:rPr>
-          <w:rFonts w:ascii="var(--font-mono)" w:eastAsia="Times New Roman" w:hAnsi="var(--font-mono)" w:cs="Courier New"/>
-          <w:color w:val="14181F"/>
-          <w:sz w:val="20"/>
-          <w:szCs w:val="20"/>
-          <w:lang w:bidi="hi-IN"/>
-        </w:rPr>
-        <w:t>*</w:t>
-      </w:r>
-      <w:r>
-        <w:rPr>
-          <w:rFonts w:ascii="var(--font-mono)" w:eastAsia="Times New Roman" w:hAnsi="var(--font-mono)" w:cs="Courier New"/>
-          <w:color w:val="2B303B"/>
-          <w:sz w:val="20"/>
-          <w:szCs w:val="20"/>
-          <w:lang w:bidi="hi-IN"/>
-        </w:rPr>
-        <w:t>)</w:t>
-      </w:r>
-      <w:r>
-        <w:rPr>
-          <w:rFonts w:ascii="var(--font-mono)" w:eastAsia="Times New Roman" w:hAnsi="var(--font-mono)" w:cs="Courier New"/>
-          <w:color w:val="14181F"/>
-          <w:sz w:val="20"/>
-          <w:szCs w:val="20"/>
-          <w:lang w:bidi="hi-IN"/>
-        </w:rPr>
-        <w:t xml:space="preserve"> </w:t>
-      </w:r>
-      <w:r>
-        <w:rPr>
-          <w:rFonts w:ascii="var(--font-mono)" w:eastAsia="Times New Roman" w:hAnsi="var(--font-mono)" w:cs="Courier New"/>
-          <w:color w:val="8100C2"/>
-          <w:sz w:val="20"/>
-          <w:szCs w:val="20"/>
-          <w:lang w:bidi="hi-IN"/>
-        </w:rPr>
         <w:t>AS</w:t>
       </w:r>
-      <w:r>
-        <w:rPr>
-          <w:rFonts w:ascii="var(--font-mono)" w:eastAsia="Times New Roman" w:hAnsi="var(--font-mono)" w:cs="Courier New"/>
-          <w:color w:val="14181F"/>
-          <w:sz w:val="20"/>
-          <w:szCs w:val="20"/>
-          <w:lang w:bidi="hi-IN"/>
-        </w:rPr>
-        <w:t xml:space="preserve"> </w:t>
-      </w:r>
-      <w:proofErr w:type="spellStart"/>
       <w:r>
         <w:rPr>
           <w:rFonts w:ascii="var(--font-mono)" w:eastAsia="Times New Roman" w:hAnsi="var(--font-mono)" w:cs="Courier New"/>
@@ -10408,6 +9449,7 @@
         </w:rPr>
         <w:t xml:space="preserve"> attendance </w:t>
       </w:r>
+      <w:proofErr w:type="spellStart"/>
       <w:r>
         <w:rPr>
           <w:rFonts w:ascii="var(--font-mono)" w:eastAsia="Times New Roman" w:hAnsi="var(--font-mono)" w:cs="Courier New"/>
@@ -10416,39 +9458,8 @@
           <w:szCs w:val="20"/>
           <w:lang w:bidi="hi-IN"/>
         </w:rPr>
-        <w:t>GROUP</w:t>
-      </w:r>
-      <w:r>
-        <w:rPr>
-          <w:rFonts w:ascii="var(--font-mono)" w:eastAsia="Times New Roman" w:hAnsi="var(--font-mono)" w:cs="Courier New"/>
-          <w:color w:val="14181F"/>
-          <w:sz w:val="20"/>
-          <w:szCs w:val="20"/>
-          <w:lang w:bidi="hi-IN"/>
-        </w:rPr>
-        <w:t xml:space="preserve"> </w:t>
-      </w:r>
-      <w:r>
-        <w:rPr>
-          <w:rFonts w:ascii="var(--font-mono)" w:eastAsia="Times New Roman" w:hAnsi="var(--font-mono)" w:cs="Courier New"/>
-          <w:color w:val="8100C2"/>
-          <w:sz w:val="20"/>
-          <w:szCs w:val="20"/>
-          <w:lang w:bidi="hi-IN"/>
-        </w:rPr>
-        <w:t>BY</w:t>
-      </w:r>
-      <w:r>
-        <w:rPr>
-          <w:rFonts w:ascii="var(--font-mono)" w:eastAsia="Times New Roman" w:hAnsi="var(--font-mono)" w:cs="Courier New"/>
-          <w:color w:val="14181F"/>
-          <w:sz w:val="20"/>
-          <w:szCs w:val="20"/>
-          <w:lang w:bidi="hi-IN"/>
-        </w:rPr>
-        <w:t xml:space="preserve"> </w:t>
-      </w:r>
-      <w:proofErr w:type="spellStart"/>
+        <w:t>GROUPBY</w:t>
+      </w:r>
       <w:r>
         <w:rPr>
           <w:rFonts w:ascii="var(--font-mono)" w:eastAsia="Times New Roman" w:hAnsi="var(--font-mono)" w:cs="Courier New"/>
@@ -10609,27 +9620,7 @@
           <w:szCs w:val="24"/>
           <w:lang w:bidi="hi-IN"/>
         </w:rPr>
-        <w:t xml:space="preserve"> Open docs.djangoproject.com/</w:t>
-      </w:r>
-      <w:proofErr w:type="spellStart"/>
-      <w:r>
-        <w:rPr>
-          <w:rFonts w:ascii="Times New Roman" w:eastAsia="Times New Roman" w:hAnsi="Times New Roman" w:cs="Times New Roman"/>
-          <w:sz w:val="24"/>
-          <w:szCs w:val="24"/>
-          <w:lang w:bidi="hi-IN"/>
-        </w:rPr>
-        <w:t>en</w:t>
-      </w:r>
-      <w:proofErr w:type="spellEnd"/>
-      <w:r>
-        <w:rPr>
-          <w:rFonts w:ascii="Times New Roman" w:eastAsia="Times New Roman" w:hAnsi="Times New Roman" w:cs="Times New Roman"/>
-          <w:sz w:val="24"/>
-          <w:szCs w:val="24"/>
-          <w:lang w:bidi="hi-IN"/>
-        </w:rPr>
-        <w:t>/stable/intro/tutorial01/ and read only the "Creating a project" section. Just read, don't install anything yet.</w:t>
+        <w:t xml:space="preserve"> Open docs.djangoproject.com/en/stable/intro/tutorial01/ and read only the "Creating a project" section. Just read, don't install anything yet.</w:t>
       </w:r>
     </w:p>
     <w:p>
@@ -10880,7 +9871,27 @@
           <w:lang w:bidi="hi-IN"/>
         </w:rPr>
         <w:br/>
-        <w:t xml:space="preserve">Create GitHub repo </w:t>
+        <w:t xml:space="preserve">Create </w:t>
+      </w:r>
+      <w:proofErr w:type="spellStart"/>
+      <w:r>
+        <w:rPr>
+          <w:rFonts w:ascii="Times New Roman" w:eastAsia="Times New Roman" w:hAnsi="Times New Roman" w:cs="Times New Roman"/>
+          <w:sz w:val="24"/>
+          <w:szCs w:val="24"/>
+          <w:lang w:bidi="hi-IN"/>
+        </w:rPr>
+        <w:t>GitHub</w:t>
+      </w:r>
+      <w:proofErr w:type="spellEnd"/>
+      <w:r>
+        <w:rPr>
+          <w:rFonts w:ascii="Times New Roman" w:eastAsia="Times New Roman" w:hAnsi="Times New Roman" w:cs="Times New Roman"/>
+          <w:sz w:val="24"/>
+          <w:szCs w:val="24"/>
+          <w:lang w:bidi="hi-IN"/>
+        </w:rPr>
+        <w:t xml:space="preserve"> repo </w:t>
       </w:r>
       <w:r>
         <w:rPr>
@@ -10920,26 +9931,6 @@
         </w:rPr>
         <w:t xml:space="preserve">. Push: </w:t>
       </w:r>
-      <w:proofErr w:type="gramStart"/>
-      <w:r>
-        <w:rPr>
-          <w:rFonts w:ascii="Times New Roman" w:eastAsia="Times New Roman" w:hAnsi="Times New Roman" w:cs="Times New Roman"/>
-          <w:sz w:val="24"/>
-          <w:szCs w:val="24"/>
-          <w:lang w:bidi="hi-IN"/>
-        </w:rPr>
-        <w:t>the</w:t>
-      </w:r>
-      <w:proofErr w:type="gramEnd"/>
-      <w:r>
-        <w:rPr>
-          <w:rFonts w:ascii="Times New Roman" w:eastAsia="Times New Roman" w:hAnsi="Times New Roman" w:cs="Times New Roman"/>
-          <w:sz w:val="24"/>
-          <w:szCs w:val="24"/>
-          <w:lang w:bidi="hi-IN"/>
-        </w:rPr>
-        <w:t xml:space="preserve"> </w:t>
-      </w:r>
       <w:proofErr w:type="spellStart"/>
       <w:r>
         <w:rPr>
@@ -10948,7 +9939,7 @@
           <w:szCs w:val="24"/>
           <w:lang w:bidi="hi-IN"/>
         </w:rPr>
-        <w:t>Excalidraw</w:t>
+        <w:t>theExcalidraw</w:t>
       </w:r>
       <w:proofErr w:type="spellEnd"/>
       <w:r>
@@ -10960,7 +9951,6 @@
         </w:rPr>
         <w:t xml:space="preserve"> PNG, all your SQL CREATE TABLE statements in one file </w:t>
       </w:r>
-      <w:proofErr w:type="spellStart"/>
       <w:r>
         <w:rPr>
           <w:rFonts w:ascii="Courier New" w:eastAsia="Times New Roman" w:hAnsi="Courier New" w:cs="Courier New"/>
@@ -10970,7 +9960,6 @@
         </w:rPr>
         <w:t>schema.sql</w:t>
       </w:r>
-      <w:proofErr w:type="spellEnd"/>
       <w:r>
         <w:rPr>
           <w:rFonts w:ascii="Times New Roman" w:eastAsia="Times New Roman" w:hAnsi="Times New Roman" w:cs="Times New Roman"/>
@@ -11030,7 +10019,7 @@
           <w:szCs w:val="24"/>
           <w:lang w:bidi="hi-IN"/>
         </w:rPr>
-        <w:pict w14:anchorId="0A0B3908">
+        <w:pict>
           <v:rect id="_x0000_i1033" style="width:0;height:1.5pt" o:hralign="center" o:hrstd="t" o:hr="t" fillcolor="#a0a0a0" stroked="f"/>
         </w:pict>
       </w:r>
@@ -11177,7 +10166,6 @@
           <w:lang w:bidi="hi-IN"/>
         </w:rPr>
       </w:pPr>
-      <w:proofErr w:type="spellStart"/>
       <w:r>
         <w:rPr>
           <w:rFonts w:ascii="Courier New" w:eastAsia="Times New Roman" w:hAnsi="Courier New" w:cs="Courier New"/>
@@ -11187,7 +10175,6 @@
         </w:rPr>
         <w:t>schema.sql</w:t>
       </w:r>
-      <w:proofErr w:type="spellEnd"/>
       <w:r>
         <w:rPr>
           <w:rFonts w:ascii="Times New Roman" w:eastAsia="Times New Roman" w:hAnsi="Times New Roman" w:cs="Times New Roman"/>
@@ -11239,7 +10226,7 @@
           <w:szCs w:val="24"/>
           <w:lang w:bidi="hi-IN"/>
         </w:rPr>
-        <w:pict w14:anchorId="6B979BC1">
+        <w:pict>
           <v:rect id="_x0000_i1034" style="width:0;height:1.5pt" o:hralign="center" o:hrstd="t" o:hr="t" fillcolor="#a0a0a0" stroked="f"/>
         </w:pict>
       </w:r>
@@ -11256,15 +10243,6 @@
           <w:lang w:bidi="hi-IN"/>
         </w:rPr>
         <w:t>When you've passed this gate, come back for Phase 3 — Django Fundamentals + DRF + Claude AI Integration (Months 6–8). This is where your School ERP starts becoming a real running application.</w:t>
-      </w:r>
-      <w:r>
-        <w:rPr>
-          <w:rFonts w:ascii="Times New Roman" w:eastAsia="Times New Roman" w:hAnsi="Times New Roman" w:cs="Times New Roman"/>
-          <w:sz w:val="30"/>
-          <w:szCs w:val="30"/>
-          <w:lang w:bidi="hi-IN"/>
-        </w:rPr>
-        <w:t xml:space="preserve"> </w:t>
       </w:r>
     </w:p>
     <w:sectPr>
@@ -11278,8 +10256,8 @@
 </file>
 
 <file path=word/numbering.xml><?xml version="1.0" encoding="utf-8"?>
-<w:numbering xmlns:wpc="http://schemas.microsoft.com/office/word/2010/wordprocessingCanvas" xmlns:cx="http://schemas.microsoft.com/office/drawing/2014/chartex" xmlns:cx1="http://schemas.microsoft.com/office/drawing/2015/9/8/chartex" xmlns:cx2="http://schemas.microsoft.com/office/drawing/2015/10/21/chartex" xmlns:cx3="http://schemas.microsoft.com/office/drawing/2016/5/9/chartex" xmlns:cx4="http://schemas.microsoft.com/office/drawing/2016/5/10/chartex" xmlns:cx5="http://schemas.microsoft.com/office/drawing/2016/5/11/chartex" xmlns:cx6="http://schemas.microsoft.com/office/drawing/2016/5/12/chartex" xmlns:cx7="http://schemas.microsoft.com/office/drawing/2016/5/13/chartex" xmlns:cx8="http://schemas.microsoft.com/office/drawing/2016/5/14/chartex" xmlns:mc="http://schemas.openxmlformats.org/markup-compatibility/2006" xmlns:aink="http://schemas.microsoft.com/office/drawing/2016/ink" xmlns:am3d="http://schemas.microsoft.com/office/drawing/2017/model3d" xmlns:o="urn:schemas-microsoft-com:office:office" xmlns:oel="http://schemas.microsoft.com/office/2019/extlst" xmlns:r="http://schemas.openxmlformats.org/officeDocument/2006/relationships" xmlns:m="http://schemas.openxmlformats.org/officeDocument/2006/math" xmlns:v="urn:schemas-microsoft-com:vml" xmlns:wp14="http://schemas.microsoft.com/office/word/2010/wordprocessingDrawing" xmlns:wp="http://schemas.openxmlformats.org/drawingml/2006/wordprocessingDrawing" xmlns:w10="urn:schemas-microsoft-com:office:word" xmlns:w="http://schemas.openxmlformats.org/wordprocessingml/2006/main" xmlns:w14="http://schemas.microsoft.com/office/word/2010/wordml" xmlns:w15="http://schemas.microsoft.com/office/word/2012/wordml" xmlns:w16cex="http://schemas.microsoft.com/office/word/2018/wordml/cex" xmlns:w16cid="http://schemas.microsoft.com/office/word/2016/wordml/cid" xmlns:w16="http://schemas.microsoft.com/office/word/2018/wordml" xmlns:w16sdtdh="http://schemas.microsoft.com/office/word/2020/wordml/sdtdatahash" xmlns:w16se="http://schemas.microsoft.com/office/word/2015/wordml/symex" xmlns:wpg="http://schemas.microsoft.com/office/word/2010/wordprocessingGroup" xmlns:wpi="http://schemas.microsoft.com/office/word/2010/wordprocessingInk" xmlns:wne="http://schemas.microsoft.com/office/word/2006/wordml" xmlns:wps="http://schemas.microsoft.com/office/word/2010/wordprocessingShape" mc:Ignorable="w14 w15 w16se w16cid w16 w16cex w16sdtdh wp14">
-  <w:abstractNum w:abstractNumId="0" w15:restartNumberingAfterBreak="0">
+<w:numbering xmlns:ve="http://schemas.openxmlformats.org/markup-compatibility/2006" xmlns:o="urn:schemas-microsoft-com:office:office" xmlns:r="http://schemas.openxmlformats.org/officeDocument/2006/relationships" xmlns:m="http://schemas.openxmlformats.org/officeDocument/2006/math" xmlns:v="urn:schemas-microsoft-com:vml" xmlns:wp="http://schemas.openxmlformats.org/drawingml/2006/wordprocessingDrawing" xmlns:w10="urn:schemas-microsoft-com:office:word" xmlns:w="http://schemas.openxmlformats.org/wordprocessingml/2006/main" xmlns:wne="http://schemas.microsoft.com/office/word/2006/wordml">
+  <w:abstractNum w:abstractNumId="0">
     <w:nsid w:val="089C66D0"/>
     <w:multiLevelType w:val="multilevel"/>
     <w:tmpl w:val="EE66753A"/>
@@ -11428,7 +10406,7 @@
       </w:rPr>
     </w:lvl>
   </w:abstractNum>
-  <w:abstractNum w:abstractNumId="1" w15:restartNumberingAfterBreak="0">
+  <w:abstractNum w:abstractNumId="1">
     <w:nsid w:val="21CD5FF9"/>
     <w:multiLevelType w:val="multilevel"/>
     <w:tmpl w:val="29DE787E"/>
@@ -11541,7 +10519,7 @@
       </w:pPr>
     </w:lvl>
   </w:abstractNum>
-  <w:abstractNum w:abstractNumId="2" w15:restartNumberingAfterBreak="0">
+  <w:abstractNum w:abstractNumId="2">
     <w:nsid w:val="23E8309A"/>
     <w:multiLevelType w:val="multilevel"/>
     <w:tmpl w:val="767294DE"/>
@@ -11690,7 +10668,7 @@
       </w:rPr>
     </w:lvl>
   </w:abstractNum>
-  <w:abstractNum w:abstractNumId="3" w15:restartNumberingAfterBreak="0">
+  <w:abstractNum w:abstractNumId="3">
     <w:nsid w:val="2B447BB7"/>
     <w:multiLevelType w:val="multilevel"/>
     <w:tmpl w:val="C5DE7C66"/>
@@ -11839,7 +10817,7 @@
       </w:rPr>
     </w:lvl>
   </w:abstractNum>
-  <w:abstractNum w:abstractNumId="4" w15:restartNumberingAfterBreak="0">
+  <w:abstractNum w:abstractNumId="4">
     <w:nsid w:val="3CF71431"/>
     <w:multiLevelType w:val="multilevel"/>
     <w:tmpl w:val="AC84CA7C"/>
@@ -11988,7 +10966,7 @@
       </w:rPr>
     </w:lvl>
   </w:abstractNum>
-  <w:abstractNum w:abstractNumId="5" w15:restartNumberingAfterBreak="0">
+  <w:abstractNum w:abstractNumId="5">
     <w:nsid w:val="3ED238CE"/>
     <w:multiLevelType w:val="multilevel"/>
     <w:tmpl w:val="EB20E63C"/>
@@ -12137,7 +11115,7 @@
       </w:rPr>
     </w:lvl>
   </w:abstractNum>
-  <w:abstractNum w:abstractNumId="6" w15:restartNumberingAfterBreak="0">
+  <w:abstractNum w:abstractNumId="6">
     <w:nsid w:val="41D42B9A"/>
     <w:multiLevelType w:val="multilevel"/>
     <w:tmpl w:val="DCB241D8"/>
@@ -12286,7 +11264,7 @@
       </w:rPr>
     </w:lvl>
   </w:abstractNum>
-  <w:abstractNum w:abstractNumId="7" w15:restartNumberingAfterBreak="0">
+  <w:abstractNum w:abstractNumId="7">
     <w:nsid w:val="43E45233"/>
     <w:multiLevelType w:val="multilevel"/>
     <w:tmpl w:val="8466B4B0"/>
@@ -12435,7 +11413,7 @@
       </w:rPr>
     </w:lvl>
   </w:abstractNum>
-  <w:abstractNum w:abstractNumId="8" w15:restartNumberingAfterBreak="0">
+  <w:abstractNum w:abstractNumId="8">
     <w:nsid w:val="476A7D90"/>
     <w:multiLevelType w:val="multilevel"/>
     <w:tmpl w:val="A4D6131C"/>
@@ -12584,7 +11562,7 @@
       </w:rPr>
     </w:lvl>
   </w:abstractNum>
-  <w:abstractNum w:abstractNumId="9" w15:restartNumberingAfterBreak="0">
+  <w:abstractNum w:abstractNumId="9">
     <w:nsid w:val="6691030D"/>
     <w:multiLevelType w:val="multilevel"/>
     <w:tmpl w:val="7E80972A"/>
@@ -12733,7 +11711,7 @@
       </w:rPr>
     </w:lvl>
   </w:abstractNum>
-  <w:abstractNum w:abstractNumId="10" w15:restartNumberingAfterBreak="0">
+  <w:abstractNum w:abstractNumId="10">
     <w:nsid w:val="6C55438F"/>
     <w:multiLevelType w:val="multilevel"/>
     <w:tmpl w:val="11EE5724"/>
@@ -12882,7 +11860,7 @@
       </w:rPr>
     </w:lvl>
   </w:abstractNum>
-  <w:abstractNum w:abstractNumId="11" w15:restartNumberingAfterBreak="0">
+  <w:abstractNum w:abstractNumId="11">
     <w:nsid w:val="7FDD2339"/>
     <w:multiLevelType w:val="multilevel"/>
     <w:tmpl w:val="1946E13A"/>
@@ -13031,47 +12009,47 @@
       </w:rPr>
     </w:lvl>
   </w:abstractNum>
-  <w:num w:numId="1" w16cid:durableId="648558266">
+  <w:num w:numId="1">
     <w:abstractNumId w:val="3"/>
   </w:num>
-  <w:num w:numId="2" w16cid:durableId="1195464777">
+  <w:num w:numId="2">
     <w:abstractNumId w:val="6"/>
   </w:num>
-  <w:num w:numId="3" w16cid:durableId="663704836">
+  <w:num w:numId="3">
     <w:abstractNumId w:val="2"/>
   </w:num>
-  <w:num w:numId="4" w16cid:durableId="944776993">
+  <w:num w:numId="4">
     <w:abstractNumId w:val="7"/>
   </w:num>
-  <w:num w:numId="5" w16cid:durableId="1531144335">
+  <w:num w:numId="5">
     <w:abstractNumId w:val="9"/>
   </w:num>
-  <w:num w:numId="6" w16cid:durableId="1900093178">
+  <w:num w:numId="6">
     <w:abstractNumId w:val="10"/>
   </w:num>
-  <w:num w:numId="7" w16cid:durableId="581794359">
+  <w:num w:numId="7">
     <w:abstractNumId w:val="0"/>
   </w:num>
-  <w:num w:numId="8" w16cid:durableId="2098939306">
+  <w:num w:numId="8">
     <w:abstractNumId w:val="1"/>
   </w:num>
-  <w:num w:numId="9" w16cid:durableId="1612274670">
+  <w:num w:numId="9">
     <w:abstractNumId w:val="4"/>
   </w:num>
-  <w:num w:numId="10" w16cid:durableId="2087219665">
+  <w:num w:numId="10">
     <w:abstractNumId w:val="8"/>
   </w:num>
-  <w:num w:numId="11" w16cid:durableId="953559943">
+  <w:num w:numId="11">
     <w:abstractNumId w:val="5"/>
   </w:num>
-  <w:num w:numId="12" w16cid:durableId="237788361">
+  <w:num w:numId="12">
     <w:abstractNumId w:val="11"/>
   </w:num>
 </w:numbering>
 </file>
 
 <file path=word/styles.xml><?xml version="1.0" encoding="utf-8"?>
-<w:styles xmlns:mc="http://schemas.openxmlformats.org/markup-compatibility/2006" xmlns:r="http://schemas.openxmlformats.org/officeDocument/2006/relationships" xmlns:w="http://schemas.openxmlformats.org/wordprocessingml/2006/main" xmlns:w14="http://schemas.microsoft.com/office/word/2010/wordml" xmlns:w15="http://schemas.microsoft.com/office/word/2012/wordml" xmlns:w16cex="http://schemas.microsoft.com/office/word/2018/wordml/cex" xmlns:w16cid="http://schemas.microsoft.com/office/word/2016/wordml/cid" xmlns:w16="http://schemas.microsoft.com/office/word/2018/wordml" xmlns:w16sdtdh="http://schemas.microsoft.com/office/word/2020/wordml/sdtdatahash" xmlns:w16se="http://schemas.microsoft.com/office/word/2015/wordml/symex" mc:Ignorable="w14 w15 w16se w16cid w16 w16cex w16sdtdh">
+<w:styles xmlns:r="http://schemas.openxmlformats.org/officeDocument/2006/relationships" xmlns:w="http://schemas.openxmlformats.org/wordprocessingml/2006/main">
   <w:docDefaults>
     <w:rPrDefault>
       <w:rPr>
@@ -13087,387 +12065,149 @@
       </w:pPr>
     </w:pPrDefault>
   </w:docDefaults>
-  <w:latentStyles w:defLockedState="0" w:defUIPriority="99" w:defSemiHidden="0" w:defUnhideWhenUsed="0" w:defQFormat="0" w:count="376">
-    <w:lsdException w:name="Normal" w:uiPriority="0" w:qFormat="1"/>
-    <w:lsdException w:name="heading 1" w:uiPriority="9" w:qFormat="1"/>
-    <w:lsdException w:name="heading 2" w:semiHidden="1" w:uiPriority="9" w:unhideWhenUsed="1" w:qFormat="1"/>
-    <w:lsdException w:name="heading 3" w:semiHidden="1" w:uiPriority="9" w:unhideWhenUsed="1" w:qFormat="1"/>
-    <w:lsdException w:name="heading 4" w:semiHidden="1" w:uiPriority="9" w:unhideWhenUsed="1" w:qFormat="1"/>
-    <w:lsdException w:name="heading 5" w:semiHidden="1" w:uiPriority="9" w:unhideWhenUsed="1" w:qFormat="1"/>
-    <w:lsdException w:name="heading 6" w:semiHidden="1" w:uiPriority="9" w:unhideWhenUsed="1" w:qFormat="1"/>
-    <w:lsdException w:name="heading 7" w:semiHidden="1" w:uiPriority="9" w:unhideWhenUsed="1" w:qFormat="1"/>
-    <w:lsdException w:name="heading 8" w:semiHidden="1" w:uiPriority="9" w:unhideWhenUsed="1" w:qFormat="1"/>
-    <w:lsdException w:name="heading 9" w:semiHidden="1" w:uiPriority="9" w:unhideWhenUsed="1" w:qFormat="1"/>
-    <w:lsdException w:name="index 1" w:semiHidden="1" w:unhideWhenUsed="1"/>
-    <w:lsdException w:name="index 2" w:semiHidden="1" w:unhideWhenUsed="1"/>
-    <w:lsdException w:name="index 3" w:semiHidden="1" w:unhideWhenUsed="1"/>
-    <w:lsdException w:name="index 4" w:semiHidden="1" w:unhideWhenUsed="1"/>
-    <w:lsdException w:name="index 5" w:semiHidden="1" w:unhideWhenUsed="1"/>
-    <w:lsdException w:name="index 6" w:semiHidden="1" w:unhideWhenUsed="1"/>
-    <w:lsdException w:name="index 7" w:semiHidden="1" w:unhideWhenUsed="1"/>
-    <w:lsdException w:name="index 8" w:semiHidden="1" w:unhideWhenUsed="1"/>
-    <w:lsdException w:name="index 9" w:semiHidden="1" w:unhideWhenUsed="1"/>
-    <w:lsdException w:name="toc 1" w:semiHidden="1" w:uiPriority="39" w:unhideWhenUsed="1"/>
-    <w:lsdException w:name="toc 2" w:semiHidden="1" w:uiPriority="39" w:unhideWhenUsed="1"/>
-    <w:lsdException w:name="toc 3" w:semiHidden="1" w:uiPriority="39" w:unhideWhenUsed="1"/>
-    <w:lsdException w:name="toc 4" w:semiHidden="1" w:uiPriority="39" w:unhideWhenUsed="1"/>
-    <w:lsdException w:name="toc 5" w:semiHidden="1" w:uiPriority="39" w:unhideWhenUsed="1"/>
-    <w:lsdException w:name="toc 6" w:semiHidden="1" w:uiPriority="39" w:unhideWhenUsed="1"/>
-    <w:lsdException w:name="toc 7" w:semiHidden="1" w:uiPriority="39" w:unhideWhenUsed="1"/>
-    <w:lsdException w:name="toc 8" w:semiHidden="1" w:uiPriority="39" w:unhideWhenUsed="1"/>
-    <w:lsdException w:name="toc 9" w:semiHidden="1" w:uiPriority="39" w:unhideWhenUsed="1"/>
-    <w:lsdException w:name="Normal Indent" w:semiHidden="1" w:unhideWhenUsed="1"/>
-    <w:lsdException w:name="footnote text" w:semiHidden="1" w:unhideWhenUsed="1"/>
-    <w:lsdException w:name="annotation text" w:semiHidden="1" w:unhideWhenUsed="1"/>
-    <w:lsdException w:name="header" w:semiHidden="1" w:unhideWhenUsed="1"/>
-    <w:lsdException w:name="footer" w:semiHidden="1" w:unhideWhenUsed="1"/>
-    <w:lsdException w:name="index heading" w:semiHidden="1" w:unhideWhenUsed="1"/>
-    <w:lsdException w:name="caption" w:semiHidden="1" w:uiPriority="35" w:unhideWhenUsed="1" w:qFormat="1"/>
-    <w:lsdException w:name="table of figures" w:semiHidden="1" w:unhideWhenUsed="1"/>
-    <w:lsdException w:name="envelope address" w:semiHidden="1" w:unhideWhenUsed="1"/>
-    <w:lsdException w:name="envelope return" w:semiHidden="1" w:unhideWhenUsed="1"/>
-    <w:lsdException w:name="footnote reference" w:semiHidden="1" w:unhideWhenUsed="1"/>
-    <w:lsdException w:name="annotation reference" w:semiHidden="1" w:unhideWhenUsed="1"/>
-    <w:lsdException w:name="line number" w:semiHidden="1" w:unhideWhenUsed="1"/>
-    <w:lsdException w:name="page number" w:semiHidden="1" w:unhideWhenUsed="1"/>
-    <w:lsdException w:name="endnote reference" w:semiHidden="1" w:unhideWhenUsed="1"/>
-    <w:lsdException w:name="endnote text" w:semiHidden="1" w:unhideWhenUsed="1"/>
-    <w:lsdException w:name="table of authorities" w:semiHidden="1" w:unhideWhenUsed="1"/>
-    <w:lsdException w:name="macro" w:semiHidden="1" w:unhideWhenUsed="1"/>
-    <w:lsdException w:name="toa heading" w:semiHidden="1" w:unhideWhenUsed="1"/>
-    <w:lsdException w:name="List" w:semiHidden="1" w:unhideWhenUsed="1"/>
-    <w:lsdException w:name="List Bullet" w:semiHidden="1" w:unhideWhenUsed="1"/>
-    <w:lsdException w:name="List Number" w:semiHidden="1" w:unhideWhenUsed="1"/>
-    <w:lsdException w:name="List 2" w:semiHidden="1" w:unhideWhenUsed="1"/>
-    <w:lsdException w:name="List 3" w:semiHidden="1" w:unhideWhenUsed="1"/>
-    <w:lsdException w:name="List 4" w:semiHidden="1" w:unhideWhenUsed="1"/>
-    <w:lsdException w:name="List 5" w:semiHidden="1" w:unhideWhenUsed="1"/>
-    <w:lsdException w:name="List Bullet 2" w:semiHidden="1" w:unhideWhenUsed="1"/>
-    <w:lsdException w:name="List Bullet 3" w:semiHidden="1" w:unhideWhenUsed="1"/>
-    <w:lsdException w:name="List Bullet 4" w:semiHidden="1" w:unhideWhenUsed="1"/>
-    <w:lsdException w:name="List Bullet 5" w:semiHidden="1" w:unhideWhenUsed="1"/>
-    <w:lsdException w:name="List Number 2" w:semiHidden="1" w:unhideWhenUsed="1"/>
-    <w:lsdException w:name="List Number 3" w:semiHidden="1" w:unhideWhenUsed="1"/>
-    <w:lsdException w:name="List Number 4" w:semiHidden="1" w:unhideWhenUsed="1"/>
-    <w:lsdException w:name="List Number 5" w:semiHidden="1" w:unhideWhenUsed="1"/>
-    <w:lsdException w:name="Title" w:uiPriority="10" w:qFormat="1"/>
-    <w:lsdException w:name="Closing" w:semiHidden="1" w:unhideWhenUsed="1"/>
-    <w:lsdException w:name="Signature" w:semiHidden="1" w:unhideWhenUsed="1"/>
-    <w:lsdException w:name="Default Paragraph Font" w:semiHidden="1" w:uiPriority="1" w:unhideWhenUsed="1"/>
-    <w:lsdException w:name="Body Text" w:semiHidden="1" w:unhideWhenUsed="1"/>
-    <w:lsdException w:name="Body Text Indent" w:semiHidden="1" w:unhideWhenUsed="1"/>
-    <w:lsdException w:name="List Continue" w:semiHidden="1" w:unhideWhenUsed="1"/>
-    <w:lsdException w:name="List Continue 2" w:semiHidden="1" w:unhideWhenUsed="1"/>
-    <w:lsdException w:name="List Continue 3" w:semiHidden="1" w:unhideWhenUsed="1"/>
-    <w:lsdException w:name="List Continue 4" w:semiHidden="1" w:unhideWhenUsed="1"/>
-    <w:lsdException w:name="List Continue 5" w:semiHidden="1" w:unhideWhenUsed="1"/>
-    <w:lsdException w:name="Message Header" w:semiHidden="1" w:unhideWhenUsed="1"/>
-    <w:lsdException w:name="Subtitle" w:uiPriority="11" w:qFormat="1"/>
-    <w:lsdException w:name="Salutation" w:semiHidden="1" w:unhideWhenUsed="1"/>
-    <w:lsdException w:name="Date" w:semiHidden="1" w:unhideWhenUsed="1"/>
-    <w:lsdException w:name="Body Text First Indent" w:semiHidden="1" w:unhideWhenUsed="1"/>
-    <w:lsdException w:name="Body Text First Indent 2" w:semiHidden="1" w:unhideWhenUsed="1"/>
-    <w:lsdException w:name="Note Heading" w:semiHidden="1" w:unhideWhenUsed="1"/>
-    <w:lsdException w:name="Body Text 2" w:semiHidden="1" w:unhideWhenUsed="1"/>
-    <w:lsdException w:name="Body Text 3" w:semiHidden="1" w:unhideWhenUsed="1"/>
-    <w:lsdException w:name="Body Text Indent 2" w:semiHidden="1" w:unhideWhenUsed="1"/>
-    <w:lsdException w:name="Body Text Indent 3" w:semiHidden="1" w:unhideWhenUsed="1"/>
-    <w:lsdException w:name="Block Text" w:semiHidden="1" w:unhideWhenUsed="1"/>
-    <w:lsdException w:name="Hyperlink" w:semiHidden="1" w:unhideWhenUsed="1"/>
-    <w:lsdException w:name="FollowedHyperlink" w:semiHidden="1" w:unhideWhenUsed="1"/>
-    <w:lsdException w:name="Strong" w:uiPriority="22" w:qFormat="1"/>
-    <w:lsdException w:name="Emphasis" w:uiPriority="20" w:qFormat="1"/>
-    <w:lsdException w:name="Document Map" w:semiHidden="1" w:unhideWhenUsed="1"/>
-    <w:lsdException w:name="Plain Text" w:semiHidden="1" w:unhideWhenUsed="1"/>
-    <w:lsdException w:name="E-mail Signature" w:semiHidden="1" w:unhideWhenUsed="1"/>
-    <w:lsdException w:name="HTML Top of Form" w:semiHidden="1" w:unhideWhenUsed="1"/>
-    <w:lsdException w:name="HTML Bottom of Form" w:semiHidden="1" w:unhideWhenUsed="1"/>
-    <w:lsdException w:name="Normal (Web)" w:semiHidden="1" w:unhideWhenUsed="1"/>
-    <w:lsdException w:name="HTML Acronym" w:semiHidden="1" w:unhideWhenUsed="1"/>
-    <w:lsdException w:name="HTML Address" w:semiHidden="1" w:unhideWhenUsed="1"/>
-    <w:lsdException w:name="HTML Cite" w:semiHidden="1" w:unhideWhenUsed="1"/>
-    <w:lsdException w:name="HTML Code" w:semiHidden="1" w:unhideWhenUsed="1"/>
-    <w:lsdException w:name="HTML Definition" w:semiHidden="1" w:unhideWhenUsed="1"/>
-    <w:lsdException w:name="HTML Keyboard" w:semiHidden="1" w:unhideWhenUsed="1"/>
-    <w:lsdException w:name="HTML Preformatted" w:semiHidden="1" w:unhideWhenUsed="1"/>
-    <w:lsdException w:name="HTML Sample" w:semiHidden="1" w:unhideWhenUsed="1"/>
-    <w:lsdException w:name="HTML Typewriter" w:semiHidden="1" w:unhideWhenUsed="1"/>
-    <w:lsdException w:name="HTML Variable" w:semiHidden="1" w:unhideWhenUsed="1"/>
-    <w:lsdException w:name="Normal Table" w:semiHidden="1" w:unhideWhenUsed="1"/>
-    <w:lsdException w:name="annotation subject" w:semiHidden="1" w:unhideWhenUsed="1"/>
-    <w:lsdException w:name="No List" w:semiHidden="1" w:unhideWhenUsed="1"/>
-    <w:lsdException w:name="Outline List 1" w:semiHidden="1" w:unhideWhenUsed="1"/>
-    <w:lsdException w:name="Outline List 2" w:semiHidden="1" w:unhideWhenUsed="1"/>
-    <w:lsdException w:name="Outline List 3" w:semiHidden="1" w:unhideWhenUsed="1"/>
-    <w:lsdException w:name="Table Simple 1" w:semiHidden="1" w:unhideWhenUsed="1"/>
-    <w:lsdException w:name="Table Simple 2" w:semiHidden="1" w:unhideWhenUsed="1"/>
-    <w:lsdException w:name="Table Simple 3" w:semiHidden="1" w:unhideWhenUsed="1"/>
-    <w:lsdException w:name="Table Classic 1" w:semiHidden="1" w:unhideWhenUsed="1"/>
-    <w:lsdException w:name="Table Classic 2" w:semiHidden="1" w:unhideWhenUsed="1"/>
-    <w:lsdException w:name="Table Classic 3" w:semiHidden="1" w:unhideWhenUsed="1"/>
-    <w:lsdException w:name="Table Classic 4" w:semiHidden="1" w:unhideWhenUsed="1"/>
-    <w:lsdException w:name="Table Colorful 1" w:semiHidden="1" w:unhideWhenUsed="1"/>
-    <w:lsdException w:name="Table Colorful 2" w:semiHidden="1" w:unhideWhenUsed="1"/>
-    <w:lsdException w:name="Table Colorful 3" w:semiHidden="1" w:unhideWhenUsed="1"/>
-    <w:lsdException w:name="Table Columns 1" w:semiHidden="1" w:unhideWhenUsed="1"/>
-    <w:lsdException w:name="Table Columns 2" w:semiHidden="1" w:unhideWhenUsed="1"/>
-    <w:lsdException w:name="Table Columns 3" w:semiHidden="1" w:unhideWhenUsed="1"/>
-    <w:lsdException w:name="Table Columns 4" w:semiHidden="1" w:unhideWhenUsed="1"/>
-    <w:lsdException w:name="Table Columns 5" w:semiHidden="1" w:unhideWhenUsed="1"/>
-    <w:lsdException w:name="Table Grid 1" w:semiHidden="1" w:unhideWhenUsed="1"/>
-    <w:lsdException w:name="Table Grid 2" w:semiHidden="1" w:unhideWhenUsed="1"/>
-    <w:lsdException w:name="Table Grid 3" w:semiHidden="1" w:unhideWhenUsed="1"/>
-    <w:lsdException w:name="Table Grid 4" w:semiHidden="1" w:unhideWhenUsed="1"/>
-    <w:lsdException w:name="Table Grid 5" w:semiHidden="1" w:unhideWhenUsed="1"/>
-    <w:lsdException w:name="Table Grid 6" w:semiHidden="1" w:unhideWhenUsed="1"/>
-    <w:lsdException w:name="Table Grid 7" w:semiHidden="1" w:unhideWhenUsed="1"/>
-    <w:lsdException w:name="Table Grid 8" w:semiHidden="1" w:unhideWhenUsed="1"/>
-    <w:lsdException w:name="Table List 1" w:semiHidden="1" w:unhideWhenUsed="1"/>
-    <w:lsdException w:name="Table List 2" w:semiHidden="1" w:unhideWhenUsed="1"/>
-    <w:lsdException w:name="Table List 3" w:semiHidden="1" w:unhideWhenUsed="1"/>
-    <w:lsdException w:name="Table List 4" w:semiHidden="1" w:unhideWhenUsed="1"/>
-    <w:lsdException w:name="Table List 5" w:semiHidden="1" w:unhideWhenUsed="1"/>
-    <w:lsdException w:name="Table List 6" w:semiHidden="1" w:unhideWhenUsed="1"/>
-    <w:lsdException w:name="Table List 7" w:semiHidden="1" w:unhideWhenUsed="1"/>
-    <w:lsdException w:name="Table List 8" w:semiHidden="1" w:unhideWhenUsed="1"/>
-    <w:lsdException w:name="Table 3D effects 1" w:semiHidden="1" w:unhideWhenUsed="1"/>
-    <w:lsdException w:name="Table 3D effects 2" w:semiHidden="1" w:unhideWhenUsed="1"/>
-    <w:lsdException w:name="Table 3D effects 3" w:semiHidden="1" w:unhideWhenUsed="1"/>
-    <w:lsdException w:name="Table Contemporary" w:semiHidden="1" w:unhideWhenUsed="1"/>
-    <w:lsdException w:name="Table Elegant" w:semiHidden="1" w:unhideWhenUsed="1"/>
-    <w:lsdException w:name="Table Professional" w:semiHidden="1" w:unhideWhenUsed="1"/>
-    <w:lsdException w:name="Table Subtle 1" w:semiHidden="1" w:unhideWhenUsed="1"/>
-    <w:lsdException w:name="Table Subtle 2" w:semiHidden="1" w:unhideWhenUsed="1"/>
-    <w:lsdException w:name="Table Web 1" w:semiHidden="1" w:unhideWhenUsed="1"/>
-    <w:lsdException w:name="Table Web 2" w:semiHidden="1" w:unhideWhenUsed="1"/>
-    <w:lsdException w:name="Table Web 3" w:semiHidden="1" w:unhideWhenUsed="1"/>
-    <w:lsdException w:name="Balloon Text" w:semiHidden="1" w:unhideWhenUsed="1"/>
-    <w:lsdException w:name="Table Grid" w:uiPriority="39"/>
-    <w:lsdException w:name="Table Theme" w:semiHidden="1" w:unhideWhenUsed="1"/>
-    <w:lsdException w:name="Placeholder Text" w:semiHidden="1"/>
-    <w:lsdException w:name="No Spacing" w:uiPriority="1" w:qFormat="1"/>
-    <w:lsdException w:name="Light Shading" w:uiPriority="60"/>
-    <w:lsdException w:name="Light List" w:uiPriority="61"/>
-    <w:lsdException w:name="Light Grid" w:uiPriority="62"/>
-    <w:lsdException w:name="Medium Shading 1" w:uiPriority="63"/>
-    <w:lsdException w:name="Medium Shading 2" w:uiPriority="64"/>
-    <w:lsdException w:name="Medium List 1" w:uiPriority="65"/>
-    <w:lsdException w:name="Medium List 2" w:uiPriority="66"/>
-    <w:lsdException w:name="Medium Grid 1" w:uiPriority="67"/>
-    <w:lsdException w:name="Medium Grid 2" w:uiPriority="68"/>
-    <w:lsdException w:name="Medium Grid 3" w:uiPriority="69"/>
-    <w:lsdException w:name="Dark List" w:uiPriority="70"/>
-    <w:lsdException w:name="Colorful Shading" w:uiPriority="71"/>
-    <w:lsdException w:name="Colorful List" w:uiPriority="72"/>
-    <w:lsdException w:name="Colorful Grid" w:uiPriority="73"/>
-    <w:lsdException w:name="Light Shading Accent 1" w:uiPriority="60"/>
-    <w:lsdException w:name="Light List Accent 1" w:uiPriority="61"/>
-    <w:lsdException w:name="Light Grid Accent 1" w:uiPriority="62"/>
-    <w:lsdException w:name="Medium Shading 1 Accent 1" w:uiPriority="63"/>
-    <w:lsdException w:name="Medium Shading 2 Accent 1" w:uiPriority="64"/>
-    <w:lsdException w:name="Medium List 1 Accent 1" w:uiPriority="65"/>
-    <w:lsdException w:name="Revision" w:semiHidden="1"/>
-    <w:lsdException w:name="List Paragraph" w:uiPriority="34" w:qFormat="1"/>
-    <w:lsdException w:name="Quote" w:uiPriority="29" w:qFormat="1"/>
-    <w:lsdException w:name="Intense Quote" w:uiPriority="30" w:qFormat="1"/>
-    <w:lsdException w:name="Medium List 2 Accent 1" w:uiPriority="66"/>
-    <w:lsdException w:name="Medium Grid 1 Accent 1" w:uiPriority="67"/>
-    <w:lsdException w:name="Medium Grid 2 Accent 1" w:uiPriority="68"/>
-    <w:lsdException w:name="Medium Grid 3 Accent 1" w:uiPriority="69"/>
-    <w:lsdException w:name="Dark List Accent 1" w:uiPriority="70"/>
-    <w:lsdException w:name="Colorful Shading Accent 1" w:uiPriority="71"/>
-    <w:lsdException w:name="Colorful List Accent 1" w:uiPriority="72"/>
-    <w:lsdException w:name="Colorful Grid Accent 1" w:uiPriority="73"/>
-    <w:lsdException w:name="Light Shading Accent 2" w:uiPriority="60"/>
-    <w:lsdException w:name="Light List Accent 2" w:uiPriority="61"/>
-    <w:lsdException w:name="Light Grid Accent 2" w:uiPriority="62"/>
-    <w:lsdException w:name="Medium Shading 1 Accent 2" w:uiPriority="63"/>
-    <w:lsdException w:name="Medium Shading 2 Accent 2" w:uiPriority="64"/>
-    <w:lsdException w:name="Medium List 1 Accent 2" w:uiPriority="65"/>
-    <w:lsdException w:name="Medium List 2 Accent 2" w:uiPriority="66"/>
-    <w:lsdException w:name="Medium Grid 1 Accent 2" w:uiPriority="67"/>
-    <w:lsdException w:name="Medium Grid 2 Accent 2" w:uiPriority="68"/>
-    <w:lsdException w:name="Medium Grid 3 Accent 2" w:uiPriority="69"/>
-    <w:lsdException w:name="Dark List Accent 2" w:uiPriority="70"/>
-    <w:lsdException w:name="Colorful Shading Accent 2" w:uiPriority="71"/>
-    <w:lsdException w:name="Colorful List Accent 2" w:uiPriority="72"/>
-    <w:lsdException w:name="Colorful Grid Accent 2" w:uiPriority="73"/>
-    <w:lsdException w:name="Light Shading Accent 3" w:uiPriority="60"/>
-    <w:lsdException w:name="Light List Accent 3" w:uiPriority="61"/>
-    <w:lsdException w:name="Light Grid Accent 3" w:uiPriority="62"/>
-    <w:lsdException w:name="Medium Shading 1 Accent 3" w:uiPriority="63"/>
-    <w:lsdException w:name="Medium Shading 2 Accent 3" w:uiPriority="64"/>
-    <w:lsdException w:name="Medium List 1 Accent 3" w:uiPriority="65"/>
-    <w:lsdException w:name="Medium List 2 Accent 3" w:uiPriority="66"/>
-    <w:lsdException w:name="Medium Grid 1 Accent 3" w:uiPriority="67"/>
-    <w:lsdException w:name="Medium Grid 2 Accent 3" w:uiPriority="68"/>
-    <w:lsdException w:name="Medium Grid 3 Accent 3" w:uiPriority="69"/>
-    <w:lsdException w:name="Dark List Accent 3" w:uiPriority="70"/>
-    <w:lsdException w:name="Colorful Shading Accent 3" w:uiPriority="71"/>
-    <w:lsdException w:name="Colorful List Accent 3" w:uiPriority="72"/>
-    <w:lsdException w:name="Colorful Grid Accent 3" w:uiPriority="73"/>
-    <w:lsdException w:name="Light Shading Accent 4" w:uiPriority="60"/>
-    <w:lsdException w:name="Light List Accent 4" w:uiPriority="61"/>
-    <w:lsdException w:name="Light Grid Accent 4" w:uiPriority="62"/>
-    <w:lsdException w:name="Medium Shading 1 Accent 4" w:uiPriority="63"/>
-    <w:lsdException w:name="Medium Shading 2 Accent 4" w:uiPriority="64"/>
-    <w:lsdException w:name="Medium List 1 Accent 4" w:uiPriority="65"/>
-    <w:lsdException w:name="Medium List 2 Accent 4" w:uiPriority="66"/>
-    <w:lsdException w:name="Medium Grid 1 Accent 4" w:uiPriority="67"/>
-    <w:lsdException w:name="Medium Grid 2 Accent 4" w:uiPriority="68"/>
-    <w:lsdException w:name="Medium Grid 3 Accent 4" w:uiPriority="69"/>
-    <w:lsdException w:name="Dark List Accent 4" w:uiPriority="70"/>
-    <w:lsdException w:name="Colorful Shading Accent 4" w:uiPriority="71"/>
-    <w:lsdException w:name="Colorful List Accent 4" w:uiPriority="72"/>
-    <w:lsdException w:name="Colorful Grid Accent 4" w:uiPriority="73"/>
-    <w:lsdException w:name="Light Shading Accent 5" w:uiPriority="60"/>
-    <w:lsdException w:name="Light List Accent 5" w:uiPriority="61"/>
-    <w:lsdException w:name="Light Grid Accent 5" w:uiPriority="62"/>
-    <w:lsdException w:name="Medium Shading 1 Accent 5" w:uiPriority="63"/>
-    <w:lsdException w:name="Medium Shading 2 Accent 5" w:uiPriority="64"/>
-    <w:lsdException w:name="Medium List 1 Accent 5" w:uiPriority="65"/>
-    <w:lsdException w:name="Medium List 2 Accent 5" w:uiPriority="66"/>
-    <w:lsdException w:name="Medium Grid 1 Accent 5" w:uiPriority="67"/>
-    <w:lsdException w:name="Medium Grid 2 Accent 5" w:uiPriority="68"/>
-    <w:lsdException w:name="Medium Grid 3 Accent 5" w:uiPriority="69"/>
-    <w:lsdException w:name="Dark List Accent 5" w:uiPriority="70"/>
-    <w:lsdException w:name="Colorful Shading Accent 5" w:uiPriority="71"/>
-    <w:lsdException w:name="Colorful List Accent 5" w:uiPriority="72"/>
-    <w:lsdException w:name="Colorful Grid Accent 5" w:uiPriority="73"/>
-    <w:lsdException w:name="Light Shading Accent 6" w:uiPriority="60"/>
-    <w:lsdException w:name="Light List Accent 6" w:uiPriority="61"/>
-    <w:lsdException w:name="Light Grid Accent 6" w:uiPriority="62"/>
-    <w:lsdException w:name="Medium Shading 1 Accent 6" w:uiPriority="63"/>
-    <w:lsdException w:name="Medium Shading 2 Accent 6" w:uiPriority="64"/>
-    <w:lsdException w:name="Medium List 1 Accent 6" w:uiPriority="65"/>
-    <w:lsdException w:name="Medium List 2 Accent 6" w:uiPriority="66"/>
-    <w:lsdException w:name="Medium Grid 1 Accent 6" w:uiPriority="67"/>
-    <w:lsdException w:name="Medium Grid 2 Accent 6" w:uiPriority="68"/>
-    <w:lsdException w:name="Medium Grid 3 Accent 6" w:uiPriority="69"/>
-    <w:lsdException w:name="Dark List Accent 6" w:uiPriority="70"/>
-    <w:lsdException w:name="Colorful Shading Accent 6" w:uiPriority="71"/>
-    <w:lsdException w:name="Colorful List Accent 6" w:uiPriority="72"/>
-    <w:lsdException w:name="Colorful Grid Accent 6" w:uiPriority="73"/>
-    <w:lsdException w:name="Subtle Emphasis" w:uiPriority="19" w:qFormat="1"/>
-    <w:lsdException w:name="Intense Emphasis" w:uiPriority="21" w:qFormat="1"/>
-    <w:lsdException w:name="Subtle Reference" w:uiPriority="31" w:qFormat="1"/>
-    <w:lsdException w:name="Intense Reference" w:uiPriority="32" w:qFormat="1"/>
-    <w:lsdException w:name="Book Title" w:uiPriority="33" w:qFormat="1"/>
-    <w:lsdException w:name="Bibliography" w:semiHidden="1" w:uiPriority="37" w:unhideWhenUsed="1"/>
-    <w:lsdException w:name="TOC Heading" w:semiHidden="1" w:uiPriority="39" w:unhideWhenUsed="1" w:qFormat="1"/>
-    <w:lsdException w:name="Plain Table 1" w:uiPriority="41"/>
-    <w:lsdException w:name="Plain Table 2" w:uiPriority="42"/>
-    <w:lsdException w:name="Plain Table 3" w:uiPriority="43"/>
-    <w:lsdException w:name="Plain Table 4" w:uiPriority="44"/>
-    <w:lsdException w:name="Plain Table 5" w:uiPriority="45"/>
-    <w:lsdException w:name="Grid Table Light" w:uiPriority="40"/>
-    <w:lsdException w:name="Grid Table 1 Light" w:uiPriority="46"/>
-    <w:lsdException w:name="Grid Table 2" w:uiPriority="47"/>
-    <w:lsdException w:name="Grid Table 3" w:uiPriority="48"/>
-    <w:lsdException w:name="Grid Table 4" w:uiPriority="49"/>
-    <w:lsdException w:name="Grid Table 5 Dark" w:uiPriority="50"/>
-    <w:lsdException w:name="Grid Table 6 Colorful" w:uiPriority="51"/>
-    <w:lsdException w:name="Grid Table 7 Colorful" w:uiPriority="52"/>
-    <w:lsdException w:name="Grid Table 1 Light Accent 1" w:uiPriority="46"/>
-    <w:lsdException w:name="Grid Table 2 Accent 1" w:uiPriority="47"/>
-    <w:lsdException w:name="Grid Table 3 Accent 1" w:uiPriority="48"/>
-    <w:lsdException w:name="Grid Table 4 Accent 1" w:uiPriority="49"/>
-    <w:lsdException w:name="Grid Table 5 Dark Accent 1" w:uiPriority="50"/>
-    <w:lsdException w:name="Grid Table 6 Colorful Accent 1" w:uiPriority="51"/>
-    <w:lsdException w:name="Grid Table 7 Colorful Accent 1" w:uiPriority="52"/>
-    <w:lsdException w:name="Grid Table 1 Light Accent 2" w:uiPriority="46"/>
-    <w:lsdException w:name="Grid Table 2 Accent 2" w:uiPriority="47"/>
-    <w:lsdException w:name="Grid Table 3 Accent 2" w:uiPriority="48"/>
-    <w:lsdException w:name="Grid Table 4 Accent 2" w:uiPriority="49"/>
-    <w:lsdException w:name="Grid Table 5 Dark Accent 2" w:uiPriority="50"/>
-    <w:lsdException w:name="Grid Table 6 Colorful Accent 2" w:uiPriority="51"/>
-    <w:lsdException w:name="Grid Table 7 Colorful Accent 2" w:uiPriority="52"/>
-    <w:lsdException w:name="Grid Table 1 Light Accent 3" w:uiPriority="46"/>
-    <w:lsdException w:name="Grid Table 2 Accent 3" w:uiPriority="47"/>
-    <w:lsdException w:name="Grid Table 3 Accent 3" w:uiPriority="48"/>
-    <w:lsdException w:name="Grid Table 4 Accent 3" w:uiPriority="49"/>
-    <w:lsdException w:name="Grid Table 5 Dark Accent 3" w:uiPriority="50"/>
-    <w:lsdException w:name="Grid Table 6 Colorful Accent 3" w:uiPriority="51"/>
-    <w:lsdException w:name="Grid Table 7 Colorful Accent 3" w:uiPriority="52"/>
-    <w:lsdException w:name="Grid Table 1 Light Accent 4" w:uiPriority="46"/>
-    <w:lsdException w:name="Grid Table 2 Accent 4" w:uiPriority="47"/>
-    <w:lsdException w:name="Grid Table 3 Accent 4" w:uiPriority="48"/>
-    <w:lsdException w:name="Grid Table 4 Accent 4" w:uiPriority="49"/>
-    <w:lsdException w:name="Grid Table 5 Dark Accent 4" w:uiPriority="50"/>
-    <w:lsdException w:name="Grid Table 6 Colorful Accent 4" w:uiPriority="51"/>
-    <w:lsdException w:name="Grid Table 7 Colorful Accent 4" w:uiPriority="52"/>
-    <w:lsdException w:name="Grid Table 1 Light Accent 5" w:uiPriority="46"/>
-    <w:lsdException w:name="Grid Table 2 Accent 5" w:uiPriority="47"/>
-    <w:lsdException w:name="Grid Table 3 Accent 5" w:uiPriority="48"/>
-    <w:lsdException w:name="Grid Table 4 Accent 5" w:uiPriority="49"/>
-    <w:lsdException w:name="Grid Table 5 Dark Accent 5" w:uiPriority="50"/>
-    <w:lsdException w:name="Grid Table 6 Colorful Accent 5" w:uiPriority="51"/>
-    <w:lsdException w:name="Grid Table 7 Colorful Accent 5" w:uiPriority="52"/>
-    <w:lsdException w:name="Grid Table 1 Light Accent 6" w:uiPriority="46"/>
-    <w:lsdException w:name="Grid Table 2 Accent 6" w:uiPriority="47"/>
-    <w:lsdException w:name="Grid Table 3 Accent 6" w:uiPriority="48"/>
-    <w:lsdException w:name="Grid Table 4 Accent 6" w:uiPriority="49"/>
-    <w:lsdException w:name="Grid Table 5 Dark Accent 6" w:uiPriority="50"/>
-    <w:lsdException w:name="Grid Table 6 Colorful Accent 6" w:uiPriority="51"/>
-    <w:lsdException w:name="Grid Table 7 Colorful Accent 6" w:uiPriority="52"/>
-    <w:lsdException w:name="List Table 1 Light" w:uiPriority="46"/>
-    <w:lsdException w:name="List Table 2" w:uiPriority="47"/>
-    <w:lsdException w:name="List Table 3" w:uiPriority="48"/>
-    <w:lsdException w:name="List Table 4" w:uiPriority="49"/>
-    <w:lsdException w:name="List Table 5 Dark" w:uiPriority="50"/>
-    <w:lsdException w:name="List Table 6 Colorful" w:uiPriority="51"/>
-    <w:lsdException w:name="List Table 7 Colorful" w:uiPriority="52"/>
-    <w:lsdException w:name="List Table 1 Light Accent 1" w:uiPriority="46"/>
-    <w:lsdException w:name="List Table 2 Accent 1" w:uiPriority="47"/>
-    <w:lsdException w:name="List Table 3 Accent 1" w:uiPriority="48"/>
-    <w:lsdException w:name="List Table 4 Accent 1" w:uiPriority="49"/>
-    <w:lsdException w:name="List Table 5 Dark Accent 1" w:uiPriority="50"/>
-    <w:lsdException w:name="List Table 6 Colorful Accent 1" w:uiPriority="51"/>
-    <w:lsdException w:name="List Table 7 Colorful Accent 1" w:uiPriority="52"/>
-    <w:lsdException w:name="List Table 1 Light Accent 2" w:uiPriority="46"/>
-    <w:lsdException w:name="List Table 2 Accent 2" w:uiPriority="47"/>
-    <w:lsdException w:name="List Table 3 Accent 2" w:uiPriority="48"/>
-    <w:lsdException w:name="List Table 4 Accent 2" w:uiPriority="49"/>
-    <w:lsdException w:name="List Table 5 Dark Accent 2" w:uiPriority="50"/>
-    <w:lsdException w:name="List Table 6 Colorful Accent 2" w:uiPriority="51"/>
-    <w:lsdException w:name="List Table 7 Colorful Accent 2" w:uiPriority="52"/>
-    <w:lsdException w:name="List Table 1 Light Accent 3" w:uiPriority="46"/>
-    <w:lsdException w:name="List Table 2 Accent 3" w:uiPriority="47"/>
-    <w:lsdException w:name="List Table 3 Accent 3" w:uiPriority="48"/>
-    <w:lsdException w:name="List Table 4 Accent 3" w:uiPriority="49"/>
-    <w:lsdException w:name="List Table 5 Dark Accent 3" w:uiPriority="50"/>
-    <w:lsdException w:name="List Table 6 Colorful Accent 3" w:uiPriority="51"/>
-    <w:lsdException w:name="List Table 7 Colorful Accent 3" w:uiPriority="52"/>
-    <w:lsdException w:name="List Table 1 Light Accent 4" w:uiPriority="46"/>
-    <w:lsdException w:name="List Table 2 Accent 4" w:uiPriority="47"/>
-    <w:lsdException w:name="List Table 3 Accent 4" w:uiPriority="48"/>
-    <w:lsdException w:name="List Table 4 Accent 4" w:uiPriority="49"/>
-    <w:lsdException w:name="List Table 5 Dark Accent 4" w:uiPriority="50"/>
-    <w:lsdException w:name="List Table 6 Colorful Accent 4" w:uiPriority="51"/>
-    <w:lsdException w:name="List Table 7 Colorful Accent 4" w:uiPriority="52"/>
-    <w:lsdException w:name="List Table 1 Light Accent 5" w:uiPriority="46"/>
-    <w:lsdException w:name="List Table 2 Accent 5" w:uiPriority="47"/>
-    <w:lsdException w:name="List Table 3 Accent 5" w:uiPriority="48"/>
-    <w:lsdException w:name="List Table 4 Accent 5" w:uiPriority="49"/>
-    <w:lsdException w:name="List Table 5 Dark Accent 5" w:uiPriority="50"/>
-    <w:lsdException w:name="List Table 6 Colorful Accent 5" w:uiPriority="51"/>
-    <w:lsdException w:name="List Table 7 Colorful Accent 5" w:uiPriority="52"/>
-    <w:lsdException w:name="List Table 1 Light Accent 6" w:uiPriority="46"/>
-    <w:lsdException w:name="List Table 2 Accent 6" w:uiPriority="47"/>
-    <w:lsdException w:name="List Table 3 Accent 6" w:uiPriority="48"/>
-    <w:lsdException w:name="List Table 4 Accent 6" w:uiPriority="49"/>
-    <w:lsdException w:name="List Table 5 Dark Accent 6" w:uiPriority="50"/>
-    <w:lsdException w:name="List Table 6 Colorful Accent 6" w:uiPriority="51"/>
-    <w:lsdException w:name="List Table 7 Colorful Accent 6" w:uiPriority="52"/>
-    <w:lsdException w:name="Mention" w:semiHidden="1" w:unhideWhenUsed="1"/>
-    <w:lsdException w:name="Smart Hyperlink" w:semiHidden="1" w:unhideWhenUsed="1"/>
-    <w:lsdException w:name="Hashtag" w:semiHidden="1" w:unhideWhenUsed="1"/>
-    <w:lsdException w:name="Unresolved Mention" w:semiHidden="1" w:unhideWhenUsed="1"/>
-    <w:lsdException w:name="Smart Link" w:semiHidden="1" w:unhideWhenUsed="1"/>
+  <w:latentStyles w:defLockedState="0" w:defUIPriority="99" w:defSemiHidden="1" w:defUnhideWhenUsed="1" w:defQFormat="0" w:count="267">
+    <w:lsdException w:name="Normal" w:semiHidden="0" w:uiPriority="0" w:unhideWhenUsed="0" w:qFormat="1"/>
+    <w:lsdException w:name="heading 1" w:semiHidden="0" w:uiPriority="9" w:unhideWhenUsed="0" w:qFormat="1"/>
+    <w:lsdException w:name="heading 2" w:uiPriority="9" w:qFormat="1"/>
+    <w:lsdException w:name="heading 3" w:uiPriority="9" w:qFormat="1"/>
+    <w:lsdException w:name="heading 4" w:uiPriority="9" w:qFormat="1"/>
+    <w:lsdException w:name="heading 5" w:uiPriority="9" w:qFormat="1"/>
+    <w:lsdException w:name="heading 6" w:uiPriority="9" w:qFormat="1"/>
+    <w:lsdException w:name="heading 7" w:uiPriority="9" w:qFormat="1"/>
+    <w:lsdException w:name="heading 8" w:uiPriority="9" w:qFormat="1"/>
+    <w:lsdException w:name="heading 9" w:uiPriority="9" w:qFormat="1"/>
+    <w:lsdException w:name="toc 1" w:uiPriority="39"/>
+    <w:lsdException w:name="toc 2" w:uiPriority="39"/>
+    <w:lsdException w:name="toc 3" w:uiPriority="39"/>
+    <w:lsdException w:name="toc 4" w:uiPriority="39"/>
+    <w:lsdException w:name="toc 5" w:uiPriority="39"/>
+    <w:lsdException w:name="toc 6" w:uiPriority="39"/>
+    <w:lsdException w:name="toc 7" w:uiPriority="39"/>
+    <w:lsdException w:name="toc 8" w:uiPriority="39"/>
+    <w:lsdException w:name="toc 9" w:uiPriority="39"/>
+    <w:lsdException w:name="caption" w:uiPriority="35" w:qFormat="1"/>
+    <w:lsdException w:name="Title" w:semiHidden="0" w:uiPriority="10" w:unhideWhenUsed="0" w:qFormat="1"/>
+    <w:lsdException w:name="Default Paragraph Font" w:uiPriority="1"/>
+    <w:lsdException w:name="Subtitle" w:semiHidden="0" w:uiPriority="11" w:unhideWhenUsed="0" w:qFormat="1"/>
+    <w:lsdException w:name="Strong" w:semiHidden="0" w:uiPriority="22" w:unhideWhenUsed="0" w:qFormat="1"/>
+    <w:lsdException w:name="Emphasis" w:semiHidden="0" w:uiPriority="20" w:unhideWhenUsed="0" w:qFormat="1"/>
+    <w:lsdException w:name="Table Grid" w:semiHidden="0" w:uiPriority="39" w:unhideWhenUsed="0"/>
+    <w:lsdException w:name="Placeholder Text" w:unhideWhenUsed="0"/>
+    <w:lsdException w:name="No Spacing" w:semiHidden="0" w:uiPriority="1" w:unhideWhenUsed="0" w:qFormat="1"/>
+    <w:lsdException w:name="Light Shading" w:semiHidden="0" w:uiPriority="60" w:unhideWhenUsed="0"/>
+    <w:lsdException w:name="Light List" w:semiHidden="0" w:uiPriority="61" w:unhideWhenUsed="0"/>
+    <w:lsdException w:name="Light Grid" w:semiHidden="0" w:uiPriority="62" w:unhideWhenUsed="0"/>
+    <w:lsdException w:name="Medium Shading 1" w:semiHidden="0" w:uiPriority="63" w:unhideWhenUsed="0"/>
+    <w:lsdException w:name="Medium Shading 2" w:semiHidden="0" w:uiPriority="64" w:unhideWhenUsed="0"/>
+    <w:lsdException w:name="Medium List 1" w:semiHidden="0" w:uiPriority="65" w:unhideWhenUsed="0"/>
+    <w:lsdException w:name="Medium List 2" w:semiHidden="0" w:uiPriority="66" w:unhideWhenUsed="0"/>
+    <w:lsdException w:name="Medium Grid 1" w:semiHidden="0" w:uiPriority="67" w:unhideWhenUsed="0"/>
+    <w:lsdException w:name="Medium Grid 2" w:semiHidden="0" w:uiPriority="68" w:unhideWhenUsed="0"/>
+    <w:lsdException w:name="Medium Grid 3" w:semiHidden="0" w:uiPriority="69" w:unhideWhenUsed="0"/>
+    <w:lsdException w:name="Dark List" w:semiHidden="0" w:uiPriority="70" w:unhideWhenUsed="0"/>
+    <w:lsdException w:name="Colorful Shading" w:semiHidden="0" w:uiPriority="71" w:unhideWhenUsed="0"/>
+    <w:lsdException w:name="Colorful List" w:semiHidden="0" w:uiPriority="72" w:unhideWhenUsed="0"/>
+    <w:lsdException w:name="Colorful Grid" w:semiHidden="0" w:uiPriority="73" w:unhideWhenUsed="0"/>
+    <w:lsdException w:name="Light Shading Accent 1" w:semiHidden="0" w:uiPriority="60" w:unhideWhenUsed="0"/>
+    <w:lsdException w:name="Light List Accent 1" w:semiHidden="0" w:uiPriority="61" w:unhideWhenUsed="0"/>
+    <w:lsdException w:name="Light Grid Accent 1" w:semiHidden="0" w:uiPriority="62" w:unhideWhenUsed="0"/>
+    <w:lsdException w:name="Medium Shading 1 Accent 1" w:semiHidden="0" w:uiPriority="63" w:unhideWhenUsed="0"/>
+    <w:lsdException w:name="Medium Shading 2 Accent 1" w:semiHidden="0" w:uiPriority="64" w:unhideWhenUsed="0"/>
+    <w:lsdException w:name="Medium List 1 Accent 1" w:semiHidden="0" w:uiPriority="65" w:unhideWhenUsed="0"/>
+    <w:lsdException w:name="Revision" w:unhideWhenUsed="0"/>
+    <w:lsdException w:name="List Paragraph" w:semiHidden="0" w:uiPriority="34" w:unhideWhenUsed="0" w:qFormat="1"/>
+    <w:lsdException w:name="Quote" w:semiHidden="0" w:uiPriority="29" w:unhideWhenUsed="0" w:qFormat="1"/>
+    <w:lsdException w:name="Intense Quote" w:semiHidden="0" w:uiPriority="30" w:unhideWhenUsed="0" w:qFormat="1"/>
+    <w:lsdException w:name="Medium List 2 Accent 1" w:semiHidden="0" w:uiPriority="66" w:unhideWhenUsed="0"/>
+    <w:lsdException w:name="Medium Grid 1 Accent 1" w:semiHidden="0" w:uiPriority="67" w:unhideWhenUsed="0"/>
+    <w:lsdException w:name="Medium Grid 2 Accent 1" w:semiHidden="0" w:uiPriority="68" w:unhideWhenUsed="0"/>
+    <w:lsdException w:name="Medium Grid 3 Accent 1" w:semiHidden="0" w:uiPriority="69" w:unhideWhenUsed="0"/>
+    <w:lsdException w:name="Dark List Accent 1" w:semiHidden="0" w:uiPriority="70" w:unhideWhenUsed="0"/>
+    <w:lsdException w:name="Colorful Shading Accent 1" w:semiHidden="0" w:uiPriority="71" w:unhideWhenUsed="0"/>
+    <w:lsdException w:name="Colorful List Accent 1" w:semiHidden="0" w:uiPriority="72" w:unhideWhenUsed="0"/>
+    <w:lsdException w:name="Colorful Grid Accent 1" w:semiHidden="0" w:uiPriority="73" w:unhideWhenUsed="0"/>
+    <w:lsdException w:name="Light Shading Accent 2" w:semiHidden="0" w:uiPriority="60" w:unhideWhenUsed="0"/>
+    <w:lsdException w:name="Light List Accent 2" w:semiHidden="0" w:uiPriority="61" w:unhideWhenUsed="0"/>
+    <w:lsdException w:name="Light Grid Accent 2" w:semiHidden="0" w:uiPriority="62" w:unhideWhenUsed="0"/>
+    <w:lsdException w:name="Medium Shading 1 Accent 2" w:semiHidden="0" w:uiPriority="63" w:unhideWhenUsed="0"/>
+    <w:lsdException w:name="Medium Shading 2 Accent 2" w:semiHidden="0" w:uiPriority="64" w:unhideWhenUsed="0"/>
+    <w:lsdException w:name="Medium List 1 Accent 2" w:semiHidden="0" w:uiPriority="65" w:unhideWhenUsed="0"/>
+    <w:lsdException w:name="Medium List 2 Accent 2" w:semiHidden="0" w:uiPriority="66" w:unhideWhenUsed="0"/>
+    <w:lsdException w:name="Medium Grid 1 Accent 2" w:semiHidden="0" w:uiPriority="67" w:unhideWhenUsed="0"/>
+    <w:lsdException w:name="Medium Grid 2 Accent 2" w:semiHidden="0" w:uiPriority="68" w:unhideWhenUsed="0"/>
+    <w:lsdException w:name="Medium Grid 3 Accent 2" w:semiHidden="0" w:uiPriority="69" w:unhideWhenUsed="0"/>
+    <w:lsdException w:name="Dark List Accent 2" w:semiHidden="0" w:uiPriority="70" w:unhideWhenUsed="0"/>
+    <w:lsdException w:name="Colorful Shading Accent 2" w:semiHidden="0" w:uiPriority="71" w:unhideWhenUsed="0"/>
+    <w:lsdException w:name="Colorful List Accent 2" w:semiHidden="0" w:uiPriority="72" w:unhideWhenUsed="0"/>
+    <w:lsdException w:name="Colorful Grid Accent 2" w:semiHidden="0" w:uiPriority="73" w:unhideWhenUsed="0"/>
+    <w:lsdException w:name="Light Shading Accent 3" w:semiHidden="0" w:uiPriority="60" w:unhideWhenUsed="0"/>
+    <w:lsdException w:name="Light List Accent 3" w:semiHidden="0" w:uiPriority="61" w:unhideWhenUsed="0"/>
+    <w:lsdException w:name="Light Grid Accent 3" w:semiHidden="0" w:uiPriority="62" w:unhideWhenUsed="0"/>
+    <w:lsdException w:name="Medium Shading 1 Accent 3" w:semiHidden="0" w:uiPriority="63" w:unhideWhenUsed="0"/>
+    <w:lsdException w:name="Medium Shading 2 Accent 3" w:semiHidden="0" w:uiPriority="64" w:unhideWhenUsed="0"/>
+    <w:lsdException w:name="Medium List 1 Accent 3" w:semiHidden="0" w:uiPriority="65" w:unhideWhenUsed="0"/>
+    <w:lsdException w:name="Medium List 2 Accent 3" w:semiHidden="0" w:uiPriority="66" w:unhideWhenUsed="0"/>
+    <w:lsdException w:name="Medium Grid 1 Accent 3" w:semiHidden="0" w:uiPriority="67" w:unhideWhenUsed="0"/>
+    <w:lsdException w:name="Medium Grid 2 Accent 3" w:semiHidden="0" w:uiPriority="68" w:unhideWhenUsed="0"/>
+    <w:lsdException w:name="Medium Grid 3 Accent 3" w:semiHidden="0" w:uiPriority="69" w:unhideWhenUsed="0"/>
+    <w:lsdException w:name="Dark List Accent 3" w:semiHidden="0" w:uiPriority="70" w:unhideWhenUsed="0"/>
+    <w:lsdException w:name="Colorful Shading Accent 3" w:semiHidden="0" w:uiPriority="71" w:unhideWhenUsed="0"/>
+    <w:lsdException w:name="Colorful List Accent 3" w:semiHidden="0" w:uiPriority="72" w:unhideWhenUsed="0"/>
+    <w:lsdException w:name="Colorful Grid Accent 3" w:semiHidden="0" w:uiPriority="73" w:unhideWhenUsed="0"/>
+    <w:lsdException w:name="Light Shading Accent 4" w:semiHidden="0" w:uiPriority="60" w:unhideWhenUsed="0"/>
+    <w:lsdException w:name="Light List Accent 4" w:semiHidden="0" w:uiPriority="61" w:unhideWhenUsed="0"/>
+    <w:lsdException w:name="Light Grid Accent 4" w:semiHidden="0" w:uiPriority="62" w:unhideWhenUsed="0"/>
+    <w:lsdException w:name="Medium Shading 1 Accent 4" w:semiHidden="0" w:uiPriority="63" w:unhideWhenUsed="0"/>
+    <w:lsdException w:name="Medium Shading 2 Accent 4" w:semiHidden="0" w:uiPriority="64" w:unhideWhenUsed="0"/>
+    <w:lsdException w:name="Medium List 1 Accent 4" w:semiHidden="0" w:uiPriority="65" w:unhideWhenUsed="0"/>
+    <w:lsdException w:name="Medium List 2 Accent 4" w:semiHidden="0" w:uiPriority="66" w:unhideWhenUsed="0"/>
+    <w:lsdException w:name="Medium Grid 1 Accent 4" w:semiHidden="0" w:uiPriority="67" w:unhideWhenUsed="0"/>
+    <w:lsdException w:name="Medium Grid 2 Accent 4" w:semiHidden="0" w:uiPriority="68" w:unhideWhenUsed="0"/>
+    <w:lsdException w:name="Medium Grid 3 Accent 4" w:semiHidden="0" w:uiPriority="69" w:unhideWhenUsed="0"/>
+    <w:lsdException w:name="Dark List Accent 4" w:semiHidden="0" w:uiPriority="70" w:unhideWhenUsed="0"/>
+    <w:lsdException w:name="Colorful Shading Accent 4" w:semiHidden="0" w:uiPriority="71" w:unhideWhenUsed="0"/>
+    <w:lsdException w:name="Colorful List Accent 4" w:semiHidden="0" w:uiPriority="72" w:unhideWhenUsed="0"/>
+    <w:lsdException w:name="Colorful Grid Accent 4" w:semiHidden="0" w:uiPriority="73" w:unhideWhenUsed="0"/>
+    <w:lsdException w:name="Light Shading Accent 5" w:semiHidden="0" w:uiPriority="60" w:unhideWhenUsed="0"/>
+    <w:lsdException w:name="Light List Accent 5" w:semiHidden="0" w:uiPriority="61" w:unhideWhenUsed="0"/>
+    <w:lsdException w:name="Light Grid Accent 5" w:semiHidden="0" w:uiPriority="62" w:unhideWhenUsed="0"/>
+    <w:lsdException w:name="Medium Shading 1 Accent 5" w:semiHidden="0" w:uiPriority="63" w:unhideWhenUsed="0"/>
+    <w:lsdException w:name="Medium Shading 2 Accent 5" w:semiHidden="0" w:uiPriority="64" w:unhideWhenUsed="0"/>
+    <w:lsdException w:name="Medium List 1 Accent 5" w:semiHidden="0" w:uiPriority="65" w:unhideWhenUsed="0"/>
+    <w:lsdException w:name="Medium List 2 Accent 5" w:semiHidden="0" w:uiPriority="66" w:unhideWhenUsed="0"/>
+    <w:lsdException w:name="Medium Grid 1 Accent 5" w:semiHidden="0" w:uiPriority="67" w:unhideWhenUsed="0"/>
+    <w:lsdException w:name="Medium Grid 2 Accent 5" w:semiHidden="0" w:uiPriority="68" w:unhideWhenUsed="0"/>
+    <w:lsdException w:name="Medium Grid 3 Accent 5" w:semiHidden="0" w:uiPriority="69" w:unhideWhenUsed="0"/>
+    <w:lsdException w:name="Dark List Accent 5" w:semiHidden="0" w:uiPriority="70" w:unhideWhenUsed="0"/>
+    <w:lsdException w:name="Colorful Shading Accent 5" w:semiHidden="0" w:uiPriority="71" w:unhideWhenUsed="0"/>
+    <w:lsdException w:name="Colorful List Accent 5" w:semiHidden="0" w:uiPriority="72" w:unhideWhenUsed="0"/>
+    <w:lsdException w:name="Colorful Grid Accent 5" w:semiHidden="0" w:uiPriority="73" w:unhideWhenUsed="0"/>
+    <w:lsdException w:name="Light Shading Accent 6" w:semiHidden="0" w:uiPriority="60" w:unhideWhenUsed="0"/>
+    <w:lsdException w:name="Light List Accent 6" w:semiHidden="0" w:uiPriority="61" w:unhideWhenUsed="0"/>
+    <w:lsdException w:name="Light Grid Accent 6" w:semiHidden="0" w:uiPriority="62" w:unhideWhenUsed="0"/>
+    <w:lsdException w:name="Medium Shading 1 Accent 6" w:semiHidden="0" w:uiPriority="63" w:unhideWhenUsed="0"/>
+    <w:lsdException w:name="Medium Shading 2 Accent 6" w:semiHidden="0" w:uiPriority="64" w:unhideWhenUsed="0"/>
+    <w:lsdException w:name="Medium List 1 Accent 6" w:semiHidden="0" w:uiPriority="65" w:unhideWhenUsed="0"/>
+    <w:lsdException w:name="Medium List 2 Accent 6" w:semiHidden="0" w:uiPriority="66" w:unhideWhenUsed="0"/>
+    <w:lsdException w:name="Medium Grid 1 Accent 6" w:semiHidden="0" w:uiPriority="67" w:unhideWhenUsed="0"/>
+    <w:lsdException w:name="Medium Grid 2 Accent 6" w:semiHidden="0" w:uiPriority="68" w:unhideWhenUsed="0"/>
+    <w:lsdException w:name="Medium Grid 3 Accent 6" w:semiHidden="0" w:uiPriority="69" w:unhideWhenUsed="0"/>
+    <w:lsdException w:name="Dark List Accent 6" w:semiHidden="0" w:uiPriority="70" w:unhideWhenUsed="0"/>
+    <w:lsdException w:name="Colorful Shading Accent 6" w:semiHidden="0" w:uiPriority="71" w:unhideWhenUsed="0"/>
+    <w:lsdException w:name="Colorful List Accent 6" w:semiHidden="0" w:uiPriority="72" w:unhideWhenUsed="0"/>
+    <w:lsdException w:name="Colorful Grid Accent 6" w:semiHidden="0" w:uiPriority="73" w:unhideWhenUsed="0"/>
+    <w:lsdException w:name="Subtle Emphasis" w:semiHidden="0" w:uiPriority="19" w:unhideWhenUsed="0" w:qFormat="1"/>
+    <w:lsdException w:name="Intense Emphasis" w:semiHidden="0" w:uiPriority="21" w:unhideWhenUsed="0" w:qFormat="1"/>
+    <w:lsdException w:name="Subtle Reference" w:semiHidden="0" w:uiPriority="31" w:unhideWhenUsed="0" w:qFormat="1"/>
+    <w:lsdException w:name="Intense Reference" w:semiHidden="0" w:uiPriority="32" w:unhideWhenUsed="0" w:qFormat="1"/>
+    <w:lsdException w:name="Book Title" w:semiHidden="0" w:uiPriority="33" w:unhideWhenUsed="0" w:qFormat="1"/>
+    <w:lsdException w:name="Bibliography" w:uiPriority="37"/>
+    <w:lsdException w:name="TOC Heading" w:uiPriority="39" w:qFormat="1"/>
   </w:latentStyles>
   <w:style w:type="paragraph" w:default="1" w:styleId="Normal">
     <w:name w:val="Normal"/>
     <w:qFormat/>
+    <w:rsid w:val="003029F3"/>
   </w:style>
   <w:style w:type="paragraph" w:styleId="Heading2">
     <w:name w:val="heading 2"/>
@@ -13540,6 +12280,7 @@
     <w:uiPriority w:val="99"/>
     <w:semiHidden/>
     <w:unhideWhenUsed/>
+    <w:qFormat/>
     <w:tblPr>
       <w:tblInd w:w="0" w:type="dxa"/>
       <w:tblCellMar>
@@ -13755,7 +12496,7 @@
     </a:clrScheme>
     <a:fontScheme name="Office">
       <a:majorFont>
-        <a:latin typeface="Calibri Light" panose="020F0302020204030204"/>
+        <a:latin typeface="Calibri Light"/>
         <a:ea typeface=""/>
         <a:cs typeface=""/>
         <a:font script="Jpan" typeface="游ゴシック Light"/>
@@ -13790,7 +12531,7 @@
         <a:font script="Geor" typeface="Sylfaen"/>
       </a:majorFont>
       <a:minorFont>
-        <a:latin typeface="Calibri" panose="020F0502020204030204"/>
+        <a:latin typeface="Calibri"/>
         <a:ea typeface=""/>
         <a:cs typeface=""/>
         <a:font script="Jpan" typeface="游明朝"/>
@@ -13967,7 +12708,7 @@
   <a:extraClrSchemeLst/>
   <a:extLst>
     <a:ext uri="{05A4C25C-085E-4340-85A3-A5531E510DB2}">
-      <thm15:themeFamily xmlns:thm15="http://schemas.microsoft.com/office/thememl/2012/main" name="Office Theme" id="{62F939B6-93AF-4DB8-9C6B-D6C7DFDC589F}" vid="{4A3C46E8-61CC-4603-A589-7422A47A8E4A}"/>
+      <thm15:themeFamily xmlns:thm15="http://schemas.microsoft.com/office/thememl/2012/main" xmlns="" name="Office Theme" id="{62F939B6-93AF-4DB8-9C6B-D6C7DFDC589F}" vid="{4A3C46E8-61CC-4603-A589-7422A47A8E4A}"/>
     </a:ext>
   </a:extLst>
 </a:theme>

</xml_diff>